<commit_message>
docs: update final polished baocao.docx report
</commit_message>
<xml_diff>
--- a/docs/baocao.docx
+++ b/docs/baocao.docx
@@ -120,7 +120,7 @@
               </wp:anchor>
             </w:drawing>
           </mc:Choice>
-          <mc:Fallback xmlns:cx1="http://schemas.microsoft.com/office/drawing/2015/9/8/chartex" xmlns:cx2="http://schemas.microsoft.com/office/drawing/2015/10/21/chartex" xmlns:cx3="http://schemas.microsoft.com/office/drawing/2016/5/9/chartex" xmlns:cx4="http://schemas.microsoft.com/office/drawing/2016/5/10/chartex" xmlns:cx5="http://schemas.microsoft.com/office/drawing/2016/5/11/chartex" xmlns:cx6="http://schemas.microsoft.com/office/drawing/2016/5/12/chartex" xmlns:cx7="http://schemas.microsoft.com/office/drawing/2016/5/13/chartex" xmlns:cx8="http://schemas.microsoft.com/office/drawing/2016/5/14/chartex" xmlns:aink="http://schemas.microsoft.com/office/drawing/2016/ink" xmlns:am3d="http://schemas.microsoft.com/office/drawing/2017/model3d" xmlns:w16cex="http://schemas.microsoft.com/office/word/2018/wordml/cex" xmlns:w16cid="http://schemas.microsoft.com/office/word/2016/wordml/cid" xmlns:w16="http://schemas.microsoft.com/office/word/2018/wordml" xmlns:w16sdtdh="http://schemas.microsoft.com/office/word/2020/wordml/sdtdatahash" xmlns:oel="http://schemas.microsoft.com/office/2019/extlst" xmlns:w16du="http://schemas.microsoft.com/office/word/2023/wordml/word16du" xmlns:w16sdtfl="http://schemas.microsoft.com/office/word/2024/wordml/sdtformatlock">
+          <mc:Fallback xmlns:w16sdtfl="http://schemas.microsoft.com/office/word/2024/wordml/sdtformatlock" xmlns:w16du="http://schemas.microsoft.com/office/word/2023/wordml/word16du" xmlns:oel="http://schemas.microsoft.com/office/2019/extlst" xmlns:w16sdtdh="http://schemas.microsoft.com/office/word/2020/wordml/sdtdatahash" xmlns:w16="http://schemas.microsoft.com/office/word/2018/wordml" xmlns:w16cid="http://schemas.microsoft.com/office/word/2016/wordml/cid" xmlns:w16cex="http://schemas.microsoft.com/office/word/2018/wordml/cex" xmlns:am3d="http://schemas.microsoft.com/office/drawing/2017/model3d" xmlns:aink="http://schemas.microsoft.com/office/drawing/2016/ink" xmlns:cx8="http://schemas.microsoft.com/office/drawing/2016/5/14/chartex" xmlns:cx7="http://schemas.microsoft.com/office/drawing/2016/5/13/chartex" xmlns:cx6="http://schemas.microsoft.com/office/drawing/2016/5/12/chartex" xmlns:cx5="http://schemas.microsoft.com/office/drawing/2016/5/11/chartex" xmlns:cx4="http://schemas.microsoft.com/office/drawing/2016/5/10/chartex" xmlns:cx3="http://schemas.microsoft.com/office/drawing/2016/5/9/chartex" xmlns:cx2="http://schemas.microsoft.com/office/drawing/2015/10/21/chartex" xmlns:cx1="http://schemas.microsoft.com/office/drawing/2015/9/8/chartex">
             <w:pict>
               <v:shapetype w14:anchorId="6780BD3A" id="_x0000_t32" coordsize="21600,21600" o:spt="32" o:oned="t" path="m,l21600,21600e" filled="f">
                 <v:path arrowok="t" fillok="f" o:connecttype="none"/>
@@ -1242,6 +1242,8 @@
       <w:r>
         <w:tab/>
       </w:r>
+      <w:bookmarkStart w:id="0" w:name="_GoBack"/>
+      <w:bookmarkEnd w:id="0"/>
     </w:p>
     <w:p>
       <w:pPr>
@@ -1627,17 +1629,7 @@
           <w:szCs w:val="26"/>
           <w:lang w:val="vi-VN"/>
         </w:rPr>
-        <w:t xml:space="preserve"> </w:t>
-      </w:r>
-      <w:bookmarkStart w:id="0" w:name="_GoBack"/>
-      <w:bookmarkEnd w:id="0"/>
-      <w:r>
-        <w:rPr>
-          <w:i/>
-          <w:szCs w:val="26"/>
-          <w:lang w:val="vi-VN"/>
-        </w:rPr>
-        <w:t xml:space="preserve"> </w:t>
+        <w:t xml:space="preserve">  </w:t>
       </w:r>
       <w:r>
         <w:rPr>
@@ -2156,7 +2148,7 @@
         </w:rPr>
         <w:fldChar w:fldCharType="separate"/>
       </w:r>
-      <w:hyperlink w:anchor="_Toc241184312" w:history="1">
+      <w:hyperlink w:anchor="_Toc241234517" w:history="1">
         <w:r>
           <w:rPr>
             <w:rStyle w:val="Hyperlink"/>
@@ -2184,7 +2176,7 @@
             <w:noProof/>
             <w:webHidden/>
           </w:rPr>
-          <w:instrText xml:space="preserve"> PAGEREF _Toc241184312 \h </w:instrText>
+          <w:instrText xml:space="preserve"> PAGEREF _Toc241234517 \h </w:instrText>
         </w:r>
         <w:r>
           <w:rPr>
@@ -2229,7 +2221,7 @@
           <w:lang w:val="vi-VN" w:eastAsia="vi-VN"/>
         </w:rPr>
       </w:pPr>
-      <w:hyperlink w:anchor="_Toc241184313" w:history="1">
+      <w:hyperlink w:anchor="_Toc241234518" w:history="1">
         <w:r>
           <w:rPr>
             <w:rStyle w:val="Hyperlink"/>
@@ -2274,7 +2266,7 @@
             <w:noProof/>
             <w:webHidden/>
           </w:rPr>
-          <w:instrText xml:space="preserve"> PAGEREF _Toc241184313 \h </w:instrText>
+          <w:instrText xml:space="preserve"> PAGEREF _Toc241234518 \h </w:instrText>
         </w:r>
         <w:r>
           <w:rPr>
@@ -2319,7 +2311,7 @@
           <w:lang w:val="vi-VN" w:eastAsia="vi-VN"/>
         </w:rPr>
       </w:pPr>
-      <w:hyperlink w:anchor="_Toc241184314" w:history="1">
+      <w:hyperlink w:anchor="_Toc241234519" w:history="1">
         <w:r>
           <w:rPr>
             <w:rStyle w:val="Hyperlink"/>
@@ -2364,7 +2356,7 @@
             <w:noProof/>
             <w:webHidden/>
           </w:rPr>
-          <w:instrText xml:space="preserve"> PAGEREF _Toc241184314 \h </w:instrText>
+          <w:instrText xml:space="preserve"> PAGEREF _Toc241234519 \h </w:instrText>
         </w:r>
         <w:r>
           <w:rPr>
@@ -2409,7 +2401,7 @@
           <w:lang w:val="vi-VN" w:eastAsia="vi-VN"/>
         </w:rPr>
       </w:pPr>
-      <w:hyperlink w:anchor="_Toc241184315" w:history="1">
+      <w:hyperlink w:anchor="_Toc241234520" w:history="1">
         <w:r>
           <w:rPr>
             <w:rStyle w:val="Hyperlink"/>
@@ -2454,7 +2446,7 @@
             <w:noProof/>
             <w:webHidden/>
           </w:rPr>
-          <w:instrText xml:space="preserve"> PAGEREF _Toc241184315 \h </w:instrText>
+          <w:instrText xml:space="preserve"> PAGEREF _Toc241234520 \h </w:instrText>
         </w:r>
         <w:r>
           <w:rPr>
@@ -2499,7 +2491,7 @@
           <w:lang w:val="vi-VN" w:eastAsia="vi-VN"/>
         </w:rPr>
       </w:pPr>
-      <w:hyperlink w:anchor="_Toc241184316" w:history="1">
+      <w:hyperlink w:anchor="_Toc241234521" w:history="1">
         <w:r>
           <w:rPr>
             <w:rStyle w:val="Hyperlink"/>
@@ -2544,7 +2536,7 @@
             <w:noProof/>
             <w:webHidden/>
           </w:rPr>
-          <w:instrText xml:space="preserve"> PAGEREF _Toc241184316 \h </w:instrText>
+          <w:instrText xml:space="preserve"> PAGEREF _Toc241234521 \h </w:instrText>
         </w:r>
         <w:r>
           <w:rPr>
@@ -2577,9 +2569,9 @@
     </w:p>
     <w:p>
       <w:pPr>
-        <w:pStyle w:val="TOC3"/>
-        <w:tabs>
-          <w:tab w:val="left" w:pos="1320"/>
+        <w:pStyle w:val="TOC2"/>
+        <w:tabs>
+          <w:tab w:val="left" w:pos="880"/>
           <w:tab w:val="right" w:leader="dot" w:pos="9056"/>
         </w:tabs>
         <w:rPr>
@@ -2589,14 +2581,14 @@
           <w:lang w:val="vi-VN" w:eastAsia="vi-VN"/>
         </w:rPr>
       </w:pPr>
-      <w:hyperlink w:anchor="_Toc241184317" w:history="1">
+      <w:hyperlink w:anchor="_Toc241234522" w:history="1">
         <w:r>
           <w:rPr>
             <w:rStyle w:val="Hyperlink"/>
             <w:rFonts w:eastAsiaTheme="majorEastAsia"/>
             <w:noProof/>
           </w:rPr>
-          <w:t>1.3.2</w:t>
+          <w:t>1.4</w:t>
         </w:r>
         <w:r>
           <w:rPr>
@@ -2613,7 +2605,7 @@
             <w:rFonts w:eastAsiaTheme="majorEastAsia"/>
             <w:noProof/>
           </w:rPr>
-          <w:t>Các chỉ số đánh giá mô hình hồi quy</w:t>
+          <w:t>Giới thiệu các thuật toán học máy sử dụng</w:t>
         </w:r>
         <w:r>
           <w:rPr>
@@ -2634,7 +2626,7 @@
             <w:noProof/>
             <w:webHidden/>
           </w:rPr>
-          <w:instrText xml:space="preserve"> PAGEREF _Toc241184317 \h </w:instrText>
+          <w:instrText xml:space="preserve"> PAGEREF _Toc241234522 \h </w:instrText>
         </w:r>
         <w:r>
           <w:rPr>
@@ -2654,7 +2646,7 @@
             <w:noProof/>
             <w:webHidden/>
           </w:rPr>
-          <w:t>6</w:t>
+          <w:t>7</w:t>
         </w:r>
         <w:r>
           <w:rPr>
@@ -2667,9 +2659,8 @@
     </w:p>
     <w:p>
       <w:pPr>
-        <w:pStyle w:val="TOC2"/>
-        <w:tabs>
-          <w:tab w:val="left" w:pos="880"/>
+        <w:pStyle w:val="TOC1"/>
+        <w:tabs>
           <w:tab w:val="right" w:leader="dot" w:pos="9056"/>
         </w:tabs>
         <w:rPr>
@@ -2679,41 +2670,24 @@
           <w:lang w:val="vi-VN" w:eastAsia="vi-VN"/>
         </w:rPr>
       </w:pPr>
-      <w:hyperlink w:anchor="_Toc241184318" w:history="1">
+      <w:hyperlink w:anchor="_Toc241234523" w:history="1">
         <w:r>
           <w:rPr>
             <w:rStyle w:val="Hyperlink"/>
             <w:rFonts w:eastAsiaTheme="majorEastAsia"/>
             <w:noProof/>
           </w:rPr>
-          <w:t>1.4</w:t>
-        </w:r>
-        <w:r>
-          <w:rPr>
-            <w:rFonts w:asciiTheme="minorHAnsi" w:eastAsiaTheme="minorEastAsia" w:hAnsiTheme="minorHAnsi" w:cstheme="minorBidi"/>
-            <w:noProof/>
-            <w:sz w:val="22"/>
-            <w:lang w:val="vi-VN" w:eastAsia="vi-VN"/>
+          <w:t>CHƯƠNG 2: PHÂN TÍCH DỮ LIỆU (EDA) VÀ TIỀN XỬ LÝ</w:t>
+        </w:r>
+        <w:r>
+          <w:rPr>
+            <w:noProof/>
+            <w:webHidden/>
           </w:rPr>
           <w:tab/>
         </w:r>
         <w:r>
           <w:rPr>
-            <w:rStyle w:val="Hyperlink"/>
-            <w:rFonts w:eastAsiaTheme="majorEastAsia"/>
-            <w:noProof/>
-          </w:rPr>
-          <w:t>Giới thiệu các thuật toán học máy sử dụng</w:t>
-        </w:r>
-        <w:r>
-          <w:rPr>
-            <w:noProof/>
-            <w:webHidden/>
-          </w:rPr>
-          <w:tab/>
-        </w:r>
-        <w:r>
-          <w:rPr>
             <w:noProof/>
             <w:webHidden/>
           </w:rPr>
@@ -2724,7 +2698,7 @@
             <w:noProof/>
             <w:webHidden/>
           </w:rPr>
-          <w:instrText xml:space="preserve"> PAGEREF _Toc241184318 \h </w:instrText>
+          <w:instrText xml:space="preserve"> PAGEREF _Toc241234523 \h </w:instrText>
         </w:r>
         <w:r>
           <w:rPr>
@@ -2744,7 +2718,7 @@
             <w:noProof/>
             <w:webHidden/>
           </w:rPr>
-          <w:t>6</w:t>
+          <w:t>8</w:t>
         </w:r>
         <w:r>
           <w:rPr>
@@ -2757,8 +2731,9 @@
     </w:p>
     <w:p>
       <w:pPr>
-        <w:pStyle w:val="TOC1"/>
-        <w:tabs>
+        <w:pStyle w:val="TOC2"/>
+        <w:tabs>
+          <w:tab w:val="left" w:pos="880"/>
           <w:tab w:val="right" w:leader="dot" w:pos="9056"/>
         </w:tabs>
         <w:rPr>
@@ -2768,24 +2743,41 @@
           <w:lang w:val="vi-VN" w:eastAsia="vi-VN"/>
         </w:rPr>
       </w:pPr>
-      <w:hyperlink w:anchor="_Toc241184319" w:history="1">
+      <w:hyperlink w:anchor="_Toc241234524" w:history="1">
         <w:r>
           <w:rPr>
             <w:rStyle w:val="Hyperlink"/>
             <w:rFonts w:eastAsiaTheme="majorEastAsia"/>
             <w:noProof/>
           </w:rPr>
-          <w:t>CHƯƠNG 2: PHÂN TÍCH DỮ LIỆU (EDA) VÀ TIỀN XỬ LÝ</w:t>
-        </w:r>
-        <w:r>
-          <w:rPr>
-            <w:noProof/>
-            <w:webHidden/>
+          <w:t>2.1</w:t>
+        </w:r>
+        <w:r>
+          <w:rPr>
+            <w:rFonts w:asciiTheme="minorHAnsi" w:eastAsiaTheme="minorEastAsia" w:hAnsiTheme="minorHAnsi" w:cstheme="minorBidi"/>
+            <w:noProof/>
+            <w:sz w:val="22"/>
+            <w:lang w:val="vi-VN" w:eastAsia="vi-VN"/>
           </w:rPr>
           <w:tab/>
         </w:r>
         <w:r>
           <w:rPr>
+            <w:rStyle w:val="Hyperlink"/>
+            <w:rFonts w:eastAsiaTheme="majorEastAsia"/>
+            <w:noProof/>
+          </w:rPr>
+          <w:t>Khảo sát cấu trúc và thống kê mô tả dữ liệu</w:t>
+        </w:r>
+        <w:r>
+          <w:rPr>
+            <w:noProof/>
+            <w:webHidden/>
+          </w:rPr>
+          <w:tab/>
+        </w:r>
+        <w:r>
+          <w:rPr>
             <w:noProof/>
             <w:webHidden/>
           </w:rPr>
@@ -2796,7 +2788,7 @@
             <w:noProof/>
             <w:webHidden/>
           </w:rPr>
-          <w:instrText xml:space="preserve"> PAGEREF _Toc241184319 \h </w:instrText>
+          <w:instrText xml:space="preserve"> PAGEREF _Toc241234524 \h </w:instrText>
         </w:r>
         <w:r>
           <w:rPr>
@@ -2816,7 +2808,7 @@
             <w:noProof/>
             <w:webHidden/>
           </w:rPr>
-          <w:t>7</w:t>
+          <w:t>8</w:t>
         </w:r>
         <w:r>
           <w:rPr>
@@ -2841,14 +2833,14 @@
           <w:lang w:val="vi-VN" w:eastAsia="vi-VN"/>
         </w:rPr>
       </w:pPr>
-      <w:hyperlink w:anchor="_Toc241184320" w:history="1">
+      <w:hyperlink w:anchor="_Toc241234525" w:history="1">
         <w:r>
           <w:rPr>
             <w:rStyle w:val="Hyperlink"/>
             <w:rFonts w:eastAsiaTheme="majorEastAsia"/>
             <w:noProof/>
           </w:rPr>
-          <w:t>2.1</w:t>
+          <w:t>2.2</w:t>
         </w:r>
         <w:r>
           <w:rPr>
@@ -2865,7 +2857,7 @@
             <w:rFonts w:eastAsiaTheme="majorEastAsia"/>
             <w:noProof/>
           </w:rPr>
-          <w:t>Khảo sát cấu trúc và thống kê mô tả dữ liệu</w:t>
+          <w:t>Trực quan hóa dữ liệu và phân tích khám phá (EDA Charts)</w:t>
         </w:r>
         <w:r>
           <w:rPr>
@@ -2886,7 +2878,7 @@
             <w:noProof/>
             <w:webHidden/>
           </w:rPr>
-          <w:instrText xml:space="preserve"> PAGEREF _Toc241184320 \h </w:instrText>
+          <w:instrText xml:space="preserve"> PAGEREF _Toc241234525 \h </w:instrText>
         </w:r>
         <w:r>
           <w:rPr>
@@ -2906,7 +2898,7 @@
             <w:noProof/>
             <w:webHidden/>
           </w:rPr>
-          <w:t>7</w:t>
+          <w:t>9</w:t>
         </w:r>
         <w:r>
           <w:rPr>
@@ -2919,9 +2911,9 @@
     </w:p>
     <w:p>
       <w:pPr>
-        <w:pStyle w:val="TOC2"/>
-        <w:tabs>
-          <w:tab w:val="left" w:pos="880"/>
+        <w:pStyle w:val="TOC3"/>
+        <w:tabs>
+          <w:tab w:val="left" w:pos="1320"/>
           <w:tab w:val="right" w:leader="dot" w:pos="9056"/>
         </w:tabs>
         <w:rPr>
@@ -2931,14 +2923,14 @@
           <w:lang w:val="vi-VN" w:eastAsia="vi-VN"/>
         </w:rPr>
       </w:pPr>
-      <w:hyperlink w:anchor="_Toc241184321" w:history="1">
+      <w:hyperlink w:anchor="_Toc241234526" w:history="1">
         <w:r>
           <w:rPr>
             <w:rStyle w:val="Hyperlink"/>
             <w:rFonts w:eastAsiaTheme="majorEastAsia"/>
             <w:noProof/>
           </w:rPr>
-          <w:t>2.2</w:t>
+          <w:t>2.2.1</w:t>
         </w:r>
         <w:r>
           <w:rPr>
@@ -2955,7 +2947,7 @@
             <w:rFonts w:eastAsiaTheme="majorEastAsia"/>
             <w:noProof/>
           </w:rPr>
-          <w:t>Trực quan hóa dữ liệu và phân tích khám phá (EDA Charts)</w:t>
+          <w:t>Biểu đồ 1: Phân phối biến mục tiêu Sales (Histogram &amp; KDE)</w:t>
         </w:r>
         <w:r>
           <w:rPr>
@@ -2976,7 +2968,7 @@
             <w:noProof/>
             <w:webHidden/>
           </w:rPr>
-          <w:instrText xml:space="preserve"> PAGEREF _Toc241184321 \h </w:instrText>
+          <w:instrText xml:space="preserve"> PAGEREF _Toc241234526 \h </w:instrText>
         </w:r>
         <w:r>
           <w:rPr>
@@ -2996,7 +2988,7 @@
             <w:noProof/>
             <w:webHidden/>
           </w:rPr>
-          <w:t>8</w:t>
+          <w:t>9</w:t>
         </w:r>
         <w:r>
           <w:rPr>
@@ -3021,14 +3013,14 @@
           <w:lang w:val="vi-VN" w:eastAsia="vi-VN"/>
         </w:rPr>
       </w:pPr>
-      <w:hyperlink w:anchor="_Toc241184322" w:history="1">
+      <w:hyperlink w:anchor="_Toc241234527" w:history="1">
         <w:r>
           <w:rPr>
             <w:rStyle w:val="Hyperlink"/>
             <w:rFonts w:eastAsiaTheme="majorEastAsia"/>
             <w:noProof/>
           </w:rPr>
-          <w:t>2.2.1</w:t>
+          <w:t>2.2.2</w:t>
         </w:r>
         <w:r>
           <w:rPr>
@@ -3045,7 +3037,7 @@
             <w:rFonts w:eastAsiaTheme="majorEastAsia"/>
             <w:noProof/>
           </w:rPr>
-          <w:t>Biểu đồ 1: Phân phối biến mục tiêu Sales (Histogram &amp; KDE)</w:t>
+          <w:t>Biểu đồ 2: Ma trận tương quan (Correlation Heatmap)</w:t>
         </w:r>
         <w:r>
           <w:rPr>
@@ -3066,7 +3058,7 @@
             <w:noProof/>
             <w:webHidden/>
           </w:rPr>
-          <w:instrText xml:space="preserve"> PAGEREF _Toc241184322 \h </w:instrText>
+          <w:instrText xml:space="preserve"> PAGEREF _Toc241234527 \h </w:instrText>
         </w:r>
         <w:r>
           <w:rPr>
@@ -3086,7 +3078,7 @@
             <w:noProof/>
             <w:webHidden/>
           </w:rPr>
-          <w:t>8</w:t>
+          <w:t>10</w:t>
         </w:r>
         <w:r>
           <w:rPr>
@@ -3111,14 +3103,14 @@
           <w:lang w:val="vi-VN" w:eastAsia="vi-VN"/>
         </w:rPr>
       </w:pPr>
-      <w:hyperlink w:anchor="_Toc241184323" w:history="1">
+      <w:hyperlink w:anchor="_Toc241234528" w:history="1">
         <w:r>
           <w:rPr>
             <w:rStyle w:val="Hyperlink"/>
             <w:rFonts w:eastAsiaTheme="majorEastAsia"/>
             <w:noProof/>
           </w:rPr>
-          <w:t>2.2.2</w:t>
+          <w:t>2.2.3</w:t>
         </w:r>
         <w:r>
           <w:rPr>
@@ -3135,7 +3127,7 @@
             <w:rFonts w:eastAsiaTheme="majorEastAsia"/>
             <w:noProof/>
           </w:rPr>
-          <w:t>Biểu đồ 2: Ma trận tương quan (Correlation Heatmap)</w:t>
+          <w:t>Biểu đồ 3: Phát hiện ngoại lai (Boxplot Outliers)</w:t>
         </w:r>
         <w:r>
           <w:rPr>
@@ -3156,7 +3148,7 @@
             <w:noProof/>
             <w:webHidden/>
           </w:rPr>
-          <w:instrText xml:space="preserve"> PAGEREF _Toc241184323 \h </w:instrText>
+          <w:instrText xml:space="preserve"> PAGEREF _Toc241234528 \h </w:instrText>
         </w:r>
         <w:r>
           <w:rPr>
@@ -3176,7 +3168,7 @@
             <w:noProof/>
             <w:webHidden/>
           </w:rPr>
-          <w:t>9</w:t>
+          <w:t>10</w:t>
         </w:r>
         <w:r>
           <w:rPr>
@@ -3201,14 +3193,14 @@
           <w:lang w:val="vi-VN" w:eastAsia="vi-VN"/>
         </w:rPr>
       </w:pPr>
-      <w:hyperlink w:anchor="_Toc241184324" w:history="1">
+      <w:hyperlink w:anchor="_Toc241234529" w:history="1">
         <w:r>
           <w:rPr>
             <w:rStyle w:val="Hyperlink"/>
             <w:rFonts w:eastAsiaTheme="majorEastAsia"/>
             <w:noProof/>
           </w:rPr>
-          <w:t>2.2.3</w:t>
+          <w:t>2.2.4</w:t>
         </w:r>
         <w:r>
           <w:rPr>
@@ -3225,7 +3217,7 @@
             <w:rFonts w:eastAsiaTheme="majorEastAsia"/>
             <w:noProof/>
           </w:rPr>
-          <w:t>Biểu đồ 3: Phát hiện ngoại lai (Boxplot Outliers)</w:t>
+          <w:t>Biểu đồ 4 &amp; 5: Quan hệ chi tiết TV/Radio so với Sales (Scatter Plot &amp; Regplot)</w:t>
         </w:r>
         <w:r>
           <w:rPr>
@@ -3246,7 +3238,7 @@
             <w:noProof/>
             <w:webHidden/>
           </w:rPr>
-          <w:instrText xml:space="preserve"> PAGEREF _Toc241184324 \h </w:instrText>
+          <w:instrText xml:space="preserve"> PAGEREF _Toc241234529 \h </w:instrText>
         </w:r>
         <w:r>
           <w:rPr>
@@ -3266,7 +3258,7 @@
             <w:noProof/>
             <w:webHidden/>
           </w:rPr>
-          <w:t>10</w:t>
+          <w:t>11</w:t>
         </w:r>
         <w:r>
           <w:rPr>
@@ -3279,9 +3271,9 @@
     </w:p>
     <w:p>
       <w:pPr>
-        <w:pStyle w:val="TOC3"/>
-        <w:tabs>
-          <w:tab w:val="left" w:pos="1320"/>
+        <w:pStyle w:val="TOC2"/>
+        <w:tabs>
+          <w:tab w:val="left" w:pos="880"/>
           <w:tab w:val="right" w:leader="dot" w:pos="9056"/>
         </w:tabs>
         <w:rPr>
@@ -3291,14 +3283,14 @@
           <w:lang w:val="vi-VN" w:eastAsia="vi-VN"/>
         </w:rPr>
       </w:pPr>
-      <w:hyperlink w:anchor="_Toc241184325" w:history="1">
+      <w:hyperlink w:anchor="_Toc241234530" w:history="1">
         <w:r>
           <w:rPr>
             <w:rStyle w:val="Hyperlink"/>
             <w:rFonts w:eastAsiaTheme="majorEastAsia"/>
             <w:noProof/>
           </w:rPr>
-          <w:t>2.2.4</w:t>
+          <w:t>2.3</w:t>
         </w:r>
         <w:r>
           <w:rPr>
@@ -3315,7 +3307,7 @@
             <w:rFonts w:eastAsiaTheme="majorEastAsia"/>
             <w:noProof/>
           </w:rPr>
-          <w:t>Biểu đồ 4 &amp; 5: Quan hệ chi tiết TV/Radio so với Sales (Scatter Plot &amp; Regplot)</w:t>
+          <w:t>Quy trình tiền xử lý và chống rò rỉ dữ liệu (Data Leakage)</w:t>
         </w:r>
         <w:r>
           <w:rPr>
@@ -3336,7 +3328,7 @@
             <w:noProof/>
             <w:webHidden/>
           </w:rPr>
-          <w:instrText xml:space="preserve"> PAGEREF _Toc241184325 \h </w:instrText>
+          <w:instrText xml:space="preserve"> PAGEREF _Toc241234530 \h </w:instrText>
         </w:r>
         <w:r>
           <w:rPr>
@@ -3356,7 +3348,7 @@
             <w:noProof/>
             <w:webHidden/>
           </w:rPr>
-          <w:t>11</w:t>
+          <w:t>13</w:t>
         </w:r>
         <w:r>
           <w:rPr>
@@ -3369,9 +3361,8 @@
     </w:p>
     <w:p>
       <w:pPr>
-        <w:pStyle w:val="TOC2"/>
-        <w:tabs>
-          <w:tab w:val="left" w:pos="880"/>
+        <w:pStyle w:val="TOC1"/>
+        <w:tabs>
           <w:tab w:val="right" w:leader="dot" w:pos="9056"/>
         </w:tabs>
         <w:rPr>
@@ -3381,41 +3372,24 @@
           <w:lang w:val="vi-VN" w:eastAsia="vi-VN"/>
         </w:rPr>
       </w:pPr>
-      <w:hyperlink w:anchor="_Toc241184326" w:history="1">
+      <w:hyperlink w:anchor="_Toc241234531" w:history="1">
         <w:r>
           <w:rPr>
             <w:rStyle w:val="Hyperlink"/>
             <w:rFonts w:eastAsiaTheme="majorEastAsia"/>
             <w:noProof/>
           </w:rPr>
-          <w:t>2.3</w:t>
-        </w:r>
-        <w:r>
-          <w:rPr>
-            <w:rFonts w:asciiTheme="minorHAnsi" w:eastAsiaTheme="minorEastAsia" w:hAnsiTheme="minorHAnsi" w:cstheme="minorBidi"/>
-            <w:noProof/>
-            <w:sz w:val="22"/>
-            <w:lang w:val="vi-VN" w:eastAsia="vi-VN"/>
+          <w:t>CHƯƠNG 3: XÂY DỰNG HỆ THỐNG MLOPS VÀ TRIỂN KHAI SẢN PHẨM</w:t>
+        </w:r>
+        <w:r>
+          <w:rPr>
+            <w:noProof/>
+            <w:webHidden/>
           </w:rPr>
           <w:tab/>
         </w:r>
         <w:r>
           <w:rPr>
-            <w:rStyle w:val="Hyperlink"/>
-            <w:rFonts w:eastAsiaTheme="majorEastAsia"/>
-            <w:noProof/>
-          </w:rPr>
-          <w:t>Quy trình tiền xử lý và chống rò rỉ dữ liệu (Data Leakage)</w:t>
-        </w:r>
-        <w:r>
-          <w:rPr>
-            <w:noProof/>
-            <w:webHidden/>
-          </w:rPr>
-          <w:tab/>
-        </w:r>
-        <w:r>
-          <w:rPr>
             <w:noProof/>
             <w:webHidden/>
           </w:rPr>
@@ -3426,7 +3400,7 @@
             <w:noProof/>
             <w:webHidden/>
           </w:rPr>
-          <w:instrText xml:space="preserve"> PAGEREF _Toc241184326 \h </w:instrText>
+          <w:instrText xml:space="preserve"> PAGEREF _Toc241234531 \h </w:instrText>
         </w:r>
         <w:r>
           <w:rPr>
@@ -3446,7 +3420,7 @@
             <w:noProof/>
             <w:webHidden/>
           </w:rPr>
-          <w:t>13</w:t>
+          <w:t>14</w:t>
         </w:r>
         <w:r>
           <w:rPr>
@@ -3459,8 +3433,9 @@
     </w:p>
     <w:p>
       <w:pPr>
-        <w:pStyle w:val="TOC1"/>
-        <w:tabs>
+        <w:pStyle w:val="TOC2"/>
+        <w:tabs>
+          <w:tab w:val="left" w:pos="880"/>
           <w:tab w:val="right" w:leader="dot" w:pos="9056"/>
         </w:tabs>
         <w:rPr>
@@ -3470,24 +3445,41 @@
           <w:lang w:val="vi-VN" w:eastAsia="vi-VN"/>
         </w:rPr>
       </w:pPr>
-      <w:hyperlink w:anchor="_Toc241184327" w:history="1">
+      <w:hyperlink w:anchor="_Toc241234532" w:history="1">
         <w:r>
           <w:rPr>
             <w:rStyle w:val="Hyperlink"/>
             <w:rFonts w:eastAsiaTheme="majorEastAsia"/>
             <w:noProof/>
           </w:rPr>
-          <w:t>CHƯƠNG 3: XÂY DỰNG HỆ THỐNG MLOPS VÀ TRIỂN KHAI SẢN PHẨM</w:t>
-        </w:r>
-        <w:r>
-          <w:rPr>
-            <w:noProof/>
-            <w:webHidden/>
+          <w:t>3.1</w:t>
+        </w:r>
+        <w:r>
+          <w:rPr>
+            <w:rFonts w:asciiTheme="minorHAnsi" w:eastAsiaTheme="minorEastAsia" w:hAnsiTheme="minorHAnsi" w:cstheme="minorBidi"/>
+            <w:noProof/>
+            <w:sz w:val="22"/>
+            <w:lang w:val="vi-VN" w:eastAsia="vi-VN"/>
           </w:rPr>
           <w:tab/>
         </w:r>
         <w:r>
           <w:rPr>
+            <w:rStyle w:val="Hyperlink"/>
+            <w:rFonts w:eastAsiaTheme="majorEastAsia"/>
+            <w:noProof/>
+          </w:rPr>
+          <w:t>Thử nghiệm, so sánh và lựa chọn mô hình tối ưu</w:t>
+        </w:r>
+        <w:r>
+          <w:rPr>
+            <w:noProof/>
+            <w:webHidden/>
+          </w:rPr>
+          <w:tab/>
+        </w:r>
+        <w:r>
+          <w:rPr>
             <w:noProof/>
             <w:webHidden/>
           </w:rPr>
@@ -3498,7 +3490,7 @@
             <w:noProof/>
             <w:webHidden/>
           </w:rPr>
-          <w:instrText xml:space="preserve"> PAGEREF _Toc241184327 \h </w:instrText>
+          <w:instrText xml:space="preserve"> PAGEREF _Toc241234532 \h </w:instrText>
         </w:r>
         <w:r>
           <w:rPr>
@@ -3543,14 +3535,14 @@
           <w:lang w:val="vi-VN" w:eastAsia="vi-VN"/>
         </w:rPr>
       </w:pPr>
-      <w:hyperlink w:anchor="_Toc241184328" w:history="1">
+      <w:hyperlink w:anchor="_Toc241234533" w:history="1">
         <w:r>
           <w:rPr>
             <w:rStyle w:val="Hyperlink"/>
             <w:rFonts w:eastAsiaTheme="majorEastAsia"/>
             <w:noProof/>
           </w:rPr>
-          <w:t>3.1</w:t>
+          <w:t>3.2</w:t>
         </w:r>
         <w:r>
           <w:rPr>
@@ -3567,7 +3559,7 @@
             <w:rFonts w:eastAsiaTheme="majorEastAsia"/>
             <w:noProof/>
           </w:rPr>
-          <w:t>Thử nghiệm, so sánh và lựa chọn mô hình tối ưu</w:t>
+          <w:t>Đóng gói mô hình và cấu trúc Artifacts</w:t>
         </w:r>
         <w:r>
           <w:rPr>
@@ -3588,7 +3580,7 @@
             <w:noProof/>
             <w:webHidden/>
           </w:rPr>
-          <w:instrText xml:space="preserve"> PAGEREF _Toc241184328 \h </w:instrText>
+          <w:instrText xml:space="preserve"> PAGEREF _Toc241234533 \h </w:instrText>
         </w:r>
         <w:r>
           <w:rPr>
@@ -3621,9 +3613,8 @@
     </w:p>
     <w:p>
       <w:pPr>
-        <w:pStyle w:val="TOC2"/>
-        <w:tabs>
-          <w:tab w:val="left" w:pos="880"/>
+        <w:pStyle w:val="TOC1"/>
+        <w:tabs>
           <w:tab w:val="right" w:leader="dot" w:pos="9056"/>
         </w:tabs>
         <w:rPr>
@@ -3633,41 +3624,24 @@
           <w:lang w:val="vi-VN" w:eastAsia="vi-VN"/>
         </w:rPr>
       </w:pPr>
-      <w:hyperlink w:anchor="_Toc241184329" w:history="1">
+      <w:hyperlink w:anchor="_Toc241234534" w:history="1">
         <w:r>
           <w:rPr>
             <w:rStyle w:val="Hyperlink"/>
             <w:rFonts w:eastAsiaTheme="majorEastAsia"/>
             <w:noProof/>
           </w:rPr>
-          <w:t>3.2</w:t>
-        </w:r>
-        <w:r>
-          <w:rPr>
-            <w:rFonts w:asciiTheme="minorHAnsi" w:eastAsiaTheme="minorEastAsia" w:hAnsiTheme="minorHAnsi" w:cstheme="minorBidi"/>
-            <w:noProof/>
-            <w:sz w:val="22"/>
-            <w:lang w:val="vi-VN" w:eastAsia="vi-VN"/>
+          <w:t>CHƯƠNG 4: XÂY DỰNG HỆ THỐNG MLOPS VÀ TRIỂN KHAI SẢN PHẨM</w:t>
+        </w:r>
+        <w:r>
+          <w:rPr>
+            <w:noProof/>
+            <w:webHidden/>
           </w:rPr>
           <w:tab/>
         </w:r>
         <w:r>
           <w:rPr>
-            <w:rStyle w:val="Hyperlink"/>
-            <w:rFonts w:eastAsiaTheme="majorEastAsia"/>
-            <w:noProof/>
-          </w:rPr>
-          <w:t>Đóng gói mô hình và cấu trúc Artifacts</w:t>
-        </w:r>
-        <w:r>
-          <w:rPr>
-            <w:noProof/>
-            <w:webHidden/>
-          </w:rPr>
-          <w:tab/>
-        </w:r>
-        <w:r>
-          <w:rPr>
             <w:noProof/>
             <w:webHidden/>
           </w:rPr>
@@ -3678,7 +3652,7 @@
             <w:noProof/>
             <w:webHidden/>
           </w:rPr>
-          <w:instrText xml:space="preserve"> PAGEREF _Toc241184329 \h </w:instrText>
+          <w:instrText xml:space="preserve"> PAGEREF _Toc241234534 \h </w:instrText>
         </w:r>
         <w:r>
           <w:rPr>
@@ -3698,7 +3672,7 @@
             <w:noProof/>
             <w:webHidden/>
           </w:rPr>
-          <w:t>16</w:t>
+          <w:t>17</w:t>
         </w:r>
         <w:r>
           <w:rPr>
@@ -3723,14 +3697,14 @@
           <w:lang w:val="vi-VN" w:eastAsia="vi-VN"/>
         </w:rPr>
       </w:pPr>
-      <w:hyperlink w:anchor="_Toc241184330" w:history="1">
+      <w:hyperlink w:anchor="_Toc241234535" w:history="1">
         <w:r>
           <w:rPr>
             <w:rStyle w:val="Hyperlink"/>
             <w:rFonts w:eastAsiaTheme="majorEastAsia"/>
             <w:noProof/>
           </w:rPr>
-          <w:t>3.3</w:t>
+          <w:t>4.1</w:t>
         </w:r>
         <w:r>
           <w:rPr>
@@ -3768,7 +3742,7 @@
             <w:noProof/>
             <w:webHidden/>
           </w:rPr>
-          <w:instrText xml:space="preserve"> PAGEREF _Toc241184330 \h </w:instrText>
+          <w:instrText xml:space="preserve"> PAGEREF _Toc241234535 \h </w:instrText>
         </w:r>
         <w:r>
           <w:rPr>
@@ -3788,7 +3762,7 @@
             <w:noProof/>
             <w:webHidden/>
           </w:rPr>
-          <w:t>16</w:t>
+          <w:t>17</w:t>
         </w:r>
         <w:r>
           <w:rPr>
@@ -3813,14 +3787,14 @@
           <w:lang w:val="vi-VN" w:eastAsia="vi-VN"/>
         </w:rPr>
       </w:pPr>
-      <w:hyperlink w:anchor="_Toc241184331" w:history="1">
+      <w:hyperlink w:anchor="_Toc241234536" w:history="1">
         <w:r>
           <w:rPr>
             <w:rStyle w:val="Hyperlink"/>
             <w:rFonts w:eastAsiaTheme="majorEastAsia"/>
             <w:noProof/>
           </w:rPr>
-          <w:t>3.4</w:t>
+          <w:t>4.2</w:t>
         </w:r>
         <w:r>
           <w:rPr>
@@ -3858,7 +3832,7 @@
             <w:noProof/>
             <w:webHidden/>
           </w:rPr>
-          <w:instrText xml:space="preserve"> PAGEREF _Toc241184331 \h </w:instrText>
+          <w:instrText xml:space="preserve"> PAGEREF _Toc241234536 \h </w:instrText>
         </w:r>
         <w:r>
           <w:rPr>
@@ -3903,14 +3877,14 @@
           <w:lang w:val="vi-VN" w:eastAsia="vi-VN"/>
         </w:rPr>
       </w:pPr>
-      <w:hyperlink w:anchor="_Toc241184332" w:history="1">
+      <w:hyperlink w:anchor="_Toc241234537" w:history="1">
         <w:r>
           <w:rPr>
             <w:rStyle w:val="Hyperlink"/>
             <w:rFonts w:eastAsiaTheme="majorEastAsia"/>
             <w:noProof/>
           </w:rPr>
-          <w:t>3.5</w:t>
+          <w:t>4.3</w:t>
         </w:r>
         <w:r>
           <w:rPr>
@@ -3948,7 +3922,7 @@
             <w:noProof/>
             <w:webHidden/>
           </w:rPr>
-          <w:instrText xml:space="preserve"> PAGEREF _Toc241184332 \h </w:instrText>
+          <w:instrText xml:space="preserve"> PAGEREF _Toc241234537 \h </w:instrText>
         </w:r>
         <w:r>
           <w:rPr>
@@ -3981,9 +3955,8 @@
     </w:p>
     <w:p>
       <w:pPr>
-        <w:pStyle w:val="TOC2"/>
-        <w:tabs>
-          <w:tab w:val="left" w:pos="880"/>
+        <w:pStyle w:val="TOC1"/>
+        <w:tabs>
           <w:tab w:val="right" w:leader="dot" w:pos="9056"/>
         </w:tabs>
         <w:rPr>
@@ -3993,41 +3966,24 @@
           <w:lang w:val="vi-VN" w:eastAsia="vi-VN"/>
         </w:rPr>
       </w:pPr>
-      <w:hyperlink w:anchor="_Toc241184333" w:history="1">
+      <w:hyperlink w:anchor="_Toc241234538" w:history="1">
         <w:r>
           <w:rPr>
             <w:rStyle w:val="Hyperlink"/>
             <w:rFonts w:eastAsiaTheme="majorEastAsia"/>
             <w:noProof/>
           </w:rPr>
-          <w:t>3.6</w:t>
-        </w:r>
-        <w:r>
-          <w:rPr>
-            <w:rFonts w:asciiTheme="minorHAnsi" w:eastAsiaTheme="minorEastAsia" w:hAnsiTheme="minorHAnsi" w:cstheme="minorBidi"/>
-            <w:noProof/>
-            <w:sz w:val="22"/>
-            <w:lang w:val="vi-VN" w:eastAsia="vi-VN"/>
+          <w:t>PHỤ LỤC</w:t>
+        </w:r>
+        <w:r>
+          <w:rPr>
+            <w:noProof/>
+            <w:webHidden/>
           </w:rPr>
           <w:tab/>
         </w:r>
         <w:r>
           <w:rPr>
-            <w:rStyle w:val="Hyperlink"/>
-            <w:rFonts w:eastAsiaTheme="majorEastAsia"/>
-            <w:noProof/>
-          </w:rPr>
-          <w:t>Bảng phân công công việc và Kết luận</w:t>
-        </w:r>
-        <w:r>
-          <w:rPr>
-            <w:noProof/>
-            <w:webHidden/>
-          </w:rPr>
-          <w:tab/>
-        </w:r>
-        <w:r>
-          <w:rPr>
             <w:noProof/>
             <w:webHidden/>
           </w:rPr>
@@ -4038,7 +3994,7 @@
             <w:noProof/>
             <w:webHidden/>
           </w:rPr>
-          <w:instrText xml:space="preserve"> PAGEREF _Toc241184333 \h </w:instrText>
+          <w:instrText xml:space="preserve"> PAGEREF _Toc241234538 \h </w:instrText>
         </w:r>
         <w:r>
           <w:rPr>
@@ -4058,7 +4014,7 @@
             <w:noProof/>
             <w:webHidden/>
           </w:rPr>
-          <w:t>18</w:t>
+          <w:t>19</w:t>
         </w:r>
         <w:r>
           <w:rPr>
@@ -4082,7 +4038,7 @@
           <w:lang w:val="vi-VN" w:eastAsia="vi-VN"/>
         </w:rPr>
       </w:pPr>
-      <w:hyperlink w:anchor="_Toc241184334" w:history="1">
+      <w:hyperlink w:anchor="_Toc241234539" w:history="1">
         <w:r>
           <w:rPr>
             <w:rStyle w:val="Hyperlink"/>
@@ -4110,7 +4066,7 @@
             <w:noProof/>
             <w:webHidden/>
           </w:rPr>
-          <w:instrText xml:space="preserve"> PAGEREF _Toc241184334 \h </w:instrText>
+          <w:instrText xml:space="preserve"> PAGEREF _Toc241234539 \h </w:instrText>
         </w:r>
         <w:r>
           <w:rPr>
@@ -4130,7 +4086,7 @@
             <w:noProof/>
             <w:webHidden/>
           </w:rPr>
-          <w:t>18</w:t>
+          <w:t>20</w:t>
         </w:r>
         <w:r>
           <w:rPr>
@@ -4154,7 +4110,7 @@
           <w:lang w:val="vi-VN" w:eastAsia="vi-VN"/>
         </w:rPr>
       </w:pPr>
-      <w:hyperlink w:anchor="_Toc241184335" w:history="1">
+      <w:hyperlink w:anchor="_Toc241234540" w:history="1">
         <w:r>
           <w:rPr>
             <w:rStyle w:val="Hyperlink"/>
@@ -4182,7 +4138,7 @@
             <w:noProof/>
             <w:webHidden/>
           </w:rPr>
-          <w:instrText xml:space="preserve"> PAGEREF _Toc241184335 \h </w:instrText>
+          <w:instrText xml:space="preserve"> PAGEREF _Toc241234540 \h </w:instrText>
         </w:r>
         <w:r>
           <w:rPr>
@@ -4202,7 +4158,7 @@
             <w:noProof/>
             <w:webHidden/>
           </w:rPr>
-          <w:t>20</w:t>
+          <w:t>21</w:t>
         </w:r>
         <w:r>
           <w:rPr>
@@ -5169,7 +5125,7 @@
         </w:rPr>
         <w:fldChar w:fldCharType="separate"/>
       </w:r>
-      <w:hyperlink w:anchor="_Toc241186004" w:history="1">
+      <w:hyperlink w:anchor="_Toc241234543" w:history="1">
         <w:r>
           <w:rPr>
             <w:rStyle w:val="Hyperlink"/>
@@ -5197,7 +5153,7 @@
             <w:noProof/>
             <w:webHidden/>
           </w:rPr>
-          <w:instrText xml:space="preserve"> PAGEREF _Toc241186004 \h </w:instrText>
+          <w:instrText xml:space="preserve"> PAGEREF _Toc241234543 \h </w:instrText>
         </w:r>
         <w:r>
           <w:rPr>
@@ -5241,7 +5197,7 @@
           <w:lang w:val="vi-VN" w:eastAsia="vi-VN"/>
         </w:rPr>
       </w:pPr>
-      <w:hyperlink w:anchor="_Toc241186005" w:history="1">
+      <w:hyperlink w:anchor="_Toc241234544" w:history="1">
         <w:r>
           <w:rPr>
             <w:rStyle w:val="Hyperlink"/>
@@ -5269,7 +5225,7 @@
             <w:noProof/>
             <w:webHidden/>
           </w:rPr>
-          <w:instrText xml:space="preserve"> PAGEREF _Toc241186005 \h </w:instrText>
+          <w:instrText xml:space="preserve"> PAGEREF _Toc241234544 \h </w:instrText>
         </w:r>
         <w:r>
           <w:rPr>
@@ -5313,7 +5269,7 @@
           <w:lang w:val="vi-VN" w:eastAsia="vi-VN"/>
         </w:rPr>
       </w:pPr>
-      <w:hyperlink w:anchor="_Toc241186006" w:history="1">
+      <w:hyperlink w:anchor="_Toc241234545" w:history="1">
         <w:r>
           <w:rPr>
             <w:rStyle w:val="Hyperlink"/>
@@ -5341,7 +5297,7 @@
             <w:noProof/>
             <w:webHidden/>
           </w:rPr>
-          <w:instrText xml:space="preserve"> PAGEREF _Toc241186006 \h </w:instrText>
+          <w:instrText xml:space="preserve"> PAGEREF _Toc241234545 \h </w:instrText>
         </w:r>
         <w:r>
           <w:rPr>
@@ -5385,7 +5341,7 @@
           <w:lang w:val="vi-VN" w:eastAsia="vi-VN"/>
         </w:rPr>
       </w:pPr>
-      <w:hyperlink w:anchor="_Toc241186007" w:history="1">
+      <w:hyperlink w:anchor="_Toc241234546" w:history="1">
         <w:r>
           <w:rPr>
             <w:rStyle w:val="Hyperlink"/>
@@ -5413,7 +5369,7 @@
             <w:noProof/>
             <w:webHidden/>
           </w:rPr>
-          <w:instrText xml:space="preserve"> PAGEREF _Toc241186007 \h </w:instrText>
+          <w:instrText xml:space="preserve"> PAGEREF _Toc241234546 \h </w:instrText>
         </w:r>
         <w:r>
           <w:rPr>
@@ -5457,7 +5413,7 @@
           <w:lang w:val="vi-VN" w:eastAsia="vi-VN"/>
         </w:rPr>
       </w:pPr>
-      <w:hyperlink w:anchor="_Toc241186008" w:history="1">
+      <w:hyperlink w:anchor="_Toc241234547" w:history="1">
         <w:r>
           <w:rPr>
             <w:rStyle w:val="Hyperlink"/>
@@ -5485,7 +5441,7 @@
             <w:noProof/>
             <w:webHidden/>
           </w:rPr>
-          <w:instrText xml:space="preserve"> PAGEREF _Toc241186008 \h </w:instrText>
+          <w:instrText xml:space="preserve"> PAGEREF _Toc241234547 \h </w:instrText>
         </w:r>
         <w:r>
           <w:rPr>
@@ -5604,7 +5560,7 @@
         </w:rPr>
         <w:fldChar w:fldCharType="separate"/>
       </w:r>
-      <w:hyperlink w:anchor="_Toc241186034" w:history="1">
+      <w:hyperlink w:anchor="_Toc241234541" w:history="1">
         <w:r>
           <w:rPr>
             <w:rStyle w:val="Hyperlink"/>
@@ -5642,7 +5598,7 @@
             <w:noProof/>
             <w:webHidden/>
           </w:rPr>
-          <w:instrText xml:space="preserve"> PAGEREF _Toc241186034 \h </w:instrText>
+          <w:instrText xml:space="preserve"> PAGEREF _Toc241234541 \h </w:instrText>
         </w:r>
         <w:r>
           <w:rPr>
@@ -5686,14 +5642,34 @@
           <w:lang w:val="vi-VN" w:eastAsia="vi-VN"/>
         </w:rPr>
       </w:pPr>
-      <w:hyperlink w:anchor="_Toc241186035" w:history="1">
+      <w:hyperlink w:anchor="_Toc241234542" w:history="1">
         <w:r>
           <w:rPr>
             <w:rStyle w:val="Hyperlink"/>
             <w:rFonts w:eastAsiaTheme="majorEastAsia"/>
             <w:noProof/>
-          </w:rPr>
-          <w:t>Bảng 2: Bảng phân công nhiệm vụ chi tiết</w:t>
+            <w:lang w:val="vi-VN"/>
+          </w:rPr>
+          <w:t xml:space="preserve">Bảng 2: </w:t>
+        </w:r>
+        <w:r>
+          <w:rPr>
+            <w:rStyle w:val="Hyperlink"/>
+            <w:rFonts w:eastAsiaTheme="majorEastAsia"/>
+            <w:noProof/>
+            <w:shd w:val="clear" w:color="auto" w:fill="FFFFFF"/>
+          </w:rPr>
+          <w:t xml:space="preserve">Bảng </w:t>
+        </w:r>
+        <w:r>
+          <w:rPr>
+            <w:rStyle w:val="Hyperlink"/>
+            <w:rFonts w:eastAsiaTheme="majorEastAsia"/>
+            <w:noProof/>
+            <w:shd w:val="clear" w:color="auto" w:fill="FFFFFF"/>
+            <w:lang w:val="vi-VN"/>
+          </w:rPr>
+          <w:t>phân công việc nhóm</w:t>
         </w:r>
         <w:r>
           <w:rPr>
@@ -5714,7 +5690,7 @@
             <w:noProof/>
             <w:webHidden/>
           </w:rPr>
-          <w:instrText xml:space="preserve"> PAGEREF _Toc241186035 \h </w:instrText>
+          <w:instrText xml:space="preserve"> PAGEREF _Toc241234542 \h </w:instrText>
         </w:r>
         <w:r>
           <w:rPr>
@@ -5734,7 +5710,7 @@
             <w:noProof/>
             <w:webHidden/>
           </w:rPr>
-          <w:t>18</w:t>
+          <w:t>19</w:t>
         </w:r>
         <w:r>
           <w:rPr>
@@ -5775,7 +5751,7 @@
           <w:rStyle w:val="ng-star-inserted"/>
         </w:rPr>
       </w:pPr>
-      <w:bookmarkStart w:id="1" w:name="_Toc241184312"/>
+      <w:bookmarkStart w:id="1" w:name="_Toc241234517"/>
       <w:r>
         <w:rPr>
           <w:rStyle w:val="ng-star-inserted"/>
@@ -5808,7 +5784,7 @@
         </w:rPr>
         <w:t xml:space="preserve"> </w:t>
       </w:r>
-      <w:bookmarkStart w:id="2" w:name="_Toc241184313"/>
+      <w:bookmarkStart w:id="2" w:name="_Toc241234518"/>
       <w:r>
         <w:rPr>
           <w:rStyle w:val="ng-star-inserted"/>
@@ -5890,7 +5866,7 @@
         <w:ind w:left="0" w:firstLine="0"/>
         <w:jc w:val="both"/>
       </w:pPr>
-      <w:bookmarkStart w:id="3" w:name="_Toc241184314"/>
+      <w:bookmarkStart w:id="3" w:name="_Toc241234519"/>
       <w:r>
         <w:rPr>
           <w:rStyle w:val="ng-star-inserted"/>
@@ -6162,7 +6138,7 @@
         <w:ind w:left="284" w:hanging="284"/>
         <w:jc w:val="both"/>
       </w:pPr>
-      <w:bookmarkStart w:id="4" w:name="_Toc241184315"/>
+      <w:bookmarkStart w:id="4" w:name="_Toc241234520"/>
       <w:r>
         <w:rPr>
           <w:rStyle w:val="ng-star-inserted"/>
@@ -6179,7 +6155,7 @@
         <w:spacing w:line="360" w:lineRule="auto"/>
         <w:jc w:val="both"/>
       </w:pPr>
-      <w:bookmarkStart w:id="5" w:name="_Toc241184316"/>
+      <w:bookmarkStart w:id="5" w:name="_Toc241234521"/>
       <w:r>
         <w:rPr>
           <w:rStyle w:val="ng-star-inserted"/>
@@ -6228,7 +6204,6 @@
         </w:rPr>
         <w:t xml:space="preserve">. </w:t>
       </w:r>
-      <w:bookmarkStart w:id="6" w:name="_Toc241184317"/>
       <w:r>
         <w:rPr>
           <w:color w:val="1B1B1E"/>
@@ -6362,7 +6337,6 @@
         </w:rPr>
         <w:t>Các chỉ số đánh giá mô hình hồi quy</w:t>
       </w:r>
-      <w:bookmarkEnd w:id="6"/>
       <w:r>
         <w:rPr>
           <w:sz w:val="26"/>
@@ -6606,7 +6580,7 @@
         <w:ind w:left="0" w:firstLine="0"/>
         <w:jc w:val="both"/>
       </w:pPr>
-      <w:bookmarkStart w:id="7" w:name="_Toc241184318"/>
+      <w:bookmarkStart w:id="6" w:name="_Toc241234522"/>
       <w:r>
         <w:rPr>
           <w:rStyle w:val="ng-star-inserted"/>
@@ -6615,7 +6589,7 @@
         </w:rPr>
         <w:t>Giới thiệu các thuật toán học máy sử dụng</w:t>
       </w:r>
-      <w:bookmarkEnd w:id="7"/>
+      <w:bookmarkEnd w:id="6"/>
     </w:p>
     <w:p>
       <w:pPr>
@@ -6823,7 +6797,7 @@
         <w:spacing w:line="360" w:lineRule="auto"/>
         <w:ind w:left="284"/>
       </w:pPr>
-      <w:bookmarkStart w:id="8" w:name="_Toc241184319"/>
+      <w:bookmarkStart w:id="7" w:name="_Toc241234523"/>
       <w:r>
         <w:rPr>
           <w:rStyle w:val="ng-star-inserted"/>
@@ -6831,7 +6805,7 @@
         <w:lastRenderedPageBreak/>
         <w:t>PHÂN TÍCH DỮ LIỆU (EDA) VÀ TIỀN XỬ LÝ</w:t>
       </w:r>
-      <w:bookmarkEnd w:id="8"/>
+      <w:bookmarkEnd w:id="7"/>
     </w:p>
     <w:p>
       <w:pPr>
@@ -6840,7 +6814,7 @@
         <w:ind w:left="284" w:hanging="426"/>
         <w:jc w:val="both"/>
       </w:pPr>
-      <w:bookmarkStart w:id="9" w:name="_Toc241184320"/>
+      <w:bookmarkStart w:id="8" w:name="_Toc241234524"/>
       <w:r>
         <w:rPr>
           <w:rStyle w:val="ng-star-inserted"/>
@@ -6849,7 +6823,7 @@
         </w:rPr>
         <w:t>Khảo sát cấu trúc và thống kê mô tả dữ liệu</w:t>
       </w:r>
-      <w:bookmarkEnd w:id="9"/>
+      <w:bookmarkEnd w:id="8"/>
     </w:p>
     <w:p>
       <w:pPr>
@@ -7169,7 +7143,7 @@
         <w:ind w:left="567"/>
         <w:jc w:val="both"/>
       </w:pPr>
-      <w:bookmarkStart w:id="10" w:name="_Toc241184321"/>
+      <w:bookmarkStart w:id="9" w:name="_Toc241234525"/>
       <w:r>
         <w:rPr>
           <w:rStyle w:val="ng-star-inserted"/>
@@ -7179,7 +7153,7 @@
         <w:lastRenderedPageBreak/>
         <w:t>Trực quan hóa dữ liệu và phân tích khám phá (EDA Charts)</w:t>
       </w:r>
-      <w:bookmarkEnd w:id="10"/>
+      <w:bookmarkEnd w:id="9"/>
     </w:p>
     <w:p>
       <w:pPr>
@@ -7248,7 +7222,7 @@
         <w:spacing w:line="360" w:lineRule="auto"/>
         <w:jc w:val="both"/>
       </w:pPr>
-      <w:bookmarkStart w:id="11" w:name="_Toc241184322"/>
+      <w:bookmarkStart w:id="10" w:name="_Toc241234526"/>
       <w:r>
         <w:rPr>
           <w:rStyle w:val="ng-star-inserted"/>
@@ -7258,7 +7232,7 @@
         </w:rPr>
         <w:t>Biểu đồ 1: Phân phối biến mục tiêu Sales (Histogram &amp; KDE)</w:t>
       </w:r>
-      <w:bookmarkEnd w:id="11"/>
+      <w:bookmarkEnd w:id="10"/>
     </w:p>
     <w:p>
       <w:pPr>
@@ -7492,14 +7466,14 @@
           <w:rStyle w:val="ng-star-inserted"/>
         </w:rPr>
       </w:pPr>
-      <w:bookmarkStart w:id="12" w:name="_Toc241186004"/>
+      <w:bookmarkStart w:id="11" w:name="_Toc241234543"/>
       <w:r>
         <w:rPr>
           <w:rStyle w:val="ng-star-inserted"/>
         </w:rPr>
         <w:t>Hình 1: Phân phối của biến mục tiêu Doanh số</w:t>
       </w:r>
-      <w:bookmarkEnd w:id="12"/>
+      <w:bookmarkEnd w:id="11"/>
       <w:r>
         <w:rPr>
           <w:rStyle w:val="ng-star-inserted"/>
@@ -7519,7 +7493,7 @@
         <w:spacing w:line="360" w:lineRule="auto"/>
         <w:jc w:val="both"/>
       </w:pPr>
-      <w:bookmarkStart w:id="13" w:name="_Toc241184323"/>
+      <w:bookmarkStart w:id="12" w:name="_Toc241234527"/>
       <w:r>
         <w:rPr>
           <w:rStyle w:val="ng-star-inserted"/>
@@ -7530,7 +7504,7 @@
         <w:lastRenderedPageBreak/>
         <w:t>Biểu đồ 2: Ma trận tương quan (Correlation Heatmap)</w:t>
       </w:r>
-      <w:bookmarkEnd w:id="13"/>
+      <w:bookmarkEnd w:id="12"/>
     </w:p>
     <w:p>
       <w:pPr>
@@ -7862,7 +7836,7 @@
           <w:rStyle w:val="ng-star-inserted"/>
         </w:rPr>
       </w:pPr>
-      <w:bookmarkStart w:id="14" w:name="_Toc241186005"/>
+      <w:bookmarkStart w:id="13" w:name="_Toc241234544"/>
       <w:r>
         <w:rPr>
           <w:rStyle w:val="ng-star-inserted"/>
@@ -7875,7 +7849,7 @@
         </w:rPr>
         <w:t>số</w:t>
       </w:r>
-      <w:bookmarkEnd w:id="14"/>
+      <w:bookmarkEnd w:id="13"/>
     </w:p>
     <w:p>
       <w:pPr>
@@ -7896,7 +7870,7 @@
         <w:spacing w:line="360" w:lineRule="auto"/>
         <w:jc w:val="both"/>
       </w:pPr>
-      <w:bookmarkStart w:id="15" w:name="_Toc241184324"/>
+      <w:bookmarkStart w:id="14" w:name="_Toc241234528"/>
       <w:r>
         <w:rPr>
           <w:rStyle w:val="ng-star-inserted"/>
@@ -7906,7 +7880,7 @@
         </w:rPr>
         <w:t>Biểu đồ 3: Phát hiện ngoại lai (Boxplot Outliers)</w:t>
       </w:r>
-      <w:bookmarkEnd w:id="15"/>
+      <w:bookmarkEnd w:id="14"/>
     </w:p>
     <w:p>
       <w:pPr>
@@ -8158,14 +8132,14 @@
           <w:rStyle w:val="ng-star-inserted"/>
         </w:rPr>
       </w:pPr>
-      <w:bookmarkStart w:id="16" w:name="_Toc241186006"/>
+      <w:bookmarkStart w:id="15" w:name="_Toc241234545"/>
       <w:r>
         <w:rPr>
           <w:rStyle w:val="ng-star-inserted"/>
         </w:rPr>
         <w:t>Hình 3:Phát hiện ngoại lai trong chi phí quảng cáo</w:t>
       </w:r>
-      <w:bookmarkEnd w:id="16"/>
+      <w:bookmarkEnd w:id="15"/>
       <w:r>
         <w:rPr>
           <w:rStyle w:val="ng-star-inserted"/>
@@ -8192,7 +8166,7 @@
         <w:spacing w:line="360" w:lineRule="auto"/>
         <w:jc w:val="both"/>
       </w:pPr>
-      <w:bookmarkStart w:id="17" w:name="_Toc241184325"/>
+      <w:bookmarkStart w:id="16" w:name="_Toc241234529"/>
       <w:r>
         <w:rPr>
           <w:rStyle w:val="ng-star-inserted"/>
@@ -8202,7 +8176,7 @@
         </w:rPr>
         <w:t>Biểu đồ 4 &amp; 5: Quan hệ chi tiết TV/Radio so với Sales (Scatter Plot &amp; Regplot)</w:t>
       </w:r>
-      <w:bookmarkEnd w:id="17"/>
+      <w:bookmarkEnd w:id="16"/>
     </w:p>
     <w:p>
       <w:pPr>
@@ -8413,14 +8387,14 @@
           <w:rStyle w:val="ng-star-inserted"/>
         </w:rPr>
       </w:pPr>
-      <w:bookmarkStart w:id="18" w:name="_Toc241186007"/>
+      <w:bookmarkStart w:id="17" w:name="_Toc241234546"/>
       <w:r>
         <w:rPr>
           <w:rStyle w:val="ng-star-inserted"/>
         </w:rPr>
         <w:t>Hình 4: Mối quan hệ giữa ngân sách Quảng cáo TV và Doanh số</w:t>
       </w:r>
-      <w:bookmarkEnd w:id="18"/>
+      <w:bookmarkEnd w:id="17"/>
     </w:p>
     <w:p>
       <w:pPr>
@@ -8529,14 +8503,14 @@
           <w:rStyle w:val="ng-star-inserted"/>
         </w:rPr>
       </w:pPr>
-      <w:bookmarkStart w:id="19" w:name="_Toc241186008"/>
+      <w:bookmarkStart w:id="18" w:name="_Toc241234547"/>
       <w:r>
         <w:rPr>
           <w:rStyle w:val="ng-star-inserted"/>
         </w:rPr>
         <w:t>Hình 5: Mối liên hệ giữa Ngân sách Quảng cáo đài Radio và Doanh số</w:t>
       </w:r>
-      <w:bookmarkEnd w:id="19"/>
+      <w:bookmarkEnd w:id="18"/>
     </w:p>
     <w:p/>
     <w:p>
@@ -8546,7 +8520,7 @@
         <w:ind w:left="142"/>
         <w:jc w:val="both"/>
       </w:pPr>
-      <w:bookmarkStart w:id="20" w:name="_Toc241184326"/>
+      <w:bookmarkStart w:id="19" w:name="_Toc241234530"/>
       <w:r>
         <w:rPr>
           <w:rStyle w:val="ng-star-inserted"/>
@@ -8556,7 +8530,7 @@
         <w:lastRenderedPageBreak/>
         <w:t>Quy trình tiền xử lý và chống rò rỉ dữ liệu (Data Leakage)</w:t>
       </w:r>
-      <w:bookmarkEnd w:id="20"/>
+      <w:bookmarkEnd w:id="19"/>
     </w:p>
     <w:p>
       <w:pPr>
@@ -8989,7 +8963,7 @@
         <w:spacing w:line="360" w:lineRule="auto"/>
         <w:ind w:left="0"/>
       </w:pPr>
-      <w:bookmarkStart w:id="21" w:name="_Toc241184327"/>
+      <w:bookmarkStart w:id="20" w:name="_Toc241234531"/>
       <w:r>
         <w:rPr>
           <w:rStyle w:val="ng-star-inserted"/>
@@ -8997,7 +8971,7 @@
         <w:lastRenderedPageBreak/>
         <w:t>XÂY DỰNG HỆ THỐNG MLOPS VÀ TRIỂN KHAI SẢN PHẨM</w:t>
       </w:r>
-      <w:bookmarkEnd w:id="21"/>
+      <w:bookmarkEnd w:id="20"/>
     </w:p>
     <w:p>
       <w:pPr>
@@ -9005,7 +8979,7 @@
         <w:spacing w:line="360" w:lineRule="auto"/>
         <w:ind w:left="284"/>
       </w:pPr>
-      <w:bookmarkStart w:id="22" w:name="_Toc241184328"/>
+      <w:bookmarkStart w:id="21" w:name="_Toc241234532"/>
       <w:r>
         <w:rPr>
           <w:rStyle w:val="ng-star-inserted"/>
@@ -9014,7 +8988,7 @@
         </w:rPr>
         <w:t>Thử nghiệm, so sánh và lựa chọn mô hình tối ưu</w:t>
       </w:r>
-      <w:bookmarkEnd w:id="22"/>
+      <w:bookmarkEnd w:id="21"/>
     </w:p>
     <w:p>
       <w:pPr>
@@ -9209,6 +9183,84 @@
     </w:p>
     <w:p>
       <w:pPr>
+        <w:shd w:val="clear" w:color="auto" w:fill="FFFFFF" w:themeFill="background1"/>
+        <w:spacing w:before="100" w:beforeAutospacing="1" w:line="315" w:lineRule="atLeast"/>
+        <w:ind w:left="426"/>
+        <w:jc w:val="both"/>
+        <w:rPr>
+          <w:color w:val="1B1B1E"/>
+          <w:szCs w:val="26"/>
+          <w:lang w:val="vi-VN" w:eastAsia="vi-VN"/>
+        </w:rPr>
+      </w:pPr>
+    </w:p>
+    <w:p>
+      <w:pPr>
+        <w:shd w:val="clear" w:color="auto" w:fill="FFFFFF" w:themeFill="background1"/>
+        <w:spacing w:before="100" w:beforeAutospacing="1" w:line="315" w:lineRule="atLeast"/>
+        <w:ind w:left="426"/>
+        <w:jc w:val="both"/>
+        <w:rPr>
+          <w:color w:val="1B1B1E"/>
+          <w:szCs w:val="26"/>
+          <w:lang w:val="vi-VN" w:eastAsia="vi-VN"/>
+        </w:rPr>
+      </w:pPr>
+    </w:p>
+    <w:p>
+      <w:pPr>
+        <w:shd w:val="clear" w:color="auto" w:fill="FFFFFF" w:themeFill="background1"/>
+        <w:spacing w:before="100" w:beforeAutospacing="1" w:line="315" w:lineRule="atLeast"/>
+        <w:ind w:left="426"/>
+        <w:jc w:val="both"/>
+        <w:rPr>
+          <w:color w:val="1B1B1E"/>
+          <w:szCs w:val="26"/>
+          <w:lang w:val="vi-VN" w:eastAsia="vi-VN"/>
+        </w:rPr>
+      </w:pPr>
+    </w:p>
+    <w:p>
+      <w:pPr>
+        <w:shd w:val="clear" w:color="auto" w:fill="FFFFFF" w:themeFill="background1"/>
+        <w:spacing w:before="100" w:beforeAutospacing="1" w:line="315" w:lineRule="atLeast"/>
+        <w:ind w:left="426"/>
+        <w:jc w:val="both"/>
+        <w:rPr>
+          <w:color w:val="1B1B1E"/>
+          <w:szCs w:val="26"/>
+          <w:lang w:val="vi-VN" w:eastAsia="vi-VN"/>
+        </w:rPr>
+      </w:pPr>
+    </w:p>
+    <w:p>
+      <w:pPr>
+        <w:shd w:val="clear" w:color="auto" w:fill="FFFFFF" w:themeFill="background1"/>
+        <w:spacing w:before="100" w:beforeAutospacing="1" w:line="315" w:lineRule="atLeast"/>
+        <w:ind w:left="426"/>
+        <w:jc w:val="both"/>
+        <w:rPr>
+          <w:color w:val="1B1B1E"/>
+          <w:szCs w:val="26"/>
+          <w:lang w:val="vi-VN" w:eastAsia="vi-VN"/>
+        </w:rPr>
+      </w:pPr>
+    </w:p>
+    <w:p>
+      <w:pPr>
+        <w:shd w:val="clear" w:color="auto" w:fill="FFFFFF" w:themeFill="background1"/>
+        <w:spacing w:before="100" w:beforeAutospacing="1" w:line="315" w:lineRule="atLeast"/>
+        <w:ind w:left="426"/>
+        <w:jc w:val="both"/>
+        <w:rPr>
+          <w:color w:val="1B1B1E"/>
+          <w:szCs w:val="26"/>
+          <w:lang w:val="vi-VN" w:eastAsia="vi-VN"/>
+        </w:rPr>
+      </w:pPr>
+    </w:p>
+    <w:p>
+      <w:pPr>
         <w:pStyle w:val="ng-star-inserted1"/>
         <w:shd w:val="clear" w:color="auto" w:fill="FFFFFF"/>
         <w:spacing w:after="270" w:afterAutospacing="0" w:line="360" w:lineRule="auto"/>
@@ -9225,6 +9277,7 @@
           <w:szCs w:val="26"/>
           <w:shd w:val="clear" w:color="auto" w:fill="FFFFFF"/>
         </w:rPr>
+        <w:lastRenderedPageBreak/>
         <w:t>Bảng tổng hợp kết quả hiệ</w:t>
       </w:r>
       <w:r>
@@ -9492,7 +9545,6 @@
                 <w:sz w:val="26"/>
                 <w:szCs w:val="26"/>
               </w:rPr>
-              <w:lastRenderedPageBreak/>
               <w:t>1</w:t>
             </w:r>
           </w:p>
@@ -10170,7 +10222,7 @@
         </w:rPr>
         <w:t xml:space="preserve"> </w:t>
       </w:r>
-      <w:bookmarkStart w:id="23" w:name="_Toc241186034"/>
+      <w:bookmarkStart w:id="22" w:name="_Toc241234541"/>
       <w:r>
         <w:rPr>
           <w:rFonts w:eastAsiaTheme="majorEastAsia"/>
@@ -10184,7 +10236,7 @@
         </w:rPr>
         <w:t>Bảng tổng hợp kết quả hiệu năng trên tập kiểm tra</w:t>
       </w:r>
-      <w:bookmarkEnd w:id="23"/>
+      <w:bookmarkEnd w:id="22"/>
     </w:p>
     <w:p>
       <w:pPr>
@@ -10311,14 +10363,14 @@
         <w:ind w:left="284"/>
         <w:jc w:val="both"/>
       </w:pPr>
-      <w:bookmarkStart w:id="24" w:name="_Toc241184329"/>
+      <w:bookmarkStart w:id="23" w:name="_Toc241234533"/>
       <w:r>
         <w:rPr>
           <w:rStyle w:val="ng-star-inserted"/>
         </w:rPr>
         <w:t>Đóng gói mô hình và cấu trúc Artifacts</w:t>
       </w:r>
-      <w:bookmarkEnd w:id="24"/>
+      <w:bookmarkEnd w:id="23"/>
     </w:p>
     <w:p>
       <w:pPr>
@@ -10419,6 +10471,7 @@
           <w:szCs w:val="26"/>
           <w:bdr w:val="none" w:sz="0" w:space="0" w:color="auto" w:frame="1"/>
         </w:rPr>
+        <w:lastRenderedPageBreak/>
         <w:t>schema.json</w:t>
       </w:r>
       <w:r>
@@ -10485,7 +10538,6 @@
           <w:sz w:val="26"/>
           <w:szCs w:val="26"/>
         </w:rPr>
-        <w:lastRenderedPageBreak/>
         <w:t>Các file mô hình riêng biệt (</w:t>
       </w:r>
       <w:r>
@@ -10564,6 +10616,639 @@
         </w:rPr>
         <w:t>) phục vụ hệ thống đa mô hình.</w:t>
       </w:r>
+    </w:p>
+    <w:p>
+      <w:pPr>
+        <w:spacing w:line="360" w:lineRule="auto"/>
+        <w:rPr>
+          <w:rFonts w:eastAsiaTheme="majorEastAsia"/>
+          <w:szCs w:val="26"/>
+          <w:lang w:val="vi-VN"/>
+        </w:rPr>
+      </w:pPr>
+    </w:p>
+    <w:p>
+      <w:pPr>
+        <w:spacing w:line="360" w:lineRule="auto"/>
+        <w:rPr>
+          <w:rFonts w:eastAsiaTheme="majorEastAsia"/>
+          <w:szCs w:val="26"/>
+          <w:lang w:val="vi-VN"/>
+        </w:rPr>
+      </w:pPr>
+    </w:p>
+    <w:p>
+      <w:pPr>
+        <w:spacing w:line="360" w:lineRule="auto"/>
+        <w:rPr>
+          <w:rFonts w:eastAsiaTheme="majorEastAsia"/>
+          <w:szCs w:val="26"/>
+          <w:lang w:val="vi-VN"/>
+        </w:rPr>
+      </w:pPr>
+    </w:p>
+    <w:p>
+      <w:pPr>
+        <w:spacing w:line="360" w:lineRule="auto"/>
+        <w:rPr>
+          <w:rFonts w:eastAsiaTheme="majorEastAsia"/>
+          <w:szCs w:val="26"/>
+          <w:lang w:val="vi-VN"/>
+        </w:rPr>
+      </w:pPr>
+    </w:p>
+    <w:p>
+      <w:pPr>
+        <w:spacing w:line="360" w:lineRule="auto"/>
+        <w:rPr>
+          <w:rFonts w:eastAsiaTheme="majorEastAsia"/>
+          <w:szCs w:val="26"/>
+          <w:lang w:val="vi-VN"/>
+        </w:rPr>
+      </w:pPr>
+    </w:p>
+    <w:p>
+      <w:pPr>
+        <w:spacing w:line="360" w:lineRule="auto"/>
+        <w:rPr>
+          <w:rFonts w:eastAsiaTheme="majorEastAsia"/>
+          <w:szCs w:val="26"/>
+          <w:lang w:val="vi-VN"/>
+        </w:rPr>
+      </w:pPr>
+    </w:p>
+    <w:p>
+      <w:pPr>
+        <w:spacing w:line="360" w:lineRule="auto"/>
+        <w:rPr>
+          <w:rFonts w:eastAsiaTheme="majorEastAsia"/>
+          <w:szCs w:val="26"/>
+          <w:lang w:val="vi-VN"/>
+        </w:rPr>
+      </w:pPr>
+    </w:p>
+    <w:p>
+      <w:pPr>
+        <w:spacing w:line="360" w:lineRule="auto"/>
+        <w:rPr>
+          <w:rFonts w:eastAsiaTheme="majorEastAsia"/>
+          <w:szCs w:val="26"/>
+          <w:lang w:val="vi-VN"/>
+        </w:rPr>
+      </w:pPr>
+    </w:p>
+    <w:p>
+      <w:pPr>
+        <w:spacing w:line="360" w:lineRule="auto"/>
+        <w:rPr>
+          <w:rFonts w:eastAsiaTheme="majorEastAsia"/>
+          <w:szCs w:val="26"/>
+          <w:lang w:val="vi-VN"/>
+        </w:rPr>
+      </w:pPr>
+    </w:p>
+    <w:p>
+      <w:pPr>
+        <w:spacing w:line="360" w:lineRule="auto"/>
+        <w:rPr>
+          <w:rFonts w:eastAsiaTheme="majorEastAsia"/>
+          <w:szCs w:val="26"/>
+          <w:lang w:val="vi-VN"/>
+        </w:rPr>
+      </w:pPr>
+    </w:p>
+    <w:p>
+      <w:pPr>
+        <w:spacing w:line="360" w:lineRule="auto"/>
+        <w:rPr>
+          <w:rFonts w:eastAsiaTheme="majorEastAsia"/>
+          <w:szCs w:val="26"/>
+          <w:lang w:val="vi-VN"/>
+        </w:rPr>
+      </w:pPr>
+    </w:p>
+    <w:p>
+      <w:pPr>
+        <w:spacing w:line="360" w:lineRule="auto"/>
+        <w:rPr>
+          <w:rFonts w:eastAsiaTheme="majorEastAsia"/>
+          <w:szCs w:val="26"/>
+          <w:lang w:val="vi-VN"/>
+        </w:rPr>
+      </w:pPr>
+    </w:p>
+    <w:p>
+      <w:pPr>
+        <w:spacing w:line="360" w:lineRule="auto"/>
+        <w:rPr>
+          <w:rFonts w:eastAsiaTheme="majorEastAsia"/>
+          <w:szCs w:val="26"/>
+          <w:lang w:val="vi-VN"/>
+        </w:rPr>
+      </w:pPr>
+    </w:p>
+    <w:p>
+      <w:pPr>
+        <w:spacing w:line="360" w:lineRule="auto"/>
+        <w:rPr>
+          <w:rFonts w:eastAsiaTheme="majorEastAsia"/>
+          <w:szCs w:val="26"/>
+          <w:lang w:val="vi-VN"/>
+        </w:rPr>
+      </w:pPr>
+    </w:p>
+    <w:p>
+      <w:pPr>
+        <w:spacing w:line="360" w:lineRule="auto"/>
+        <w:rPr>
+          <w:rFonts w:eastAsiaTheme="majorEastAsia"/>
+          <w:szCs w:val="26"/>
+          <w:lang w:val="vi-VN"/>
+        </w:rPr>
+      </w:pPr>
+    </w:p>
+    <w:p>
+      <w:pPr>
+        <w:spacing w:line="360" w:lineRule="auto"/>
+        <w:rPr>
+          <w:rFonts w:eastAsiaTheme="majorEastAsia"/>
+          <w:szCs w:val="26"/>
+          <w:lang w:val="vi-VN"/>
+        </w:rPr>
+      </w:pPr>
+    </w:p>
+    <w:p>
+      <w:pPr>
+        <w:spacing w:line="360" w:lineRule="auto"/>
+        <w:rPr>
+          <w:rFonts w:eastAsiaTheme="majorEastAsia"/>
+          <w:szCs w:val="26"/>
+          <w:lang w:val="vi-VN"/>
+        </w:rPr>
+      </w:pPr>
+    </w:p>
+    <w:p>
+      <w:pPr>
+        <w:spacing w:line="360" w:lineRule="auto"/>
+        <w:rPr>
+          <w:rFonts w:eastAsiaTheme="majorEastAsia"/>
+          <w:szCs w:val="26"/>
+          <w:lang w:val="vi-VN"/>
+        </w:rPr>
+      </w:pPr>
+    </w:p>
+    <w:p>
+      <w:pPr>
+        <w:spacing w:line="360" w:lineRule="auto"/>
+        <w:rPr>
+          <w:rFonts w:eastAsiaTheme="majorEastAsia"/>
+          <w:szCs w:val="26"/>
+          <w:lang w:val="vi-VN"/>
+        </w:rPr>
+      </w:pPr>
+    </w:p>
+    <w:p>
+      <w:pPr>
+        <w:spacing w:line="360" w:lineRule="auto"/>
+        <w:rPr>
+          <w:rFonts w:eastAsiaTheme="majorEastAsia"/>
+          <w:szCs w:val="26"/>
+          <w:lang w:val="vi-VN"/>
+        </w:rPr>
+      </w:pPr>
+    </w:p>
+    <w:p>
+      <w:pPr>
+        <w:spacing w:line="360" w:lineRule="auto"/>
+        <w:rPr>
+          <w:rFonts w:eastAsiaTheme="majorEastAsia"/>
+          <w:szCs w:val="26"/>
+          <w:lang w:val="vi-VN"/>
+        </w:rPr>
+      </w:pPr>
+    </w:p>
+    <w:p>
+      <w:pPr>
+        <w:spacing w:line="360" w:lineRule="auto"/>
+        <w:rPr>
+          <w:rFonts w:eastAsiaTheme="majorEastAsia"/>
+          <w:szCs w:val="26"/>
+          <w:lang w:val="vi-VN"/>
+        </w:rPr>
+      </w:pPr>
+    </w:p>
+    <w:p>
+      <w:pPr>
+        <w:spacing w:line="360" w:lineRule="auto"/>
+        <w:rPr>
+          <w:rFonts w:eastAsiaTheme="majorEastAsia"/>
+          <w:szCs w:val="26"/>
+          <w:lang w:val="vi-VN"/>
+        </w:rPr>
+      </w:pPr>
+    </w:p>
+    <w:p>
+      <w:pPr>
+        <w:spacing w:line="360" w:lineRule="auto"/>
+        <w:rPr>
+          <w:rFonts w:eastAsiaTheme="majorEastAsia"/>
+          <w:szCs w:val="26"/>
+          <w:lang w:val="vi-VN"/>
+        </w:rPr>
+      </w:pPr>
+    </w:p>
+    <w:p>
+      <w:pPr>
+        <w:spacing w:line="360" w:lineRule="auto"/>
+        <w:rPr>
+          <w:rFonts w:eastAsiaTheme="majorEastAsia"/>
+          <w:szCs w:val="26"/>
+          <w:lang w:val="vi-VN"/>
+        </w:rPr>
+      </w:pPr>
+    </w:p>
+    <w:p>
+      <w:pPr>
+        <w:pStyle w:val="Heading1"/>
+        <w:ind w:left="142"/>
+      </w:pPr>
+      <w:bookmarkStart w:id="24" w:name="_Toc241234534"/>
+      <w:r>
+        <w:rPr>
+          <w:rStyle w:val="ng-star-inserted"/>
+        </w:rPr>
+        <w:lastRenderedPageBreak/>
+        <w:t>XÂY DỰNG HỆ THỐNG MLOPS VÀ TRIỂN KHAI SẢN PHẨM</w:t>
+      </w:r>
+      <w:bookmarkEnd w:id="24"/>
+    </w:p>
+    <w:p>
+      <w:pPr>
+        <w:spacing w:line="360" w:lineRule="auto"/>
+        <w:rPr>
+          <w:rFonts w:eastAsiaTheme="majorEastAsia"/>
+          <w:szCs w:val="26"/>
+          <w:lang w:val="vi-VN"/>
+        </w:rPr>
+      </w:pPr>
+    </w:p>
+    <w:p>
+      <w:pPr>
+        <w:spacing w:line="360" w:lineRule="auto"/>
+        <w:rPr>
+          <w:rFonts w:eastAsiaTheme="majorEastAsia"/>
+          <w:szCs w:val="26"/>
+          <w:lang w:val="vi-VN"/>
+        </w:rPr>
+      </w:pPr>
+    </w:p>
+    <w:p>
+      <w:pPr>
+        <w:pStyle w:val="Heading2"/>
+        <w:ind w:left="142" w:hanging="426"/>
+      </w:pPr>
+      <w:bookmarkStart w:id="25" w:name="_Toc241234535"/>
+      <w:r>
+        <w:rPr>
+          <w:rStyle w:val="ng-star-inserted"/>
+          <w:rFonts w:cs="Times New Roman"/>
+          <w:color w:val="1B1B1E"/>
+        </w:rPr>
+        <w:t>Thiết kế kiến trúc hệ thống 3 Container Docker</w:t>
+      </w:r>
+      <w:bookmarkEnd w:id="25"/>
+    </w:p>
+    <w:p>
+      <w:pPr>
+        <w:pStyle w:val="ng-star-inserted1"/>
+        <w:shd w:val="clear" w:color="auto" w:fill="FFFFFF"/>
+        <w:spacing w:after="270" w:afterAutospacing="0" w:line="315" w:lineRule="atLeast"/>
+        <w:jc w:val="both"/>
+        <w:rPr>
+          <w:color w:val="1B1B1E"/>
+          <w:sz w:val="26"/>
+          <w:szCs w:val="26"/>
+        </w:rPr>
+      </w:pPr>
+      <w:r>
+        <w:rPr>
+          <w:rStyle w:val="ng-star-inserted"/>
+          <w:color w:val="1B1B1E"/>
+          <w:sz w:val="26"/>
+          <w:szCs w:val="26"/>
+        </w:rPr>
+        <w:t xml:space="preserve">Hệ thống được đóng gói hoàn toàn bằng công nghệ Container hóa Docker, chạy thông suốt qua lệnh </w:t>
+      </w:r>
+      <w:r>
+        <w:rPr>
+          <w:rStyle w:val="inline-code"/>
+          <w:color w:val="2B2D31"/>
+          <w:sz w:val="26"/>
+          <w:szCs w:val="26"/>
+          <w:bdr w:val="none" w:sz="0" w:space="0" w:color="auto" w:frame="1"/>
+        </w:rPr>
+        <w:t>docker compose up --build -d</w:t>
+      </w:r>
+      <w:r>
+        <w:rPr>
+          <w:rStyle w:val="ng-star-inserted"/>
+          <w:color w:val="1B1B1E"/>
+          <w:sz w:val="26"/>
+          <w:szCs w:val="26"/>
+        </w:rPr>
+        <w:t xml:space="preserve"> với 3 thành phần độc lập:</w:t>
+      </w:r>
+    </w:p>
+    <w:p>
+      <w:pPr>
+        <w:pStyle w:val="ng-star-inserted1"/>
+        <w:shd w:val="clear" w:color="auto" w:fill="FFFFFF"/>
+        <w:spacing w:before="0" w:beforeAutospacing="0" w:after="105" w:afterAutospacing="0" w:line="315" w:lineRule="atLeast"/>
+        <w:ind w:left="360"/>
+        <w:jc w:val="both"/>
+        <w:rPr>
+          <w:color w:val="1B1B1E"/>
+          <w:sz w:val="26"/>
+          <w:szCs w:val="26"/>
+        </w:rPr>
+      </w:pPr>
+      <w:r>
+        <w:rPr>
+          <w:rStyle w:val="inline-code"/>
+          <w:b/>
+          <w:bCs/>
+          <w:color w:val="2B2D31"/>
+          <w:sz w:val="26"/>
+          <w:szCs w:val="26"/>
+          <w:bdr w:val="none" w:sz="0" w:space="0" w:color="auto" w:frame="1"/>
+        </w:rPr>
+        <w:t>frontend</w:t>
+      </w:r>
+      <w:r>
+        <w:rPr>
+          <w:rStyle w:val="ng-star-inserted"/>
+          <w:b/>
+          <w:bCs/>
+          <w:color w:val="1B1B1E"/>
+          <w:sz w:val="26"/>
+          <w:szCs w:val="26"/>
+        </w:rPr>
+        <w:t xml:space="preserve"> (Cổng 3000):</w:t>
+      </w:r>
+      <w:r>
+        <w:rPr>
+          <w:rStyle w:val="ng-star-inserted"/>
+          <w:color w:val="1B1B1E"/>
+          <w:sz w:val="26"/>
+          <w:szCs w:val="26"/>
+        </w:rPr>
+        <w:t xml:space="preserve"> Giao diện Web HTML/CSS hiện đại, cung cấp menu thả xuống (Dropdown) cho phép người dùng linh hoạt chọn 1 trong 4 mô hình để so sánh kết quả dự đoán trực quan.</w:t>
+      </w:r>
+    </w:p>
+    <w:p>
+      <w:pPr>
+        <w:pStyle w:val="ng-star-inserted1"/>
+        <w:shd w:val="clear" w:color="auto" w:fill="FFFFFF"/>
+        <w:spacing w:before="0" w:beforeAutospacing="0" w:after="105" w:afterAutospacing="0" w:line="360" w:lineRule="auto"/>
+        <w:ind w:left="360"/>
+        <w:jc w:val="both"/>
+        <w:rPr>
+          <w:color w:val="1B1B1E"/>
+          <w:sz w:val="26"/>
+          <w:szCs w:val="26"/>
+        </w:rPr>
+      </w:pPr>
+      <w:r>
+        <w:rPr>
+          <w:rStyle w:val="inline-code"/>
+          <w:b/>
+          <w:bCs/>
+          <w:color w:val="2B2D31"/>
+          <w:sz w:val="26"/>
+          <w:szCs w:val="26"/>
+          <w:bdr w:val="none" w:sz="0" w:space="0" w:color="auto" w:frame="1"/>
+        </w:rPr>
+        <w:t>backend</w:t>
+      </w:r>
+      <w:r>
+        <w:rPr>
+          <w:rStyle w:val="ng-star-inserted"/>
+          <w:b/>
+          <w:bCs/>
+          <w:color w:val="1B1B1E"/>
+          <w:sz w:val="26"/>
+          <w:szCs w:val="26"/>
+        </w:rPr>
+        <w:t xml:space="preserve"> (Cổng 8000):</w:t>
+      </w:r>
+      <w:r>
+        <w:rPr>
+          <w:rStyle w:val="ng-star-inserted"/>
+          <w:color w:val="1B1B1E"/>
+          <w:sz w:val="26"/>
+          <w:szCs w:val="26"/>
+        </w:rPr>
+        <w:t xml:space="preserve"> FastAPI Gateway đứng ở tầng trung gian, chịu trách nhiệm validate dữ liệu đầu vào theo </w:t>
+      </w:r>
+      <w:r>
+        <w:rPr>
+          <w:rStyle w:val="inline-code"/>
+          <w:color w:val="2B2D31"/>
+          <w:sz w:val="26"/>
+          <w:szCs w:val="26"/>
+          <w:bdr w:val="none" w:sz="0" w:space="0" w:color="auto" w:frame="1"/>
+        </w:rPr>
+        <w:t>schema.json</w:t>
+      </w:r>
+      <w:r>
+        <w:rPr>
+          <w:rStyle w:val="ng-star-inserted"/>
+          <w:color w:val="1B1B1E"/>
+          <w:sz w:val="26"/>
+          <w:szCs w:val="26"/>
+        </w:rPr>
+        <w:t xml:space="preserve">, tự động sinh mã </w:t>
+      </w:r>
+      <w:r>
+        <w:rPr>
+          <w:rStyle w:val="inline-code"/>
+          <w:color w:val="2B2D31"/>
+          <w:sz w:val="26"/>
+          <w:szCs w:val="26"/>
+          <w:bdr w:val="none" w:sz="0" w:space="0" w:color="auto" w:frame="1"/>
+        </w:rPr>
+        <w:t>request_id</w:t>
+      </w:r>
+      <w:r>
+        <w:rPr>
+          <w:rStyle w:val="ng-star-inserted"/>
+          <w:color w:val="1B1B1E"/>
+          <w:sz w:val="26"/>
+          <w:szCs w:val="26"/>
+        </w:rPr>
+        <w:t xml:space="preserve"> tracing cho mỗi lượt request và ghi log thời gian thực.</w:t>
+      </w:r>
+    </w:p>
+    <w:p>
+      <w:pPr>
+        <w:pStyle w:val="ng-star-inserted1"/>
+        <w:shd w:val="clear" w:color="auto" w:fill="FFFFFF"/>
+        <w:spacing w:before="0" w:beforeAutospacing="0" w:after="105" w:afterAutospacing="0" w:line="315" w:lineRule="atLeast"/>
+        <w:ind w:left="360"/>
+        <w:jc w:val="both"/>
+        <w:rPr>
+          <w:color w:val="1B1B1E"/>
+          <w:sz w:val="26"/>
+          <w:szCs w:val="26"/>
+        </w:rPr>
+      </w:pPr>
+      <w:r>
+        <w:rPr>
+          <w:rStyle w:val="inline-code"/>
+          <w:b/>
+          <w:bCs/>
+          <w:color w:val="2B2D31"/>
+          <w:sz w:val="26"/>
+          <w:szCs w:val="26"/>
+          <w:bdr w:val="none" w:sz="0" w:space="0" w:color="auto" w:frame="1"/>
+        </w:rPr>
+        <w:t>ai-service</w:t>
+      </w:r>
+      <w:r>
+        <w:rPr>
+          <w:rStyle w:val="ng-star-inserted"/>
+          <w:b/>
+          <w:bCs/>
+          <w:color w:val="1B1B1E"/>
+          <w:sz w:val="26"/>
+          <w:szCs w:val="26"/>
+        </w:rPr>
+        <w:t xml:space="preserve"> (Cổng 8001):</w:t>
+      </w:r>
+      <w:r>
+        <w:rPr>
+          <w:rStyle w:val="ng-star-inserted"/>
+          <w:color w:val="1B1B1E"/>
+          <w:sz w:val="26"/>
+          <w:szCs w:val="26"/>
+        </w:rPr>
+        <w:t xml:space="preserve"> FastAPI Engine chuyên dụng, nạp toàn bộ 4 file </w:t>
+      </w:r>
+      <w:r>
+        <w:rPr>
+          <w:rStyle w:val="inline-code"/>
+          <w:color w:val="2B2D31"/>
+          <w:sz w:val="26"/>
+          <w:szCs w:val="26"/>
+          <w:bdr w:val="none" w:sz="0" w:space="0" w:color="auto" w:frame="1"/>
+        </w:rPr>
+        <w:t>.joblib</w:t>
+      </w:r>
+      <w:r>
+        <w:rPr>
+          <w:rStyle w:val="ng-star-inserted"/>
+          <w:color w:val="1B1B1E"/>
+          <w:sz w:val="26"/>
+          <w:szCs w:val="26"/>
+        </w:rPr>
+        <w:t xml:space="preserve"> vào bộ nhớ ngay khi container khởi động (không đợi request mới nạp) để đảm bảo độ trễ phản hồi thấp nhất (&lt; 20ms).</w:t>
+      </w:r>
+    </w:p>
+    <w:p>
+      <w:pPr>
+        <w:pStyle w:val="Heading2"/>
+        <w:ind w:left="0" w:hanging="426"/>
+        <w:jc w:val="both"/>
+      </w:pPr>
+      <w:bookmarkStart w:id="26" w:name="_Toc241234536"/>
+      <w:r>
+        <w:rPr>
+          <w:rStyle w:val="ng-star-inserted"/>
+          <w:rFonts w:cs="Times New Roman"/>
+          <w:color w:val="1B1B1E"/>
+        </w:rPr>
+        <w:t>Triển khai sản phẩm trực tuyến (Online Deployment)</w:t>
+      </w:r>
+      <w:bookmarkEnd w:id="26"/>
+    </w:p>
+    <w:p>
+      <w:pPr>
+        <w:pStyle w:val="ng-star-inserted1"/>
+        <w:shd w:val="clear" w:color="auto" w:fill="FFFFFF"/>
+        <w:spacing w:after="270" w:afterAutospacing="0" w:line="315" w:lineRule="atLeast"/>
+        <w:jc w:val="both"/>
+        <w:rPr>
+          <w:color w:val="1B1B1E"/>
+          <w:sz w:val="26"/>
+          <w:szCs w:val="26"/>
+        </w:rPr>
+      </w:pPr>
+      <w:r>
+        <w:rPr>
+          <w:rStyle w:val="ng-star-inserted"/>
+          <w:color w:val="1B1B1E"/>
+          <w:sz w:val="26"/>
+          <w:szCs w:val="26"/>
+        </w:rPr>
+        <w:t>Vì máy chủ cá nhân không có IP tĩnh, nhóm đã sử dụng công cụ Ngrok Tunnel kết hợp với tính năng Static Domain miễn phí để tạo ra một đường hầm bảo mật, trỏ trực tiếp vào cổng dịch vụ Frontend.</w:t>
+      </w:r>
+    </w:p>
+    <w:p>
+      <w:pPr>
+        <w:pStyle w:val="ng-star-inserted1"/>
+        <w:shd w:val="clear" w:color="auto" w:fill="FFFFFF"/>
+        <w:spacing w:before="0" w:beforeAutospacing="0" w:after="105" w:afterAutospacing="0" w:line="315" w:lineRule="atLeast"/>
+        <w:rPr>
+          <w:rStyle w:val="inline-code"/>
+          <w:color w:val="2B2D31"/>
+          <w:sz w:val="26"/>
+          <w:szCs w:val="26"/>
+          <w:bdr w:val="none" w:sz="0" w:space="0" w:color="auto" w:frame="1"/>
+        </w:rPr>
+      </w:pPr>
+      <w:r>
+        <w:rPr>
+          <w:rStyle w:val="ng-star-inserted"/>
+          <w:b/>
+          <w:bCs/>
+          <w:color w:val="1B1B1E"/>
+          <w:sz w:val="26"/>
+          <w:szCs w:val="26"/>
+        </w:rPr>
+        <w:t>Địa chỉ Demo trực tuyến chính thức:</w:t>
+      </w:r>
+      <w:r>
+        <w:rPr>
+          <w:color w:val="1B1B1E"/>
+          <w:sz w:val="26"/>
+          <w:szCs w:val="26"/>
+        </w:rPr>
+        <w:br/>
+      </w:r>
+      <w:hyperlink r:id="rId20" w:history="1">
+        <w:r>
+          <w:rPr>
+            <w:rStyle w:val="Hyperlink"/>
+            <w:sz w:val="26"/>
+            <w:szCs w:val="26"/>
+            <w:bdr w:val="none" w:sz="0" w:space="0" w:color="auto" w:frame="1"/>
+          </w:rPr>
+          <w:t>https://barmaid-trapezoid-grooving.ngrok-free.dev</w:t>
+        </w:r>
+      </w:hyperlink>
+    </w:p>
+    <w:p>
+      <w:pPr>
+        <w:pStyle w:val="ng-star-inserted1"/>
+        <w:shd w:val="clear" w:color="auto" w:fill="FFFFFF"/>
+        <w:spacing w:before="0" w:beforeAutospacing="0" w:after="105" w:afterAutospacing="0" w:line="315" w:lineRule="atLeast"/>
+        <w:jc w:val="both"/>
+        <w:rPr>
+          <w:color w:val="1B1B1E"/>
+          <w:sz w:val="26"/>
+          <w:szCs w:val="26"/>
+        </w:rPr>
+      </w:pPr>
     </w:p>
     <w:p>
       <w:pPr>
@@ -10575,15 +11260,16 @@
           <w:rFonts w:cs="Times New Roman"/>
         </w:rPr>
       </w:pPr>
-      <w:bookmarkStart w:id="25" w:name="_Toc241184330"/>
+      <w:bookmarkStart w:id="27" w:name="_Toc241234537"/>
       <w:r>
         <w:rPr>
           <w:rStyle w:val="ng-star-inserted"/>
           <w:rFonts w:cs="Times New Roman"/>
-        </w:rPr>
-        <w:t>Thiết kế kiến trúc hệ thống 3 Container Docker</w:t>
-      </w:r>
-      <w:bookmarkEnd w:id="25"/>
+          <w:color w:val="1B1B1E"/>
+        </w:rPr>
+        <w:t>Giao diện người dùng thực tế (Frontend UI)</w:t>
+      </w:r>
+      <w:bookmarkEnd w:id="27"/>
     </w:p>
     <w:p>
       <w:pPr>
@@ -10604,252 +11290,8 @@
           <w:sz w:val="26"/>
           <w:szCs w:val="26"/>
         </w:rPr>
-        <w:t xml:space="preserve">Hệ thống được đóng gói hoàn toàn bằng công nghệ Container hóa Docker, chạy thông suốt qua lệnh </w:t>
-      </w:r>
-      <w:r>
-        <w:rPr>
-          <w:rStyle w:val="inline-code"/>
-          <w:color w:val="2B2D31"/>
-          <w:sz w:val="26"/>
-          <w:szCs w:val="26"/>
-          <w:bdr w:val="none" w:sz="0" w:space="0" w:color="auto" w:frame="1"/>
-        </w:rPr>
-        <w:t>docker compose up --build -d</w:t>
-      </w:r>
-      <w:r>
-        <w:rPr>
-          <w:rStyle w:val="ng-star-inserted"/>
-          <w:color w:val="1B1B1E"/>
-          <w:sz w:val="26"/>
-          <w:szCs w:val="26"/>
-        </w:rPr>
-        <w:t xml:space="preserve"> với 3 thành phần độc lập:</w:t>
-      </w:r>
-    </w:p>
-    <w:p>
-      <w:pPr>
-        <w:pStyle w:val="ng-star-inserted1"/>
-        <w:numPr>
-          <w:ilvl w:val="0"/>
-          <w:numId w:val="37"/>
-        </w:numPr>
-        <w:shd w:val="clear" w:color="auto" w:fill="FFFFFF"/>
-        <w:spacing w:before="0" w:beforeAutospacing="0" w:after="105" w:afterAutospacing="0" w:line="360" w:lineRule="auto"/>
-        <w:jc w:val="both"/>
-        <w:rPr>
-          <w:color w:val="1B1B1E"/>
-          <w:sz w:val="26"/>
-          <w:szCs w:val="26"/>
-        </w:rPr>
-      </w:pPr>
-      <w:r>
-        <w:rPr>
-          <w:rStyle w:val="inline-code"/>
-          <w:b/>
-          <w:bCs/>
-          <w:color w:val="2B2D31"/>
-          <w:sz w:val="26"/>
-          <w:szCs w:val="26"/>
-          <w:bdr w:val="none" w:sz="0" w:space="0" w:color="auto" w:frame="1"/>
-        </w:rPr>
-        <w:t>frontend</w:t>
-      </w:r>
-      <w:r>
-        <w:rPr>
-          <w:rStyle w:val="ng-star-inserted"/>
-          <w:b/>
-          <w:bCs/>
-          <w:color w:val="1B1B1E"/>
-          <w:sz w:val="26"/>
-          <w:szCs w:val="26"/>
-        </w:rPr>
-        <w:t xml:space="preserve"> (Cổng 3000):</w:t>
-      </w:r>
-      <w:r>
-        <w:rPr>
-          <w:rStyle w:val="ng-star-inserted"/>
-          <w:color w:val="1B1B1E"/>
-          <w:sz w:val="26"/>
-          <w:szCs w:val="26"/>
-        </w:rPr>
-        <w:t xml:space="preserve"> Giao diện Web HTML/CSS hiện đại, cung cấp menu thả xuống (Dropdown) cho phép người dùng linh hoạt chọn 1 trong 4 mô hình để so sánh kết quả dự đoán trực quan.</w:t>
-      </w:r>
-    </w:p>
-    <w:p>
-      <w:pPr>
-        <w:pStyle w:val="ng-star-inserted1"/>
-        <w:numPr>
-          <w:ilvl w:val="0"/>
-          <w:numId w:val="37"/>
-        </w:numPr>
-        <w:shd w:val="clear" w:color="auto" w:fill="FFFFFF"/>
-        <w:spacing w:before="0" w:beforeAutospacing="0" w:after="105" w:afterAutospacing="0" w:line="360" w:lineRule="auto"/>
-        <w:jc w:val="both"/>
-        <w:rPr>
-          <w:color w:val="1B1B1E"/>
-          <w:sz w:val="26"/>
-          <w:szCs w:val="26"/>
-        </w:rPr>
-      </w:pPr>
-      <w:r>
-        <w:rPr>
-          <w:rStyle w:val="inline-code"/>
-          <w:b/>
-          <w:bCs/>
-          <w:color w:val="2B2D31"/>
-          <w:sz w:val="26"/>
-          <w:szCs w:val="26"/>
-          <w:bdr w:val="none" w:sz="0" w:space="0" w:color="auto" w:frame="1"/>
-        </w:rPr>
-        <w:t>backend</w:t>
-      </w:r>
-      <w:r>
-        <w:rPr>
-          <w:rStyle w:val="ng-star-inserted"/>
-          <w:b/>
-          <w:bCs/>
-          <w:color w:val="1B1B1E"/>
-          <w:sz w:val="26"/>
-          <w:szCs w:val="26"/>
-        </w:rPr>
-        <w:t xml:space="preserve"> (Cổng 8000):</w:t>
-      </w:r>
-      <w:r>
-        <w:rPr>
-          <w:rStyle w:val="ng-star-inserted"/>
-          <w:color w:val="1B1B1E"/>
-          <w:sz w:val="26"/>
-          <w:szCs w:val="26"/>
-        </w:rPr>
-        <w:t xml:space="preserve"> FastAPI Gateway đứng ở tầng trung gian, chịu trách nhiệm validate dữ liệu đầu vào theo </w:t>
-      </w:r>
-      <w:r>
-        <w:rPr>
-          <w:rStyle w:val="inline-code"/>
-          <w:color w:val="2B2D31"/>
-          <w:sz w:val="26"/>
-          <w:szCs w:val="26"/>
-          <w:bdr w:val="none" w:sz="0" w:space="0" w:color="auto" w:frame="1"/>
-        </w:rPr>
-        <w:t>schema.json</w:t>
-      </w:r>
-      <w:r>
-        <w:rPr>
-          <w:rStyle w:val="ng-star-inserted"/>
-          <w:color w:val="1B1B1E"/>
-          <w:sz w:val="26"/>
-          <w:szCs w:val="26"/>
-        </w:rPr>
-        <w:t xml:space="preserve">, tự động sinh mã </w:t>
-      </w:r>
-      <w:r>
-        <w:rPr>
-          <w:rStyle w:val="inline-code"/>
-          <w:color w:val="2B2D31"/>
-          <w:sz w:val="26"/>
-          <w:szCs w:val="26"/>
-          <w:bdr w:val="none" w:sz="0" w:space="0" w:color="auto" w:frame="1"/>
-        </w:rPr>
-        <w:t>request_id</w:t>
-      </w:r>
-      <w:r>
-        <w:rPr>
-          <w:rStyle w:val="ng-star-inserted"/>
-          <w:color w:val="1B1B1E"/>
-          <w:sz w:val="26"/>
-          <w:szCs w:val="26"/>
-        </w:rPr>
-        <w:t xml:space="preserve"> tracing cho mỗi lượt request và ghi log thời gian thực.</w:t>
-      </w:r>
-    </w:p>
-    <w:p>
-      <w:pPr>
-        <w:pStyle w:val="ng-star-inserted1"/>
-        <w:numPr>
-          <w:ilvl w:val="0"/>
-          <w:numId w:val="37"/>
-        </w:numPr>
-        <w:shd w:val="clear" w:color="auto" w:fill="FFFFFF"/>
-        <w:spacing w:before="0" w:beforeAutospacing="0" w:after="105" w:afterAutospacing="0" w:line="360" w:lineRule="auto"/>
-        <w:jc w:val="both"/>
-        <w:rPr>
-          <w:color w:val="1B1B1E"/>
-          <w:sz w:val="26"/>
-          <w:szCs w:val="26"/>
-        </w:rPr>
-      </w:pPr>
-      <w:r>
-        <w:rPr>
-          <w:rStyle w:val="inline-code"/>
-          <w:b/>
-          <w:bCs/>
-          <w:color w:val="2B2D31"/>
-          <w:sz w:val="26"/>
-          <w:szCs w:val="26"/>
-          <w:bdr w:val="none" w:sz="0" w:space="0" w:color="auto" w:frame="1"/>
-        </w:rPr>
-        <w:t>ai-service</w:t>
-      </w:r>
-      <w:r>
-        <w:rPr>
-          <w:rStyle w:val="ng-star-inserted"/>
-          <w:b/>
-          <w:bCs/>
-          <w:color w:val="1B1B1E"/>
-          <w:sz w:val="26"/>
-          <w:szCs w:val="26"/>
-        </w:rPr>
-        <w:t xml:space="preserve"> (Cổng 8001):</w:t>
-      </w:r>
-      <w:r>
-        <w:rPr>
-          <w:rStyle w:val="ng-star-inserted"/>
-          <w:color w:val="1B1B1E"/>
-          <w:sz w:val="26"/>
-          <w:szCs w:val="26"/>
-        </w:rPr>
-        <w:t xml:space="preserve"> FastAPI Engine chuyên dụng, nạp toàn bộ 4 file </w:t>
-      </w:r>
-      <w:r>
-        <w:rPr>
-          <w:rStyle w:val="inline-code"/>
-          <w:color w:val="2B2D31"/>
-          <w:sz w:val="26"/>
-          <w:szCs w:val="26"/>
-          <w:bdr w:val="none" w:sz="0" w:space="0" w:color="auto" w:frame="1"/>
-        </w:rPr>
-        <w:t>.joblib</w:t>
-      </w:r>
-      <w:r>
-        <w:rPr>
-          <w:rStyle w:val="ng-star-inserted"/>
-          <w:color w:val="1B1B1E"/>
-          <w:sz w:val="26"/>
-          <w:szCs w:val="26"/>
-        </w:rPr>
-        <w:t xml:space="preserve"> vào bộ nhớ ngay khi container khởi động (không đợi request mới nạp) để đảm bảo độ trễ phản hồi thấp nhất (&lt; 20ms).</w:t>
-      </w:r>
-    </w:p>
-    <w:p>
-      <w:pPr>
-        <w:pStyle w:val="Heading2"/>
-        <w:spacing w:line="360" w:lineRule="auto"/>
-        <w:ind w:left="284"/>
-        <w:jc w:val="both"/>
-        <w:rPr>
-          <w:rFonts w:cs="Times New Roman"/>
-        </w:rPr>
-      </w:pPr>
-      <w:bookmarkStart w:id="26" w:name="_Toc241184331"/>
-      <w:r>
-        <w:rPr>
-          <w:rStyle w:val="ng-star-inserted"/>
-          <w:rFonts w:cs="Times New Roman"/>
-          <w:color w:val="1B1B1E"/>
-        </w:rPr>
-        <w:t>Triển khai sản phẩm trực tuyến (Online Deployment)</w:t>
-      </w:r>
-      <w:bookmarkEnd w:id="26"/>
+        <w:t>Giao diện ứng dụng được thiết kế tối giản, thân thiện với người dùng, cho phép nhập liệu ngân sách quảng cáo của 3 kênh TV, Radio, Newspaper và chọn lựa mô hình học máy bất kỳ để thực hiện dự đoán thời gian thực.</w:t>
+      </w:r>
     </w:p>
     <w:p>
       <w:pPr>
@@ -10863,137 +11305,6 @@
           <w:szCs w:val="26"/>
         </w:rPr>
       </w:pPr>
-      <w:r>
-        <w:rPr>
-          <w:rStyle w:val="ng-star-inserted"/>
-          <w:color w:val="1B1B1E"/>
-          <w:sz w:val="26"/>
-          <w:szCs w:val="26"/>
-        </w:rPr>
-        <w:t xml:space="preserve">Vì máy chủ cá nhân không có IP tĩnh, nhóm đã sử dụng công cụ </w:t>
-      </w:r>
-      <w:r>
-        <w:rPr>
-          <w:rStyle w:val="ng-star-inserted"/>
-          <w:b/>
-          <w:bCs/>
-          <w:color w:val="1B1B1E"/>
-          <w:sz w:val="26"/>
-          <w:szCs w:val="26"/>
-        </w:rPr>
-        <w:t>Ngrok Tunnel</w:t>
-      </w:r>
-      <w:r>
-        <w:rPr>
-          <w:rStyle w:val="ng-star-inserted"/>
-          <w:color w:val="1B1B1E"/>
-          <w:sz w:val="26"/>
-          <w:szCs w:val="26"/>
-        </w:rPr>
-        <w:t xml:space="preserve"> kết hợp với tính năng </w:t>
-      </w:r>
-      <w:r>
-        <w:rPr>
-          <w:rStyle w:val="ng-star-inserted"/>
-          <w:b/>
-          <w:bCs/>
-          <w:color w:val="1B1B1E"/>
-          <w:sz w:val="26"/>
-          <w:szCs w:val="26"/>
-        </w:rPr>
-        <w:t>Static Domain</w:t>
-      </w:r>
-      <w:r>
-        <w:rPr>
-          <w:rStyle w:val="ng-star-inserted"/>
-          <w:color w:val="1B1B1E"/>
-          <w:sz w:val="26"/>
-          <w:szCs w:val="26"/>
-        </w:rPr>
-        <w:t xml:space="preserve"> miễn phí để tạo ra một đường hầm bảo mật, trỏ trực tiếp vào cổng dịch vụ Frontend.</w:t>
-      </w:r>
-    </w:p>
-    <w:p>
-      <w:pPr>
-        <w:pStyle w:val="ng-star-inserted1"/>
-        <w:shd w:val="clear" w:color="auto" w:fill="FFFFFF"/>
-        <w:spacing w:before="0" w:beforeAutospacing="0" w:after="105" w:afterAutospacing="0" w:line="360" w:lineRule="auto"/>
-        <w:rPr>
-          <w:rStyle w:val="inline-code"/>
-          <w:b/>
-          <w:bCs/>
-          <w:color w:val="2B2D31"/>
-          <w:sz w:val="26"/>
-          <w:szCs w:val="26"/>
-          <w:bdr w:val="none" w:sz="0" w:space="0" w:color="auto" w:frame="1"/>
-        </w:rPr>
-      </w:pPr>
-      <w:r>
-        <w:rPr>
-          <w:rStyle w:val="ng-star-inserted"/>
-          <w:b/>
-          <w:bCs/>
-          <w:color w:val="1B1B1E"/>
-          <w:sz w:val="26"/>
-          <w:szCs w:val="26"/>
-        </w:rPr>
-        <w:t>Địa chỉ Demo trực tuyến chính thức:</w:t>
-      </w:r>
-      <w:r>
-        <w:rPr>
-          <w:color w:val="1B1B1E"/>
-          <w:sz w:val="26"/>
-          <w:szCs w:val="26"/>
-        </w:rPr>
-        <w:br/>
-      </w:r>
-      <w:hyperlink r:id="rId20" w:history="1">
-        <w:r>
-          <w:rPr>
-            <w:rStyle w:val="Hyperlink"/>
-            <w:b/>
-            <w:bCs/>
-            <w:sz w:val="26"/>
-            <w:szCs w:val="26"/>
-            <w:bdr w:val="none" w:sz="0" w:space="0" w:color="auto" w:frame="1"/>
-          </w:rPr>
-          <w:t>https://barmaid-trapezoid-grooving.ngrok-free.dev</w:t>
-        </w:r>
-      </w:hyperlink>
-    </w:p>
-    <w:p>
-      <w:pPr>
-        <w:pStyle w:val="ng-star-inserted1"/>
-        <w:shd w:val="clear" w:color="auto" w:fill="FFFFFF"/>
-        <w:spacing w:before="0" w:beforeAutospacing="0" w:after="105" w:afterAutospacing="0" w:line="360" w:lineRule="auto"/>
-        <w:jc w:val="both"/>
-        <w:rPr>
-          <w:color w:val="1B1B1E"/>
-          <w:sz w:val="26"/>
-          <w:szCs w:val="26"/>
-        </w:rPr>
-      </w:pPr>
-    </w:p>
-    <w:p>
-      <w:pPr>
-        <w:pStyle w:val="Heading2"/>
-        <w:spacing w:line="360" w:lineRule="auto"/>
-        <w:ind w:left="284"/>
-        <w:jc w:val="both"/>
-        <w:rPr>
-          <w:rFonts w:cs="Times New Roman"/>
-        </w:rPr>
-      </w:pPr>
-      <w:bookmarkStart w:id="27" w:name="_Toc241184332"/>
-      <w:r>
-        <w:rPr>
-          <w:rStyle w:val="ng-star-inserted"/>
-          <w:rFonts w:cs="Times New Roman"/>
-          <w:color w:val="1B1B1E"/>
-        </w:rPr>
-        <w:t>Giao diện người dùng thực tế (Frontend UI)</w:t>
-      </w:r>
-      <w:bookmarkEnd w:id="27"/>
     </w:p>
     <w:p>
       <w:pPr>
@@ -11002,21 +11313,11 @@
         <w:spacing w:after="270" w:afterAutospacing="0" w:line="360" w:lineRule="auto"/>
         <w:jc w:val="both"/>
         <w:rPr>
-          <w:rStyle w:val="ng-star-inserted"/>
-          <w:color w:val="1B1B1E"/>
-          <w:sz w:val="26"/>
-          <w:szCs w:val="26"/>
-        </w:rPr>
-      </w:pPr>
-      <w:r>
-        <w:rPr>
-          <w:rStyle w:val="ng-star-inserted"/>
-          <w:color w:val="1B1B1E"/>
-          <w:sz w:val="26"/>
-          <w:szCs w:val="26"/>
-        </w:rPr>
-        <w:t>Giao diện ứng dụng được thiết kế tối giản, thân thiện với người dùng, cho phép nhập liệu ngân sách quảng cáo của 3 kênh TV, Radio, Newspaper và chọn lựa mô hình học máy bất kỳ để thực hiện dự đoán thời gian thực.</w:t>
-      </w:r>
+          <w:color w:val="1B1B1E"/>
+          <w:sz w:val="26"/>
+          <w:szCs w:val="26"/>
+        </w:rPr>
+      </w:pPr>
     </w:p>
     <w:p>
       <w:pPr>
@@ -11049,47 +11350,12 @@
         <w:pStyle w:val="ng-star-inserted1"/>
         <w:shd w:val="clear" w:color="auto" w:fill="FFFFFF"/>
         <w:spacing w:after="270" w:afterAutospacing="0" w:line="360" w:lineRule="auto"/>
-        <w:jc w:val="both"/>
-        <w:rPr>
-          <w:color w:val="1B1B1E"/>
-          <w:sz w:val="26"/>
-          <w:szCs w:val="26"/>
-        </w:rPr>
-      </w:pPr>
-    </w:p>
-    <w:p>
-      <w:pPr>
-        <w:pStyle w:val="ng-star-inserted1"/>
-        <w:shd w:val="clear" w:color="auto" w:fill="FFFFFF"/>
-        <w:spacing w:after="270" w:afterAutospacing="0" w:line="360" w:lineRule="auto"/>
-        <w:jc w:val="both"/>
-        <w:rPr>
-          <w:color w:val="1B1B1E"/>
-          <w:sz w:val="26"/>
-          <w:szCs w:val="26"/>
-        </w:rPr>
-      </w:pPr>
-    </w:p>
-    <w:p>
-      <w:pPr>
-        <w:pStyle w:val="ng-star-inserted1"/>
-        <w:shd w:val="clear" w:color="auto" w:fill="FFFFFF"/>
-        <w:spacing w:after="270" w:afterAutospacing="0" w:line="360" w:lineRule="auto"/>
-        <w:jc w:val="both"/>
-        <w:rPr>
-          <w:color w:val="1B1B1E"/>
-          <w:sz w:val="26"/>
-          <w:szCs w:val="26"/>
-        </w:rPr>
-      </w:pPr>
-    </w:p>
-    <w:p>
-      <w:pPr>
-        <w:pStyle w:val="ng-star-inserted1"/>
-        <w:shd w:val="clear" w:color="auto" w:fill="FFFFFF"/>
-        <w:spacing w:after="270" w:afterAutospacing="0" w:line="360" w:lineRule="auto"/>
-        <w:rPr>
-          <w:rStyle w:val="CaptionChar"/>
+        <w:rPr>
+          <w:i/>
+          <w:iCs/>
+          <w:color w:val="000000" w:themeColor="text1"/>
+          <w:sz w:val="26"/>
+          <w:szCs w:val="18"/>
         </w:rPr>
       </w:pPr>
       <w:r>
@@ -11097,15 +11363,16 @@
           <w:rStyle w:val="ng-star-inserted"/>
           <w:i/>
           <w:iCs/>
+          <w:noProof/>
           <w:color w:val="1B1B1E"/>
           <w:sz w:val="26"/>
           <w:szCs w:val="26"/>
         </w:rPr>
         <w:drawing>
-          <wp:inline distT="0" distB="0" distL="0" distR="0" wp14:anchorId="275CC52C" wp14:editId="79EF7A56">
+          <wp:inline distT="0" distB="0" distL="0" distR="0" wp14:anchorId="79A0764D" wp14:editId="1BE75D50">
             <wp:extent cx="5687069" cy="3619500"/>
             <wp:effectExtent l="0" t="0" r="8890" b="0"/>
-            <wp:docPr id="3" name="Picture 3"/>
+            <wp:docPr id="5" name="Picture 5"/>
             <wp:cNvGraphicFramePr>
               <a:graphicFrameLocks xmlns:a="http://schemas.openxmlformats.org/drawingml/2006/main" noChangeAspect="1"/>
             </wp:cNvGraphicFramePr>
@@ -11137,18 +11404,6 @@
           </wp:inline>
         </w:drawing>
       </w:r>
-    </w:p>
-    <w:p>
-      <w:pPr>
-        <w:pStyle w:val="ng-star-inserted1"/>
-        <w:shd w:val="clear" w:color="auto" w:fill="FFFFFF"/>
-        <w:spacing w:after="270" w:afterAutospacing="0" w:line="360" w:lineRule="auto"/>
-        <w:rPr>
-          <w:color w:val="1B1B1E"/>
-          <w:sz w:val="26"/>
-          <w:szCs w:val="26"/>
-        </w:rPr>
-      </w:pPr>
       <w:r>
         <w:rPr>
           <w:color w:val="1B1B1E"/>
@@ -11169,141 +11424,233 @@
         <w:spacing w:line="360" w:lineRule="auto"/>
         <w:rPr>
           <w:rFonts w:eastAsiaTheme="majorEastAsia"/>
-          <w:szCs w:val="26"/>
           <w:lang w:val="vi-VN"/>
         </w:rPr>
       </w:pPr>
     </w:p>
     <w:p>
       <w:pPr>
-        <w:pStyle w:val="Heading2"/>
+        <w:spacing w:line="360" w:lineRule="auto"/>
+        <w:rPr>
+          <w:rFonts w:eastAsiaTheme="majorEastAsia"/>
+          <w:lang w:val="vi-VN"/>
+        </w:rPr>
+      </w:pPr>
+    </w:p>
+    <w:p>
+      <w:pPr>
+        <w:spacing w:line="360" w:lineRule="auto"/>
+        <w:rPr>
+          <w:rFonts w:eastAsiaTheme="majorEastAsia"/>
+          <w:lang w:val="vi-VN"/>
+        </w:rPr>
+      </w:pPr>
+    </w:p>
+    <w:p>
+      <w:pPr>
+        <w:spacing w:line="360" w:lineRule="auto"/>
+        <w:rPr>
+          <w:rFonts w:eastAsiaTheme="majorEastAsia"/>
+          <w:lang w:val="vi-VN"/>
+        </w:rPr>
+      </w:pPr>
+    </w:p>
+    <w:p>
+      <w:pPr>
+        <w:spacing w:line="360" w:lineRule="auto"/>
+        <w:rPr>
+          <w:rFonts w:eastAsiaTheme="majorEastAsia"/>
+          <w:lang w:val="vi-VN"/>
+        </w:rPr>
+      </w:pPr>
+    </w:p>
+    <w:p>
+      <w:pPr>
+        <w:spacing w:line="360" w:lineRule="auto"/>
+        <w:rPr>
+          <w:rFonts w:eastAsiaTheme="majorEastAsia"/>
+          <w:lang w:val="vi-VN"/>
+        </w:rPr>
+      </w:pPr>
+    </w:p>
+    <w:p>
+      <w:pPr>
+        <w:spacing w:line="360" w:lineRule="auto"/>
+        <w:rPr>
+          <w:rFonts w:eastAsiaTheme="majorEastAsia"/>
+          <w:lang w:val="vi-VN"/>
+        </w:rPr>
+      </w:pPr>
+    </w:p>
+    <w:p>
+      <w:pPr>
+        <w:spacing w:line="360" w:lineRule="auto"/>
+        <w:rPr>
+          <w:rFonts w:eastAsiaTheme="majorEastAsia"/>
+          <w:lang w:val="vi-VN"/>
+        </w:rPr>
+      </w:pPr>
+    </w:p>
+    <w:p>
+      <w:pPr>
+        <w:spacing w:line="360" w:lineRule="auto"/>
+        <w:rPr>
+          <w:rFonts w:eastAsiaTheme="majorEastAsia"/>
+          <w:lang w:val="vi-VN"/>
+        </w:rPr>
+      </w:pPr>
+    </w:p>
+    <w:p>
+      <w:pPr>
+        <w:spacing w:line="360" w:lineRule="auto"/>
+        <w:rPr>
+          <w:rFonts w:eastAsiaTheme="majorEastAsia"/>
+          <w:lang w:val="vi-VN"/>
+        </w:rPr>
+      </w:pPr>
+    </w:p>
+    <w:p>
+      <w:pPr>
+        <w:spacing w:line="360" w:lineRule="auto"/>
+        <w:rPr>
+          <w:rFonts w:eastAsiaTheme="majorEastAsia"/>
+          <w:lang w:val="vi-VN"/>
+        </w:rPr>
+      </w:pPr>
+    </w:p>
+    <w:p>
+      <w:pPr>
+        <w:spacing w:line="360" w:lineRule="auto"/>
+        <w:rPr>
+          <w:rFonts w:eastAsiaTheme="majorEastAsia"/>
+          <w:lang w:val="vi-VN"/>
+        </w:rPr>
+      </w:pPr>
+    </w:p>
+    <w:p>
+      <w:pPr>
+        <w:pStyle w:val="Heading1"/>
         <w:numPr>
           <w:ilvl w:val="0"/>
           <w:numId w:val="0"/>
         </w:numPr>
         <w:spacing w:line="360" w:lineRule="auto"/>
-        <w:rPr>
-          <w:rFonts w:cs="Times New Roman"/>
-          <w:b w:val="0"/>
-          <w:color w:val="auto"/>
-          <w:lang w:val="vi-VN"/>
-        </w:rPr>
-      </w:pPr>
-      <w:bookmarkStart w:id="28" w:name="_Toc241184333"/>
-    </w:p>
-    <w:p>
-      <w:pPr>
-        <w:rPr>
-          <w:lang w:val="vi-VN"/>
-        </w:rPr>
-      </w:pPr>
-    </w:p>
-    <w:p>
-      <w:pPr>
-        <w:rPr>
-          <w:lang w:val="vi-VN"/>
-        </w:rPr>
-      </w:pPr>
-    </w:p>
-    <w:p>
-      <w:pPr>
-        <w:rPr>
-          <w:lang w:val="vi-VN"/>
-        </w:rPr>
-      </w:pPr>
-    </w:p>
-    <w:p>
-      <w:pPr>
-        <w:rPr>
-          <w:lang w:val="vi-VN"/>
-        </w:rPr>
-      </w:pPr>
-    </w:p>
-    <w:p>
-      <w:pPr>
-        <w:rPr>
-          <w:lang w:val="vi-VN"/>
-        </w:rPr>
-      </w:pPr>
-    </w:p>
-    <w:p>
-      <w:pPr>
-        <w:rPr>
-          <w:lang w:val="vi-VN"/>
-        </w:rPr>
-      </w:pPr>
-    </w:p>
-    <w:p>
-      <w:pPr>
-        <w:rPr>
-          <w:lang w:val="vi-VN"/>
-        </w:rPr>
-      </w:pPr>
-    </w:p>
-    <w:p>
-      <w:pPr>
-        <w:rPr>
-          <w:lang w:val="vi-VN"/>
-        </w:rPr>
-      </w:pPr>
-    </w:p>
-    <w:p>
-      <w:pPr>
-        <w:pStyle w:val="Heading2"/>
-        <w:spacing w:line="360" w:lineRule="auto"/>
-        <w:ind w:left="142"/>
-        <w:rPr>
-          <w:rFonts w:cs="Times New Roman"/>
-        </w:rPr>
-      </w:pPr>
-      <w:r>
+        <w:jc w:val="left"/>
         <w:rPr>
           <w:rStyle w:val="ng-star-inserted"/>
           <w:rFonts w:cs="Times New Roman"/>
           <w:color w:val="1B1B1E"/>
-        </w:rPr>
-        <w:lastRenderedPageBreak/>
-        <w:t>Bảng phân công công việc và Kết luận</w:t>
+          <w:sz w:val="32"/>
+        </w:rPr>
+      </w:pPr>
+    </w:p>
+    <w:p/>
+    <w:p/>
+    <w:p>
+      <w:pPr>
+        <w:pStyle w:val="Heading1"/>
+        <w:numPr>
+          <w:ilvl w:val="0"/>
+          <w:numId w:val="0"/>
+        </w:numPr>
+        <w:shd w:val="clear" w:color="auto" w:fill="FFFFFF"/>
+        <w:spacing w:before="0" w:after="0"/>
+        <w:ind w:left="-426"/>
+        <w:rPr>
+          <w:rStyle w:val="ng-star-inserted"/>
+          <w:rFonts w:cs="Times New Roman"/>
+          <w:color w:val="1B1B1E"/>
+        </w:rPr>
+      </w:pPr>
+    </w:p>
+    <w:p>
+      <w:pPr>
+        <w:pStyle w:val="Heading1"/>
+        <w:numPr>
+          <w:ilvl w:val="0"/>
+          <w:numId w:val="0"/>
+        </w:numPr>
+        <w:shd w:val="clear" w:color="auto" w:fill="FFFFFF"/>
+        <w:spacing w:before="0" w:after="0"/>
+        <w:ind w:left="-426"/>
+        <w:rPr>
+          <w:rStyle w:val="ng-star-inserted"/>
+          <w:rFonts w:cs="Times New Roman"/>
+          <w:color w:val="1B1B1E"/>
+        </w:rPr>
+      </w:pPr>
+      <w:bookmarkStart w:id="28" w:name="_Toc241234538"/>
+      <w:r>
+        <w:rPr>
+          <w:rStyle w:val="ng-star-inserted"/>
+          <w:rFonts w:cs="Times New Roman"/>
+          <w:color w:val="1B1B1E"/>
+        </w:rPr>
+        <w:t>PHỤ LỤ</w:t>
+      </w:r>
+      <w:r>
+        <w:rPr>
+          <w:rStyle w:val="ng-star-inserted"/>
+          <w:rFonts w:cs="Times New Roman"/>
+          <w:color w:val="1B1B1E"/>
+        </w:rPr>
+        <w:t>C</w:t>
       </w:r>
       <w:bookmarkEnd w:id="28"/>
     </w:p>
-    <w:p>
-      <w:pPr>
-        <w:pStyle w:val="ng-star-inserted1"/>
-        <w:shd w:val="clear" w:color="auto" w:fill="FFFFFF"/>
-        <w:spacing w:before="0" w:beforeAutospacing="0" w:after="105" w:afterAutospacing="0" w:line="360" w:lineRule="auto"/>
-        <w:ind w:left="360"/>
+    <w:p/>
+    <w:p>
+      <w:pPr>
+        <w:rPr>
+          <w:szCs w:val="26"/>
+        </w:rPr>
+      </w:pPr>
+    </w:p>
+    <w:p>
+      <w:pPr>
         <w:rPr>
           <w:rStyle w:val="ng-star-inserted"/>
-          <w:bCs/>
-          <w:color w:val="1B1B1E"/>
-          <w:sz w:val="26"/>
-          <w:szCs w:val="26"/>
+          <w:color w:val="1B1B1E"/>
+          <w:szCs w:val="26"/>
+          <w:lang w:val="vi-VN"/>
         </w:rPr>
       </w:pPr>
       <w:r>
         <w:rPr>
           <w:rStyle w:val="ng-star-inserted"/>
-          <w:bCs/>
-          <w:color w:val="1B1B1E"/>
-          <w:sz w:val="26"/>
-          <w:szCs w:val="26"/>
-        </w:rPr>
-        <w:t>Bảng phân công nhiệm vụ chi tiết của Nhóm 04:</w:t>
-      </w:r>
+          <w:color w:val="1B1B1E"/>
+          <w:szCs w:val="26"/>
+        </w:rPr>
+        <w:t xml:space="preserve"> BẢNG PHÂN CÔNG CÔNG VIỆC NHÓM 04</w:t>
+      </w:r>
+      <w:r>
+        <w:rPr>
+          <w:rStyle w:val="ng-star-inserted"/>
+          <w:color w:val="1B1B1E"/>
+          <w:szCs w:val="26"/>
+          <w:lang w:val="vi-VN"/>
+        </w:rPr>
+        <w:t xml:space="preserve"> :</w:t>
+      </w:r>
+    </w:p>
+    <w:p>
+      <w:pPr>
+        <w:rPr>
+          <w:lang w:val="vi-VN"/>
+        </w:rPr>
+      </w:pPr>
     </w:p>
     <w:tbl>
       <w:tblPr>
         <w:tblStyle w:val="TableGrid"/>
         <w:tblW w:w="0" w:type="auto"/>
-        <w:tblInd w:w="360" w:type="dxa"/>
         <w:tblLook w:val="04A0" w:firstRow="1" w:lastRow="0" w:firstColumn="1" w:lastColumn="0" w:noHBand="0" w:noVBand="1"/>
       </w:tblPr>
       <w:tblGrid>
         <w:gridCol w:w="708"/>
-        <w:gridCol w:w="1095"/>
-        <w:gridCol w:w="1256"/>
-        <w:gridCol w:w="4871"/>
+        <w:gridCol w:w="1125"/>
+        <w:gridCol w:w="1274"/>
+        <w:gridCol w:w="5183"/>
         <w:gridCol w:w="766"/>
       </w:tblGrid>
       <w:tr>
@@ -11315,12 +11662,9 @@
           </w:tcPr>
           <w:p>
             <w:pPr>
-              <w:pStyle w:val="ng-star-inserted1"/>
-              <w:spacing w:before="0" w:beforeAutospacing="0" w:after="105" w:afterAutospacing="0" w:line="360" w:lineRule="auto"/>
               <w:rPr>
-                <w:color w:val="1B1B1E"/>
-                <w:sz w:val="26"/>
                 <w:szCs w:val="26"/>
+                <w:lang w:val="vi-VN"/>
               </w:rPr>
             </w:pPr>
             <w:r>
@@ -11329,7 +11673,6 @@
                 <w:b/>
                 <w:bCs/>
                 <w:color w:val="1B1B1E"/>
-                <w:sz w:val="26"/>
                 <w:szCs w:val="26"/>
               </w:rPr>
               <w:t>STT</w:t>
@@ -11338,18 +11681,15 @@
         </w:tc>
         <w:tc>
           <w:tcPr>
-            <w:tcW w:w="1095" w:type="dxa"/>
+            <w:tcW w:w="1130" w:type="dxa"/>
             <w:shd w:val="clear" w:color="auto" w:fill="8EAADB" w:themeFill="accent1" w:themeFillTint="99"/>
             <w:vAlign w:val="center"/>
           </w:tcPr>
           <w:p>
             <w:pPr>
-              <w:pStyle w:val="ng-star-inserted1"/>
-              <w:spacing w:before="0" w:beforeAutospacing="0" w:after="105" w:afterAutospacing="0" w:line="360" w:lineRule="auto"/>
               <w:rPr>
-                <w:color w:val="1B1B1E"/>
-                <w:sz w:val="26"/>
                 <w:szCs w:val="26"/>
+                <w:lang w:val="vi-VN"/>
               </w:rPr>
             </w:pPr>
             <w:r>
@@ -11358,7 +11698,6 @@
                 <w:b/>
                 <w:bCs/>
                 <w:color w:val="1B1B1E"/>
-                <w:sz w:val="26"/>
                 <w:szCs w:val="26"/>
               </w:rPr>
               <w:t>Họ và tên</w:t>
@@ -11367,18 +11706,15 @@
         </w:tc>
         <w:tc>
           <w:tcPr>
-            <w:tcW w:w="1256" w:type="dxa"/>
+            <w:tcW w:w="1276" w:type="dxa"/>
             <w:shd w:val="clear" w:color="auto" w:fill="8EAADB" w:themeFill="accent1" w:themeFillTint="99"/>
             <w:vAlign w:val="center"/>
           </w:tcPr>
           <w:p>
             <w:pPr>
-              <w:pStyle w:val="ng-star-inserted1"/>
-              <w:spacing w:before="0" w:beforeAutospacing="0" w:after="105" w:afterAutospacing="0" w:line="360" w:lineRule="auto"/>
               <w:rPr>
-                <w:color w:val="1B1B1E"/>
-                <w:sz w:val="26"/>
                 <w:szCs w:val="26"/>
+                <w:lang w:val="vi-VN"/>
               </w:rPr>
             </w:pPr>
             <w:r>
@@ -11387,7 +11723,6 @@
                 <w:b/>
                 <w:bCs/>
                 <w:color w:val="1B1B1E"/>
-                <w:sz w:val="26"/>
                 <w:szCs w:val="26"/>
               </w:rPr>
               <w:t>Mã sinh viên (MSSV)</w:t>
@@ -11396,18 +11731,15 @@
         </w:tc>
         <w:tc>
           <w:tcPr>
-            <w:tcW w:w="5081" w:type="dxa"/>
+            <w:tcW w:w="5670" w:type="dxa"/>
             <w:shd w:val="clear" w:color="auto" w:fill="8EAADB" w:themeFill="accent1" w:themeFillTint="99"/>
             <w:vAlign w:val="center"/>
           </w:tcPr>
           <w:p>
             <w:pPr>
-              <w:pStyle w:val="ng-star-inserted1"/>
-              <w:spacing w:before="0" w:beforeAutospacing="0" w:after="105" w:afterAutospacing="0" w:line="360" w:lineRule="auto"/>
               <w:rPr>
-                <w:color w:val="1B1B1E"/>
-                <w:sz w:val="26"/>
                 <w:szCs w:val="26"/>
+                <w:lang w:val="vi-VN"/>
               </w:rPr>
             </w:pPr>
             <w:r>
@@ -11416,7 +11748,6 @@
                 <w:b/>
                 <w:bCs/>
                 <w:color w:val="1B1B1E"/>
-                <w:sz w:val="26"/>
                 <w:szCs w:val="26"/>
               </w:rPr>
               <w:t>Phần việc đảm nhận chính</w:t>
@@ -11425,18 +11756,15 @@
         </w:tc>
         <w:tc>
           <w:tcPr>
-            <w:tcW w:w="556" w:type="dxa"/>
+            <w:tcW w:w="272" w:type="dxa"/>
             <w:shd w:val="clear" w:color="auto" w:fill="8EAADB" w:themeFill="accent1" w:themeFillTint="99"/>
             <w:vAlign w:val="center"/>
           </w:tcPr>
           <w:p>
             <w:pPr>
-              <w:pStyle w:val="ng-star-inserted1"/>
-              <w:spacing w:before="0" w:beforeAutospacing="0" w:after="105" w:afterAutospacing="0" w:line="360" w:lineRule="auto"/>
               <w:rPr>
-                <w:color w:val="1B1B1E"/>
-                <w:sz w:val="26"/>
                 <w:szCs w:val="26"/>
+                <w:lang w:val="vi-VN"/>
               </w:rPr>
             </w:pPr>
             <w:r>
@@ -11445,7 +11773,6 @@
                 <w:b/>
                 <w:bCs/>
                 <w:color w:val="1B1B1E"/>
-                <w:sz w:val="26"/>
                 <w:szCs w:val="26"/>
               </w:rPr>
               <w:t>Tỷ lệ đóng góp</w:t>
@@ -11461,12 +11788,9 @@
           </w:tcPr>
           <w:p>
             <w:pPr>
-              <w:pStyle w:val="ng-star-inserted1"/>
-              <w:spacing w:before="0" w:beforeAutospacing="0" w:after="105" w:afterAutospacing="0" w:line="360" w:lineRule="auto"/>
               <w:rPr>
-                <w:color w:val="1B1B1E"/>
-                <w:sz w:val="26"/>
                 <w:szCs w:val="26"/>
+                <w:lang w:val="vi-VN"/>
               </w:rPr>
             </w:pPr>
             <w:r>
@@ -11475,7 +11799,6 @@
                 <w:b/>
                 <w:bCs/>
                 <w:color w:val="1B1B1E"/>
-                <w:sz w:val="26"/>
                 <w:szCs w:val="26"/>
               </w:rPr>
               <w:t>1</w:t>
@@ -11484,17 +11807,14 @@
         </w:tc>
         <w:tc>
           <w:tcPr>
-            <w:tcW w:w="1095" w:type="dxa"/>
+            <w:tcW w:w="1130" w:type="dxa"/>
             <w:vAlign w:val="center"/>
           </w:tcPr>
           <w:p>
             <w:pPr>
-              <w:pStyle w:val="ng-star-inserted1"/>
-              <w:spacing w:before="0" w:beforeAutospacing="0" w:after="105" w:afterAutospacing="0" w:line="360" w:lineRule="auto"/>
               <w:rPr>
-                <w:color w:val="1B1B1E"/>
-                <w:sz w:val="26"/>
                 <w:szCs w:val="26"/>
+                <w:lang w:val="vi-VN"/>
               </w:rPr>
             </w:pPr>
             <w:r>
@@ -11503,7 +11823,6 @@
                 <w:b/>
                 <w:bCs/>
                 <w:color w:val="1B1B1E"/>
-                <w:sz w:val="26"/>
                 <w:szCs w:val="26"/>
               </w:rPr>
               <w:t>Đào Hậu Phương</w:t>
@@ -11512,7 +11831,6 @@
               <w:rPr>
                 <w:rStyle w:val="ng-star-inserted"/>
                 <w:color w:val="1B1B1E"/>
-                <w:sz w:val="26"/>
                 <w:szCs w:val="26"/>
               </w:rPr>
               <w:t xml:space="preserve"> </w:t>
@@ -11521,24 +11839,20 @@
         </w:tc>
         <w:tc>
           <w:tcPr>
-            <w:tcW w:w="1256" w:type="dxa"/>
+            <w:tcW w:w="1276" w:type="dxa"/>
             <w:vAlign w:val="center"/>
           </w:tcPr>
           <w:p>
             <w:pPr>
-              <w:pStyle w:val="ng-star-inserted1"/>
-              <w:spacing w:before="0" w:beforeAutospacing="0" w:after="105" w:afterAutospacing="0" w:line="360" w:lineRule="auto"/>
               <w:rPr>
-                <w:color w:val="1B1B1E"/>
-                <w:sz w:val="26"/>
                 <w:szCs w:val="26"/>
+                <w:lang w:val="vi-VN"/>
               </w:rPr>
             </w:pPr>
             <w:r>
               <w:rPr>
                 <w:rStyle w:val="inline-code"/>
                 <w:color w:val="2B2D31"/>
-                <w:sz w:val="26"/>
                 <w:szCs w:val="26"/>
                 <w:bdr w:val="none" w:sz="0" w:space="0" w:color="auto" w:frame="1"/>
               </w:rPr>
@@ -11548,69 +11862,48 @@
         </w:tc>
         <w:tc>
           <w:tcPr>
-            <w:tcW w:w="5081" w:type="dxa"/>
+            <w:tcW w:w="5670" w:type="dxa"/>
             <w:vAlign w:val="center"/>
           </w:tcPr>
           <w:p>
             <w:pPr>
-              <w:pStyle w:val="ng-star-inserted1"/>
-              <w:spacing w:before="0" w:beforeAutospacing="0" w:after="105" w:afterAutospacing="0" w:line="360" w:lineRule="auto"/>
+              <w:spacing w:line="276" w:lineRule="auto"/>
               <w:rPr>
                 <w:rStyle w:val="ng-star-inserted"/>
                 <w:color w:val="1B1B1E"/>
-                <w:sz w:val="26"/>
                 <w:szCs w:val="26"/>
-                <w:shd w:val="clear" w:color="auto" w:fill="FFFFFF"/>
               </w:rPr>
             </w:pPr>
             <w:r>
               <w:rPr>
                 <w:rStyle w:val="ng-star-inserted"/>
                 <w:color w:val="1B1B1E"/>
-                <w:sz w:val="26"/>
                 <w:szCs w:val="26"/>
-                <w:shd w:val="clear" w:color="auto" w:fill="FFFFFF"/>
               </w:rPr>
-              <w:t xml:space="preserve">- </w:t>
-            </w:r>
-            <w:r>
-              <w:rPr>
-                <w:rStyle w:val="ng-star-inserted"/>
-                <w:color w:val="1B1B1E"/>
-                <w:sz w:val="26"/>
-                <w:szCs w:val="26"/>
-                <w:shd w:val="clear" w:color="auto" w:fill="FFFFFF"/>
-              </w:rPr>
-              <w:t>Phân tích khám phá dữ liệu (EDA) và trực quan hóa biểu đồ.</w:t>
+              <w:t>- Khảo sát cấu trúc dữ liệu và thực hiện phân tích khám phá (EDA) 5 biểu đồ trực quan.</w:t>
             </w:r>
           </w:p>
           <w:p>
             <w:pPr>
-              <w:pStyle w:val="ng-star-inserted1"/>
-              <w:spacing w:before="0" w:beforeAutospacing="0" w:after="105" w:afterAutospacing="0" w:line="360" w:lineRule="auto"/>
+              <w:spacing w:line="276" w:lineRule="auto"/>
               <w:rPr>
                 <w:rStyle w:val="ng-star-inserted"/>
                 <w:color w:val="1B1B1E"/>
-                <w:sz w:val="26"/>
                 <w:szCs w:val="26"/>
-                <w:shd w:val="clear" w:color="auto" w:fill="FFFFFF"/>
               </w:rPr>
             </w:pPr>
             <w:r>
               <w:rPr>
                 <w:rStyle w:val="ng-star-inserted"/>
                 <w:color w:val="1B1B1E"/>
-                <w:sz w:val="26"/>
                 <w:szCs w:val="26"/>
-                <w:shd w:val="clear" w:color="auto" w:fill="FFFFFF"/>
               </w:rPr>
-              <w:t xml:space="preserve">- Phát triển Backend Gateway (FastAPI, Logging </w:t>
+              <w:t xml:space="preserve">- Lập trình tầng trung gian Backend Gateway (FastAPI, Validate schema, Logging </w:t>
             </w:r>
             <w:r>
               <w:rPr>
                 <w:rStyle w:val="inline-code"/>
                 <w:color w:val="2B2D31"/>
-                <w:sz w:val="26"/>
                 <w:szCs w:val="26"/>
                 <w:bdr w:val="none" w:sz="0" w:space="0" w:color="auto" w:frame="1"/>
               </w:rPr>
@@ -11620,48 +11913,39 @@
               <w:rPr>
                 <w:rStyle w:val="ng-star-inserted"/>
                 <w:color w:val="1B1B1E"/>
-                <w:sz w:val="26"/>
                 <w:szCs w:val="26"/>
-                <w:shd w:val="clear" w:color="auto" w:fill="FFFFFF"/>
               </w:rPr>
               <w:t>).</w:t>
             </w:r>
           </w:p>
           <w:p>
             <w:pPr>
-              <w:pStyle w:val="ng-star-inserted1"/>
-              <w:spacing w:before="0" w:beforeAutospacing="0" w:after="105" w:afterAutospacing="0" w:line="360" w:lineRule="auto"/>
+              <w:spacing w:line="276" w:lineRule="auto"/>
               <w:rPr>
-                <w:color w:val="1B1B1E"/>
-                <w:sz w:val="26"/>
                 <w:szCs w:val="26"/>
+                <w:lang w:val="vi-VN"/>
               </w:rPr>
             </w:pPr>
             <w:r>
               <w:rPr>
                 <w:rStyle w:val="ng-star-inserted"/>
                 <w:color w:val="1B1B1E"/>
-                <w:sz w:val="26"/>
                 <w:szCs w:val="26"/>
-                <w:shd w:val="clear" w:color="auto" w:fill="FFFFFF"/>
               </w:rPr>
-              <w:t>- Cấu hình môi trường và triển khai Public Ngrok.</w:t>
+              <w:t>- Cấu hình bảo mật biến môi trường và thiết lập Triển khai Public Ngrok Static Domain.</w:t>
             </w:r>
           </w:p>
         </w:tc>
         <w:tc>
           <w:tcPr>
-            <w:tcW w:w="556" w:type="dxa"/>
+            <w:tcW w:w="272" w:type="dxa"/>
             <w:vAlign w:val="center"/>
           </w:tcPr>
           <w:p>
             <w:pPr>
-              <w:pStyle w:val="ng-star-inserted1"/>
-              <w:spacing w:before="0" w:beforeAutospacing="0" w:after="105" w:afterAutospacing="0" w:line="360" w:lineRule="auto"/>
               <w:rPr>
-                <w:color w:val="1B1B1E"/>
-                <w:sz w:val="26"/>
                 <w:szCs w:val="26"/>
+                <w:lang w:val="vi-VN"/>
               </w:rPr>
             </w:pPr>
             <w:r>
@@ -11670,7 +11954,6 @@
                 <w:b/>
                 <w:bCs/>
                 <w:color w:val="1B1B1E"/>
-                <w:sz w:val="26"/>
                 <w:szCs w:val="26"/>
               </w:rPr>
               <w:t>50%</w:t>
@@ -11686,12 +11969,9 @@
           </w:tcPr>
           <w:p>
             <w:pPr>
-              <w:pStyle w:val="ng-star-inserted1"/>
-              <w:spacing w:before="0" w:beforeAutospacing="0" w:after="105" w:afterAutospacing="0" w:line="360" w:lineRule="auto"/>
               <w:rPr>
-                <w:color w:val="1B1B1E"/>
-                <w:sz w:val="26"/>
                 <w:szCs w:val="26"/>
+                <w:lang w:val="vi-VN"/>
               </w:rPr>
             </w:pPr>
             <w:r>
@@ -11700,7 +11980,6 @@
                 <w:b/>
                 <w:bCs/>
                 <w:color w:val="1B1B1E"/>
-                <w:sz w:val="26"/>
                 <w:szCs w:val="26"/>
               </w:rPr>
               <w:t>2</w:t>
@@ -11709,17 +11988,14 @@
         </w:tc>
         <w:tc>
           <w:tcPr>
-            <w:tcW w:w="1095" w:type="dxa"/>
+            <w:tcW w:w="1130" w:type="dxa"/>
             <w:vAlign w:val="center"/>
           </w:tcPr>
           <w:p>
             <w:pPr>
-              <w:pStyle w:val="ng-star-inserted1"/>
-              <w:spacing w:before="0" w:beforeAutospacing="0" w:after="105" w:afterAutospacing="0" w:line="360" w:lineRule="auto"/>
               <w:rPr>
-                <w:color w:val="1B1B1E"/>
-                <w:sz w:val="26"/>
                 <w:szCs w:val="26"/>
+                <w:lang w:val="vi-VN"/>
               </w:rPr>
             </w:pPr>
             <w:r>
@@ -11728,7 +12004,6 @@
                 <w:b/>
                 <w:bCs/>
                 <w:color w:val="1B1B1E"/>
-                <w:sz w:val="26"/>
                 <w:szCs w:val="26"/>
               </w:rPr>
               <w:t>Nguyễn Quang Huy</w:t>
@@ -11737,24 +12012,20 @@
         </w:tc>
         <w:tc>
           <w:tcPr>
-            <w:tcW w:w="1256" w:type="dxa"/>
+            <w:tcW w:w="1276" w:type="dxa"/>
             <w:vAlign w:val="center"/>
           </w:tcPr>
           <w:p>
             <w:pPr>
-              <w:pStyle w:val="ng-star-inserted1"/>
-              <w:spacing w:before="0" w:beforeAutospacing="0" w:after="105" w:afterAutospacing="0" w:line="360" w:lineRule="auto"/>
               <w:rPr>
-                <w:color w:val="1B1B1E"/>
-                <w:sz w:val="26"/>
                 <w:szCs w:val="26"/>
+                <w:lang w:val="vi-VN"/>
               </w:rPr>
             </w:pPr>
             <w:r>
               <w:rPr>
                 <w:rStyle w:val="inline-code"/>
                 <w:color w:val="2B2D31"/>
-                <w:sz w:val="26"/>
                 <w:szCs w:val="26"/>
                 <w:bdr w:val="none" w:sz="0" w:space="0" w:color="auto" w:frame="1"/>
               </w:rPr>
@@ -11764,62 +12035,15 @@
         </w:tc>
         <w:tc>
           <w:tcPr>
-            <w:tcW w:w="5081" w:type="dxa"/>
+            <w:tcW w:w="5670" w:type="dxa"/>
             <w:vAlign w:val="center"/>
           </w:tcPr>
           <w:p>
             <w:pPr>
-              <w:pStyle w:val="ng-star-inserted1"/>
-              <w:spacing w:before="0" w:beforeAutospacing="0" w:after="105" w:afterAutospacing="0" w:line="360" w:lineRule="auto"/>
+              <w:spacing w:line="276" w:lineRule="auto"/>
               <w:rPr>
                 <w:rStyle w:val="ng-star-inserted"/>
                 <w:color w:val="1B1B1E"/>
-                <w:sz w:val="26"/>
-                <w:szCs w:val="26"/>
-                <w:shd w:val="clear" w:color="auto" w:fill="FFFFFF"/>
-              </w:rPr>
-            </w:pPr>
-            <w:r>
-              <w:rPr>
-                <w:rStyle w:val="ng-star-inserted"/>
-                <w:color w:val="1B1B1E"/>
-                <w:sz w:val="26"/>
-                <w:szCs w:val="26"/>
-                <w:shd w:val="clear" w:color="auto" w:fill="FFFFFF"/>
-              </w:rPr>
-              <w:t>- Huấn luyện và đánh giá 4 mô hình hồi quy.</w:t>
-            </w:r>
-          </w:p>
-          <w:p>
-            <w:pPr>
-              <w:pStyle w:val="ng-star-inserted1"/>
-              <w:spacing w:before="0" w:beforeAutospacing="0" w:after="105" w:afterAutospacing="0" w:line="360" w:lineRule="auto"/>
-              <w:rPr>
-                <w:rStyle w:val="ng-star-inserted"/>
-                <w:color w:val="1B1B1E"/>
-                <w:sz w:val="26"/>
-                <w:szCs w:val="26"/>
-                <w:shd w:val="clear" w:color="auto" w:fill="FFFFFF"/>
-              </w:rPr>
-            </w:pPr>
-            <w:r>
-              <w:rPr>
-                <w:rStyle w:val="ng-star-inserted"/>
-                <w:color w:val="1B1B1E"/>
-                <w:sz w:val="26"/>
-                <w:szCs w:val="26"/>
-                <w:shd w:val="clear" w:color="auto" w:fill="FFFFFF"/>
-              </w:rPr>
-              <w:t>- Thiết kế giao diện người dùng Frontend (UI).</w:t>
-            </w:r>
-          </w:p>
-          <w:p>
-            <w:pPr>
-              <w:pStyle w:val="ng-star-inserted1"/>
-              <w:spacing w:before="0" w:beforeAutospacing="0" w:after="105" w:afterAutospacing="0" w:line="360" w:lineRule="auto"/>
-              <w:rPr>
-                <w:color w:val="1B1B1E"/>
-                <w:sz w:val="26"/>
                 <w:szCs w:val="26"/>
               </w:rPr>
             </w:pPr>
@@ -11827,27 +12051,74 @@
               <w:rPr>
                 <w:rStyle w:val="ng-star-inserted"/>
                 <w:color w:val="1B1B1E"/>
-                <w:sz w:val="26"/>
                 <w:szCs w:val="26"/>
-                <w:shd w:val="clear" w:color="auto" w:fill="FFFFFF"/>
               </w:rPr>
-              <w:t>- Xây dựng kiến trúc hệ thống Docker &amp; AI Service.</w:t>
+              <w:t>- Lập trình huấn luyện, tinh chỉnh và so sánh hiệu năng 4 mô hình hồi quy trên Colab.</w:t>
+            </w:r>
+          </w:p>
+          <w:p>
+            <w:pPr>
+              <w:spacing w:line="276" w:lineRule="auto"/>
+              <w:rPr>
+                <w:rStyle w:val="ng-star-inserted"/>
+                <w:color w:val="1B1B1E"/>
+                <w:szCs w:val="26"/>
+              </w:rPr>
+            </w:pPr>
+            <w:r>
+              <w:rPr>
+                <w:rStyle w:val="ng-star-inserted"/>
+                <w:color w:val="1B1B1E"/>
+                <w:szCs w:val="26"/>
+              </w:rPr>
+              <w:t>- Thiết kế và phát triển giao diện người dùng Frontend (HTML/CSS, Menu Dropdown).</w:t>
+            </w:r>
+          </w:p>
+          <w:p>
+            <w:pPr>
+              <w:spacing w:line="276" w:lineRule="auto"/>
+              <w:rPr>
+                <w:szCs w:val="26"/>
+                <w:lang w:val="vi-VN"/>
+              </w:rPr>
+            </w:pPr>
+            <w:r>
+              <w:rPr>
+                <w:rStyle w:val="ng-star-inserted"/>
+                <w:color w:val="1B1B1E"/>
+                <w:szCs w:val="26"/>
+              </w:rPr>
+              <w:t xml:space="preserve">- Xây dựng kiến trúc hệ thống, cấu hình Dockerfile, AI Service và </w:t>
+            </w:r>
+            <w:r>
+              <w:rPr>
+                <w:rStyle w:val="inline-code"/>
+                <w:color w:val="2B2D31"/>
+                <w:szCs w:val="26"/>
+                <w:bdr w:val="none" w:sz="0" w:space="0" w:color="auto" w:frame="1"/>
+              </w:rPr>
+              <w:t>docker-compose.yml</w:t>
+            </w:r>
+            <w:r>
+              <w:rPr>
+                <w:rStyle w:val="ng-star-inserted"/>
+                <w:color w:val="1B1B1E"/>
+                <w:szCs w:val="26"/>
+              </w:rPr>
+              <w:t>.</w:t>
             </w:r>
           </w:p>
         </w:tc>
         <w:tc>
           <w:tcPr>
-            <w:tcW w:w="556" w:type="dxa"/>
+            <w:tcW w:w="272" w:type="dxa"/>
             <w:vAlign w:val="center"/>
           </w:tcPr>
           <w:p>
             <w:pPr>
-              <w:pStyle w:val="ng-star-inserted1"/>
-              <w:spacing w:before="0" w:beforeAutospacing="0" w:after="105" w:afterAutospacing="0" w:line="360" w:lineRule="auto"/>
               <w:rPr>
-                <w:color w:val="1B1B1E"/>
-                <w:sz w:val="26"/>
                 <w:szCs w:val="26"/>
+                <w:lang w:val="vi-VN"/>
               </w:rPr>
             </w:pPr>
             <w:r>
@@ -11856,7 +12127,6 @@
                 <w:b/>
                 <w:bCs/>
                 <w:color w:val="1B1B1E"/>
-                <w:sz w:val="26"/>
                 <w:szCs w:val="26"/>
               </w:rPr>
               <w:t>50%</w:t>
@@ -11865,90 +12135,78 @@
         </w:tc>
       </w:tr>
     </w:tbl>
+    <w:p/>
     <w:p>
       <w:pPr>
         <w:pStyle w:val="Bang"/>
-        <w:rPr>
-          <w:rFonts w:eastAsiaTheme="majorEastAsia"/>
-        </w:rPr>
-      </w:pPr>
-    </w:p>
-    <w:p>
-      <w:pPr>
-        <w:pStyle w:val="Bang"/>
-        <w:rPr>
-          <w:rFonts w:eastAsiaTheme="majorEastAsia"/>
-        </w:rPr>
-      </w:pPr>
-      <w:bookmarkStart w:id="29" w:name="_Toc241186035"/>
-      <w:r>
-        <w:rPr>
-          <w:rFonts w:eastAsiaTheme="majorEastAsia"/>
-        </w:rPr>
-        <w:t xml:space="preserve">Bảng 2: </w:t>
-      </w:r>
-      <w:r>
-        <w:rPr>
-          <w:rStyle w:val="ng-star-inserted"/>
-        </w:rPr>
-        <w:t>Bảng phân công nhiệm vụ chi tiết</w:t>
-      </w:r>
-      <w:bookmarkEnd w:id="29"/>
-    </w:p>
-    <w:p>
-      <w:pPr>
-        <w:spacing w:line="360" w:lineRule="auto"/>
         <w:rPr>
           <w:rFonts w:eastAsiaTheme="majorEastAsia"/>
           <w:lang w:val="vi-VN"/>
         </w:rPr>
       </w:pPr>
-    </w:p>
-    <w:p>
-      <w:pPr>
-        <w:spacing w:line="360" w:lineRule="auto"/>
+      <w:bookmarkStart w:id="29" w:name="_Toc241234542"/>
+      <w:r>
         <w:rPr>
           <w:rFonts w:eastAsiaTheme="majorEastAsia"/>
           <w:lang w:val="vi-VN"/>
         </w:rPr>
-      </w:pPr>
-    </w:p>
-    <w:p>
-      <w:pPr>
-        <w:spacing w:line="360" w:lineRule="auto"/>
+        <w:t>Bả</w:t>
+      </w:r>
+      <w:r>
         <w:rPr>
           <w:rFonts w:eastAsiaTheme="majorEastAsia"/>
           <w:lang w:val="vi-VN"/>
         </w:rPr>
-      </w:pPr>
-    </w:p>
-    <w:p>
-      <w:pPr>
-        <w:spacing w:line="360" w:lineRule="auto"/>
+        <w:t>ng 2</w:t>
+      </w:r>
+      <w:r>
         <w:rPr>
           <w:rFonts w:eastAsiaTheme="majorEastAsia"/>
           <w:lang w:val="vi-VN"/>
         </w:rPr>
-      </w:pPr>
-    </w:p>
-    <w:p>
-      <w:pPr>
-        <w:pStyle w:val="Heading1"/>
-        <w:numPr>
-          <w:ilvl w:val="0"/>
-          <w:numId w:val="0"/>
-        </w:numPr>
-        <w:spacing w:line="360" w:lineRule="auto"/>
-        <w:jc w:val="left"/>
-        <w:rPr>
-          <w:rStyle w:val="ng-star-inserted"/>
-          <w:rFonts w:cs="Times New Roman"/>
-          <w:color w:val="1B1B1E"/>
-          <w:sz w:val="32"/>
-        </w:rPr>
-      </w:pPr>
-      <w:bookmarkStart w:id="30" w:name="_Toc241184334"/>
-    </w:p>
+        <w:t xml:space="preserve">: </w:t>
+      </w:r>
+      <w:r>
+        <w:rPr>
+          <w:shd w:val="clear" w:color="auto" w:fill="FFFFFF"/>
+        </w:rPr>
+        <w:t xml:space="preserve">Bảng </w:t>
+      </w:r>
+      <w:r>
+        <w:rPr>
+          <w:shd w:val="clear" w:color="auto" w:fill="FFFFFF"/>
+          <w:lang w:val="vi-VN"/>
+        </w:rPr>
+        <w:t>phân công việc nhóm</w:t>
+      </w:r>
+      <w:bookmarkEnd w:id="29"/>
+      <w:r>
+        <w:rPr>
+          <w:shd w:val="clear" w:color="auto" w:fill="FFFFFF"/>
+          <w:lang w:val="vi-VN"/>
+        </w:rPr>
+        <w:t xml:space="preserve"> </w:t>
+      </w:r>
+    </w:p>
+    <w:p/>
+    <w:p/>
+    <w:p/>
+    <w:p/>
+    <w:p/>
+    <w:p/>
+    <w:p/>
+    <w:p/>
+    <w:p/>
+    <w:p/>
+    <w:p/>
+    <w:p/>
+    <w:p/>
+    <w:p/>
+    <w:p/>
+    <w:p/>
+    <w:p/>
+    <w:p/>
+    <w:p/>
     <w:p>
       <w:pPr>
         <w:pStyle w:val="Heading1"/>
@@ -11963,6 +12221,7 @@
           <w:sz w:val="32"/>
         </w:rPr>
       </w:pPr>
+      <w:bookmarkStart w:id="30" w:name="_Toc241234539"/>
       <w:r>
         <w:rPr>
           <w:rStyle w:val="ng-star-inserted"/>
@@ -11970,6 +12229,7 @@
           <w:color w:val="1B1B1E"/>
           <w:sz w:val="32"/>
         </w:rPr>
+        <w:lastRenderedPageBreak/>
         <w:t>KẾT LUẬN</w:t>
       </w:r>
       <w:bookmarkEnd w:id="30"/>
@@ -11978,16 +12238,8 @@
       <w:pPr>
         <w:pStyle w:val="ng-star-inserted1"/>
         <w:shd w:val="clear" w:color="auto" w:fill="FFFFFF"/>
-        <w:spacing w:after="270" w:afterAutospacing="0" w:line="360" w:lineRule="auto"/>
-        <w:rPr>
-          <w:b/>
-          <w:bCs/>
-          <w:color w:val="1B1B1E"/>
-          <w:sz w:val="26"/>
-          <w:szCs w:val="26"/>
-        </w:rPr>
-      </w:pPr>
-      <w:r>
+        <w:spacing w:after="270" w:afterAutospacing="0" w:line="276" w:lineRule="auto"/>
+        <w:jc w:val="both"/>
         <w:rPr>
           <w:rStyle w:val="ng-star-inserted"/>
           <w:b/>
@@ -11996,8 +12248,33 @@
           <w:sz w:val="26"/>
           <w:szCs w:val="26"/>
         </w:rPr>
+      </w:pPr>
+      <w:r>
+        <w:rPr>
+          <w:rStyle w:val="ng-star-inserted"/>
+          <w:b/>
+          <w:bCs/>
+          <w:color w:val="1B1B1E"/>
+          <w:sz w:val="26"/>
+          <w:szCs w:val="26"/>
+        </w:rPr>
         <w:t>Kết quả đạt được:</w:t>
       </w:r>
+    </w:p>
+    <w:p>
+      <w:pPr>
+        <w:pStyle w:val="ng-star-inserted1"/>
+        <w:shd w:val="clear" w:color="auto" w:fill="FFFFFF"/>
+        <w:spacing w:after="270" w:afterAutospacing="0" w:line="276" w:lineRule="auto"/>
+        <w:jc w:val="both"/>
+        <w:rPr>
+          <w:b/>
+          <w:bCs/>
+          <w:color w:val="1B1B1E"/>
+          <w:sz w:val="26"/>
+          <w:szCs w:val="26"/>
+        </w:rPr>
+      </w:pPr>
       <w:r>
         <w:rPr>
           <w:color w:val="1B1B1E"/>
@@ -12093,16 +12370,8 @@
       <w:pPr>
         <w:pStyle w:val="ng-star-inserted1"/>
         <w:shd w:val="clear" w:color="auto" w:fill="FFFFFF"/>
-        <w:spacing w:after="270" w:afterAutospacing="0" w:line="360" w:lineRule="auto"/>
-        <w:rPr>
-          <w:b/>
-          <w:bCs/>
-          <w:color w:val="1B1B1E"/>
-          <w:sz w:val="26"/>
-          <w:szCs w:val="26"/>
-        </w:rPr>
-      </w:pPr>
-      <w:r>
+        <w:spacing w:after="270" w:afterAutospacing="0" w:line="276" w:lineRule="auto"/>
+        <w:jc w:val="both"/>
         <w:rPr>
           <w:rStyle w:val="ng-star-inserted"/>
           <w:b/>
@@ -12111,38 +12380,6 @@
           <w:sz w:val="26"/>
           <w:szCs w:val="26"/>
         </w:rPr>
-        <w:t>Hạn chế của đề tài:</w:t>
-      </w:r>
-      <w:r>
-        <w:rPr>
-          <w:color w:val="1B1B1E"/>
-          <w:sz w:val="26"/>
-          <w:szCs w:val="26"/>
-        </w:rPr>
-        <w:br/>
-      </w:r>
-      <w:r>
-        <w:rPr>
-          <w:rStyle w:val="ng-star-inserted"/>
-          <w:color w:val="1B1B1E"/>
-          <w:sz w:val="26"/>
-          <w:szCs w:val="26"/>
-        </w:rPr>
-        <w:t>Tập dữ liệu huấn luyện còn giới hạn (200 mẫu thực nghiệm), chưa phản ánh đầy đủ quy mô lớn và sự biến động phức tạp của thị trường thực tế. Ứng dụng hiện tại mới chỉ tập trung vào 3 kênh quảng cáo truyền thống (TV, Radio, Newspaper), chưa tích hợp dữ liệu từ các nền tảng Digital Marketing hiện đại (Facebook Ads, Google Ads). Hệ thống log hiện tại ghi nhận trên console Docker, chưa có giao diện Dashboard trực quan để theo dõi lịch sử truy vấn của người dùng.</w:t>
-      </w:r>
-    </w:p>
-    <w:p>
-      <w:pPr>
-        <w:pStyle w:val="ng-star-inserted1"/>
-        <w:shd w:val="clear" w:color="auto" w:fill="FFFFFF"/>
-        <w:spacing w:after="270" w:afterAutospacing="0" w:line="360" w:lineRule="auto"/>
-        <w:rPr>
-          <w:b/>
-          <w:bCs/>
-          <w:color w:val="1B1B1E"/>
-          <w:sz w:val="26"/>
-          <w:szCs w:val="26"/>
-        </w:rPr>
       </w:pPr>
       <w:r>
         <w:rPr>
@@ -12153,8 +12390,82 @@
           <w:sz w:val="26"/>
           <w:szCs w:val="26"/>
         </w:rPr>
+        <w:t>Hạn chế của đề tài:</w:t>
+      </w:r>
+    </w:p>
+    <w:p>
+      <w:pPr>
+        <w:pStyle w:val="ng-star-inserted1"/>
+        <w:shd w:val="clear" w:color="auto" w:fill="FFFFFF"/>
+        <w:spacing w:after="270" w:afterAutospacing="0" w:line="276" w:lineRule="auto"/>
+        <w:jc w:val="both"/>
+        <w:rPr>
+          <w:b/>
+          <w:bCs/>
+          <w:color w:val="1B1B1E"/>
+          <w:sz w:val="26"/>
+          <w:szCs w:val="26"/>
+        </w:rPr>
+      </w:pPr>
+      <w:r>
+        <w:rPr>
+          <w:color w:val="1B1B1E"/>
+          <w:sz w:val="26"/>
+          <w:szCs w:val="26"/>
+        </w:rPr>
+        <w:br/>
+      </w:r>
+      <w:r>
+        <w:rPr>
+          <w:rStyle w:val="ng-star-inserted"/>
+          <w:color w:val="1B1B1E"/>
+          <w:sz w:val="26"/>
+          <w:szCs w:val="26"/>
+        </w:rPr>
+        <w:t>Tập dữ liệu huấn luyện còn giới hạn (200 mẫu thực nghiệm), chưa phản ánh đầy đủ quy mô lớn và sự biến động phức tạp của thị trường thực tế. Ứng dụng hiện tại mới chỉ tập trung vào 3 kênh quảng cáo truyền thống (TV, Radio, Newspaper), chưa tích hợp dữ liệu từ các nền tảng Digital Marketing hiện đại (Facebook Ads, Google Ads). Hệ thống log hiện tại ghi nhận trên console Docker, chưa có giao diện Dashboard trực quan để theo dõi lịch sử truy vấn của người dùng.</w:t>
+      </w:r>
+    </w:p>
+    <w:p>
+      <w:pPr>
+        <w:pStyle w:val="ng-star-inserted1"/>
+        <w:shd w:val="clear" w:color="auto" w:fill="FFFFFF"/>
+        <w:spacing w:after="270" w:afterAutospacing="0" w:line="276" w:lineRule="auto"/>
+        <w:jc w:val="both"/>
+        <w:rPr>
+          <w:rStyle w:val="ng-star-inserted"/>
+          <w:b/>
+          <w:bCs/>
+          <w:color w:val="1B1B1E"/>
+          <w:sz w:val="26"/>
+          <w:szCs w:val="26"/>
+        </w:rPr>
+      </w:pPr>
+      <w:r>
+        <w:rPr>
+          <w:rStyle w:val="ng-star-inserted"/>
+          <w:b/>
+          <w:bCs/>
+          <w:color w:val="1B1B1E"/>
+          <w:sz w:val="26"/>
+          <w:szCs w:val="26"/>
+        </w:rPr>
         <w:t>Hướng phát triển:</w:t>
       </w:r>
+    </w:p>
+    <w:p>
+      <w:pPr>
+        <w:pStyle w:val="ng-star-inserted1"/>
+        <w:shd w:val="clear" w:color="auto" w:fill="FFFFFF"/>
+        <w:spacing w:after="270" w:afterAutospacing="0" w:line="276" w:lineRule="auto"/>
+        <w:jc w:val="both"/>
+        <w:rPr>
+          <w:b/>
+          <w:bCs/>
+          <w:color w:val="1B1B1E"/>
+          <w:sz w:val="26"/>
+          <w:szCs w:val="26"/>
+        </w:rPr>
+      </w:pPr>
       <w:r>
         <w:rPr>
           <w:color w:val="1B1B1E"/>
@@ -12176,6 +12487,7 @@
     <w:p>
       <w:pPr>
         <w:spacing w:line="360" w:lineRule="auto"/>
+        <w:jc w:val="both"/>
       </w:pPr>
     </w:p>
     <w:p>
@@ -12188,7 +12500,7 @@
         </w:rPr>
       </w:pPr>
       <w:bookmarkStart w:id="31" w:name="_Toc231420461"/>
-      <w:bookmarkStart w:id="32" w:name="_Toc241184335"/>
+      <w:bookmarkStart w:id="32" w:name="_Toc241234540"/>
       <w:r>
         <w:rPr>
           <w:sz w:val="26"/>
@@ -12863,7 +13175,7 @@
             </wp:anchor>
           </w:drawing>
         </mc:Choice>
-        <mc:Fallback xmlns:cx1="http://schemas.microsoft.com/office/drawing/2015/9/8/chartex" xmlns:cx2="http://schemas.microsoft.com/office/drawing/2015/10/21/chartex" xmlns:cx3="http://schemas.microsoft.com/office/drawing/2016/5/9/chartex" xmlns:cx4="http://schemas.microsoft.com/office/drawing/2016/5/10/chartex" xmlns:cx5="http://schemas.microsoft.com/office/drawing/2016/5/11/chartex" xmlns:cx6="http://schemas.microsoft.com/office/drawing/2016/5/12/chartex" xmlns:cx7="http://schemas.microsoft.com/office/drawing/2016/5/13/chartex" xmlns:cx8="http://schemas.microsoft.com/office/drawing/2016/5/14/chartex" xmlns:aink="http://schemas.microsoft.com/office/drawing/2016/ink" xmlns:am3d="http://schemas.microsoft.com/office/drawing/2017/model3d" xmlns:w16cex="http://schemas.microsoft.com/office/word/2018/wordml/cex" xmlns:w16cid="http://schemas.microsoft.com/office/word/2016/wordml/cid" xmlns:w16="http://schemas.microsoft.com/office/word/2018/wordml" xmlns:w16sdtdh="http://schemas.microsoft.com/office/word/2020/wordml/sdtdatahash" xmlns:oel="http://schemas.microsoft.com/office/2019/extlst" xmlns:w16du="http://schemas.microsoft.com/office/word/2023/wordml/word16du" xmlns:w16sdtfl="http://schemas.microsoft.com/office/word/2024/wordml/sdtformatlock">
+        <mc:Fallback xmlns:w16sdtfl="http://schemas.microsoft.com/office/word/2024/wordml/sdtformatlock" xmlns:w16du="http://schemas.microsoft.com/office/word/2023/wordml/word16du" xmlns:oel="http://schemas.microsoft.com/office/2019/extlst" xmlns:w16sdtdh="http://schemas.microsoft.com/office/word/2020/wordml/sdtdatahash" xmlns:w16="http://schemas.microsoft.com/office/word/2018/wordml" xmlns:w16cid="http://schemas.microsoft.com/office/word/2016/wordml/cid" xmlns:w16cex="http://schemas.microsoft.com/office/word/2018/wordml/cex" xmlns:am3d="http://schemas.microsoft.com/office/drawing/2017/model3d" xmlns:aink="http://schemas.microsoft.com/office/drawing/2016/ink" xmlns:cx8="http://schemas.microsoft.com/office/drawing/2016/5/14/chartex" xmlns:cx7="http://schemas.microsoft.com/office/drawing/2016/5/13/chartex" xmlns:cx6="http://schemas.microsoft.com/office/drawing/2016/5/12/chartex" xmlns:cx5="http://schemas.microsoft.com/office/drawing/2016/5/11/chartex" xmlns:cx4="http://schemas.microsoft.com/office/drawing/2016/5/10/chartex" xmlns:cx3="http://schemas.microsoft.com/office/drawing/2016/5/9/chartex" xmlns:cx2="http://schemas.microsoft.com/office/drawing/2015/10/21/chartex" xmlns:cx1="http://schemas.microsoft.com/office/drawing/2015/9/8/chartex">
           <w:pict>
             <v:line w14:anchorId="14DA849D" id="Straight Connector 4" o:spid="_x0000_s1026" style="position:absolute;z-index:251661312;visibility:visible;mso-wrap-style:square;mso-wrap-distance-left:9pt;mso-wrap-distance-top:0;mso-wrap-distance-right:9pt;mso-wrap-distance-bottom:0;mso-position-horizontal:absolute;mso-position-horizontal-relative:text;mso-position-vertical:absolute;mso-position-vertical-relative:text" from=".95pt,19.9pt" to="448.3pt,19.9pt" o:gfxdata="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" strokecolor="black [3200]" strokeweight=".5pt">
               <v:stroke joinstyle="miter"/>
@@ -12962,7 +13274,7 @@
             </wp:anchor>
           </w:drawing>
         </mc:Choice>
-        <mc:Fallback xmlns:cx1="http://schemas.microsoft.com/office/drawing/2015/9/8/chartex" xmlns:cx2="http://schemas.microsoft.com/office/drawing/2015/10/21/chartex" xmlns:cx3="http://schemas.microsoft.com/office/drawing/2016/5/9/chartex" xmlns:cx4="http://schemas.microsoft.com/office/drawing/2016/5/10/chartex" xmlns:cx5="http://schemas.microsoft.com/office/drawing/2016/5/11/chartex" xmlns:cx6="http://schemas.microsoft.com/office/drawing/2016/5/12/chartex" xmlns:cx7="http://schemas.microsoft.com/office/drawing/2016/5/13/chartex" xmlns:cx8="http://schemas.microsoft.com/office/drawing/2016/5/14/chartex" xmlns:aink="http://schemas.microsoft.com/office/drawing/2016/ink" xmlns:am3d="http://schemas.microsoft.com/office/drawing/2017/model3d" xmlns:w16cex="http://schemas.microsoft.com/office/word/2018/wordml/cex" xmlns:w16cid="http://schemas.microsoft.com/office/word/2016/wordml/cid" xmlns:w16="http://schemas.microsoft.com/office/word/2018/wordml" xmlns:w16sdtdh="http://schemas.microsoft.com/office/word/2020/wordml/sdtdatahash" xmlns:oel="http://schemas.microsoft.com/office/2019/extlst" xmlns:w16du="http://schemas.microsoft.com/office/word/2023/wordml/word16du" xmlns:w16sdtfl="http://schemas.microsoft.com/office/word/2024/wordml/sdtformatlock">
+        <mc:Fallback xmlns:w16sdtfl="http://schemas.microsoft.com/office/word/2024/wordml/sdtformatlock" xmlns:w16du="http://schemas.microsoft.com/office/word/2023/wordml/word16du" xmlns:oel="http://schemas.microsoft.com/office/2019/extlst" xmlns:w16sdtdh="http://schemas.microsoft.com/office/word/2020/wordml/sdtdatahash" xmlns:w16="http://schemas.microsoft.com/office/word/2018/wordml" xmlns:w16cid="http://schemas.microsoft.com/office/word/2016/wordml/cid" xmlns:w16cex="http://schemas.microsoft.com/office/word/2018/wordml/cex" xmlns:am3d="http://schemas.microsoft.com/office/drawing/2017/model3d" xmlns:aink="http://schemas.microsoft.com/office/drawing/2016/ink" xmlns:cx8="http://schemas.microsoft.com/office/drawing/2016/5/14/chartex" xmlns:cx7="http://schemas.microsoft.com/office/drawing/2016/5/13/chartex" xmlns:cx6="http://schemas.microsoft.com/office/drawing/2016/5/12/chartex" xmlns:cx5="http://schemas.microsoft.com/office/drawing/2016/5/11/chartex" xmlns:cx4="http://schemas.microsoft.com/office/drawing/2016/5/10/chartex" xmlns:cx3="http://schemas.microsoft.com/office/drawing/2016/5/9/chartex" xmlns:cx2="http://schemas.microsoft.com/office/drawing/2015/10/21/chartex" xmlns:cx1="http://schemas.microsoft.com/office/drawing/2015/9/8/chartex">
           <w:pict>
             <v:line w14:anchorId="4888ABD6" id="Straight Connector 17" o:spid="_x0000_s1026" style="position:absolute;z-index:251663360;visibility:visible;mso-wrap-style:square;mso-wrap-distance-left:9pt;mso-wrap-distance-top:0;mso-wrap-distance-right:9pt;mso-wrap-distance-bottom:0;mso-position-horizontal:absolute;mso-position-horizontal-relative:text;mso-position-vertical:absolute;mso-position-vertical-relative:text" from=".95pt,19.9pt" to="448.3pt,19.9pt" o:gfxdata="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" strokecolor="black [3200]" strokeweight=".5pt">
               <v:stroke joinstyle="miter"/>
@@ -14838,6 +15150,155 @@
     </w:lvl>
   </w:abstractNum>
   <w:abstractNum w:abstractNumId="15" w15:restartNumberingAfterBreak="0">
+    <w:nsid w:val="2E2B5C81"/>
+    <w:multiLevelType w:val="multilevel"/>
+    <w:tmpl w:val="1CBCC4EE"/>
+    <w:lvl w:ilvl="0">
+      <w:start w:val="1"/>
+      <w:numFmt w:val="bullet"/>
+      <w:lvlText w:val=""/>
+      <w:lvlJc w:val="left"/>
+      <w:pPr>
+        <w:tabs>
+          <w:tab w:val="num" w:pos="720"/>
+        </w:tabs>
+        <w:ind w:left="720" w:hanging="360"/>
+      </w:pPr>
+      <w:rPr>
+        <w:rFonts w:ascii="Symbol" w:hAnsi="Symbol" w:hint="default"/>
+        <w:sz w:val="20"/>
+      </w:rPr>
+    </w:lvl>
+    <w:lvl w:ilvl="1" w:tentative="1">
+      <w:start w:val="1"/>
+      <w:numFmt w:val="bullet"/>
+      <w:lvlText w:val="o"/>
+      <w:lvlJc w:val="left"/>
+      <w:pPr>
+        <w:tabs>
+          <w:tab w:val="num" w:pos="1440"/>
+        </w:tabs>
+        <w:ind w:left="1440" w:hanging="360"/>
+      </w:pPr>
+      <w:rPr>
+        <w:rFonts w:ascii="Courier New" w:hAnsi="Courier New" w:hint="default"/>
+        <w:sz w:val="20"/>
+      </w:rPr>
+    </w:lvl>
+    <w:lvl w:ilvl="2" w:tentative="1">
+      <w:start w:val="1"/>
+      <w:numFmt w:val="bullet"/>
+      <w:lvlText w:val=""/>
+      <w:lvlJc w:val="left"/>
+      <w:pPr>
+        <w:tabs>
+          <w:tab w:val="num" w:pos="2160"/>
+        </w:tabs>
+        <w:ind w:left="2160" w:hanging="360"/>
+      </w:pPr>
+      <w:rPr>
+        <w:rFonts w:ascii="Wingdings" w:hAnsi="Wingdings" w:hint="default"/>
+        <w:sz w:val="20"/>
+      </w:rPr>
+    </w:lvl>
+    <w:lvl w:ilvl="3" w:tentative="1">
+      <w:start w:val="1"/>
+      <w:numFmt w:val="bullet"/>
+      <w:lvlText w:val=""/>
+      <w:lvlJc w:val="left"/>
+      <w:pPr>
+        <w:tabs>
+          <w:tab w:val="num" w:pos="2880"/>
+        </w:tabs>
+        <w:ind w:left="2880" w:hanging="360"/>
+      </w:pPr>
+      <w:rPr>
+        <w:rFonts w:ascii="Wingdings" w:hAnsi="Wingdings" w:hint="default"/>
+        <w:sz w:val="20"/>
+      </w:rPr>
+    </w:lvl>
+    <w:lvl w:ilvl="4" w:tentative="1">
+      <w:start w:val="1"/>
+      <w:numFmt w:val="bullet"/>
+      <w:lvlText w:val=""/>
+      <w:lvlJc w:val="left"/>
+      <w:pPr>
+        <w:tabs>
+          <w:tab w:val="num" w:pos="3600"/>
+        </w:tabs>
+        <w:ind w:left="3600" w:hanging="360"/>
+      </w:pPr>
+      <w:rPr>
+        <w:rFonts w:ascii="Wingdings" w:hAnsi="Wingdings" w:hint="default"/>
+        <w:sz w:val="20"/>
+      </w:rPr>
+    </w:lvl>
+    <w:lvl w:ilvl="5" w:tentative="1">
+      <w:start w:val="1"/>
+      <w:numFmt w:val="bullet"/>
+      <w:lvlText w:val=""/>
+      <w:lvlJc w:val="left"/>
+      <w:pPr>
+        <w:tabs>
+          <w:tab w:val="num" w:pos="4320"/>
+        </w:tabs>
+        <w:ind w:left="4320" w:hanging="360"/>
+      </w:pPr>
+      <w:rPr>
+        <w:rFonts w:ascii="Wingdings" w:hAnsi="Wingdings" w:hint="default"/>
+        <w:sz w:val="20"/>
+      </w:rPr>
+    </w:lvl>
+    <w:lvl w:ilvl="6" w:tentative="1">
+      <w:start w:val="1"/>
+      <w:numFmt w:val="bullet"/>
+      <w:lvlText w:val=""/>
+      <w:lvlJc w:val="left"/>
+      <w:pPr>
+        <w:tabs>
+          <w:tab w:val="num" w:pos="5040"/>
+        </w:tabs>
+        <w:ind w:left="5040" w:hanging="360"/>
+      </w:pPr>
+      <w:rPr>
+        <w:rFonts w:ascii="Wingdings" w:hAnsi="Wingdings" w:hint="default"/>
+        <w:sz w:val="20"/>
+      </w:rPr>
+    </w:lvl>
+    <w:lvl w:ilvl="7" w:tentative="1">
+      <w:start w:val="1"/>
+      <w:numFmt w:val="bullet"/>
+      <w:lvlText w:val=""/>
+      <w:lvlJc w:val="left"/>
+      <w:pPr>
+        <w:tabs>
+          <w:tab w:val="num" w:pos="5760"/>
+        </w:tabs>
+        <w:ind w:left="5760" w:hanging="360"/>
+      </w:pPr>
+      <w:rPr>
+        <w:rFonts w:ascii="Wingdings" w:hAnsi="Wingdings" w:hint="default"/>
+        <w:sz w:val="20"/>
+      </w:rPr>
+    </w:lvl>
+    <w:lvl w:ilvl="8" w:tentative="1">
+      <w:start w:val="1"/>
+      <w:numFmt w:val="bullet"/>
+      <w:lvlText w:val=""/>
+      <w:lvlJc w:val="left"/>
+      <w:pPr>
+        <w:tabs>
+          <w:tab w:val="num" w:pos="6480"/>
+        </w:tabs>
+        <w:ind w:left="6480" w:hanging="360"/>
+      </w:pPr>
+      <w:rPr>
+        <w:rFonts w:ascii="Wingdings" w:hAnsi="Wingdings" w:hint="default"/>
+        <w:sz w:val="20"/>
+      </w:rPr>
+    </w:lvl>
+  </w:abstractNum>
+  <w:abstractNum w:abstractNumId="16" w15:restartNumberingAfterBreak="0">
     <w:nsid w:val="3A20257F"/>
     <w:multiLevelType w:val="multilevel"/>
     <w:tmpl w:val="47D65C7A"/>
@@ -14986,7 +15447,7 @@
       </w:rPr>
     </w:lvl>
   </w:abstractNum>
-  <w:abstractNum w:abstractNumId="16" w15:restartNumberingAfterBreak="0">
+  <w:abstractNum w:abstractNumId="17" w15:restartNumberingAfterBreak="0">
     <w:nsid w:val="3AC83EC7"/>
     <w:multiLevelType w:val="hybridMultilevel"/>
     <w:tmpl w:val="9CA4CBD6"/>
@@ -15072,7 +15533,7 @@
       </w:pPr>
     </w:lvl>
   </w:abstractNum>
-  <w:abstractNum w:abstractNumId="17" w15:restartNumberingAfterBreak="0">
+  <w:abstractNum w:abstractNumId="18" w15:restartNumberingAfterBreak="0">
     <w:nsid w:val="3DD84AF8"/>
     <w:multiLevelType w:val="hybridMultilevel"/>
     <w:tmpl w:val="BD2AA9D2"/>
@@ -15185,7 +15646,7 @@
       </w:rPr>
     </w:lvl>
   </w:abstractNum>
-  <w:abstractNum w:abstractNumId="18" w15:restartNumberingAfterBreak="0">
+  <w:abstractNum w:abstractNumId="19" w15:restartNumberingAfterBreak="0">
     <w:nsid w:val="3EE80A66"/>
     <w:multiLevelType w:val="hybridMultilevel"/>
     <w:tmpl w:val="3018589A"/>
@@ -15298,7 +15759,7 @@
       </w:rPr>
     </w:lvl>
   </w:abstractNum>
-  <w:abstractNum w:abstractNumId="19" w15:restartNumberingAfterBreak="0">
+  <w:abstractNum w:abstractNumId="20" w15:restartNumberingAfterBreak="0">
     <w:nsid w:val="3F915FE6"/>
     <w:multiLevelType w:val="hybridMultilevel"/>
     <w:tmpl w:val="A5C295A2"/>
@@ -15411,7 +15872,7 @@
       </w:rPr>
     </w:lvl>
   </w:abstractNum>
-  <w:abstractNum w:abstractNumId="20" w15:restartNumberingAfterBreak="0">
+  <w:abstractNum w:abstractNumId="21" w15:restartNumberingAfterBreak="0">
     <w:nsid w:val="41761F63"/>
     <w:multiLevelType w:val="multilevel"/>
     <w:tmpl w:val="9BE6594E"/>
@@ -15560,7 +16021,7 @@
       </w:rPr>
     </w:lvl>
   </w:abstractNum>
-  <w:abstractNum w:abstractNumId="21" w15:restartNumberingAfterBreak="0">
+  <w:abstractNum w:abstractNumId="22" w15:restartNumberingAfterBreak="0">
     <w:nsid w:val="42DB1C22"/>
     <w:multiLevelType w:val="hybridMultilevel"/>
     <w:tmpl w:val="E7CCFE38"/>
@@ -15673,7 +16134,7 @@
       </w:rPr>
     </w:lvl>
   </w:abstractNum>
-  <w:abstractNum w:abstractNumId="22" w15:restartNumberingAfterBreak="0">
+  <w:abstractNum w:abstractNumId="23" w15:restartNumberingAfterBreak="0">
     <w:nsid w:val="42E5037A"/>
     <w:multiLevelType w:val="hybridMultilevel"/>
     <w:tmpl w:val="E03E4AAA"/>
@@ -15759,7 +16220,120 @@
       </w:pPr>
     </w:lvl>
   </w:abstractNum>
-  <w:abstractNum w:abstractNumId="23" w15:restartNumberingAfterBreak="0">
+  <w:abstractNum w:abstractNumId="24" w15:restartNumberingAfterBreak="0">
+    <w:nsid w:val="4306041F"/>
+    <w:multiLevelType w:val="multilevel"/>
+    <w:tmpl w:val="8DDA832A"/>
+    <w:lvl w:ilvl="0">
+      <w:start w:val="1"/>
+      <w:numFmt w:val="decimal"/>
+      <w:lvlText w:val="%1."/>
+      <w:lvlJc w:val="left"/>
+      <w:pPr>
+        <w:tabs>
+          <w:tab w:val="num" w:pos="720"/>
+        </w:tabs>
+        <w:ind w:left="720" w:hanging="360"/>
+      </w:pPr>
+    </w:lvl>
+    <w:lvl w:ilvl="1" w:tentative="1">
+      <w:start w:val="1"/>
+      <w:numFmt w:val="decimal"/>
+      <w:lvlText w:val="%2."/>
+      <w:lvlJc w:val="left"/>
+      <w:pPr>
+        <w:tabs>
+          <w:tab w:val="num" w:pos="1440"/>
+        </w:tabs>
+        <w:ind w:left="1440" w:hanging="360"/>
+      </w:pPr>
+    </w:lvl>
+    <w:lvl w:ilvl="2" w:tentative="1">
+      <w:start w:val="1"/>
+      <w:numFmt w:val="decimal"/>
+      <w:lvlText w:val="%3."/>
+      <w:lvlJc w:val="left"/>
+      <w:pPr>
+        <w:tabs>
+          <w:tab w:val="num" w:pos="2160"/>
+        </w:tabs>
+        <w:ind w:left="2160" w:hanging="360"/>
+      </w:pPr>
+    </w:lvl>
+    <w:lvl w:ilvl="3" w:tentative="1">
+      <w:start w:val="1"/>
+      <w:numFmt w:val="decimal"/>
+      <w:lvlText w:val="%4."/>
+      <w:lvlJc w:val="left"/>
+      <w:pPr>
+        <w:tabs>
+          <w:tab w:val="num" w:pos="2880"/>
+        </w:tabs>
+        <w:ind w:left="2880" w:hanging="360"/>
+      </w:pPr>
+    </w:lvl>
+    <w:lvl w:ilvl="4" w:tentative="1">
+      <w:start w:val="1"/>
+      <w:numFmt w:val="decimal"/>
+      <w:lvlText w:val="%5."/>
+      <w:lvlJc w:val="left"/>
+      <w:pPr>
+        <w:tabs>
+          <w:tab w:val="num" w:pos="3600"/>
+        </w:tabs>
+        <w:ind w:left="3600" w:hanging="360"/>
+      </w:pPr>
+    </w:lvl>
+    <w:lvl w:ilvl="5" w:tentative="1">
+      <w:start w:val="1"/>
+      <w:numFmt w:val="decimal"/>
+      <w:lvlText w:val="%6."/>
+      <w:lvlJc w:val="left"/>
+      <w:pPr>
+        <w:tabs>
+          <w:tab w:val="num" w:pos="4320"/>
+        </w:tabs>
+        <w:ind w:left="4320" w:hanging="360"/>
+      </w:pPr>
+    </w:lvl>
+    <w:lvl w:ilvl="6" w:tentative="1">
+      <w:start w:val="1"/>
+      <w:numFmt w:val="decimal"/>
+      <w:lvlText w:val="%7."/>
+      <w:lvlJc w:val="left"/>
+      <w:pPr>
+        <w:tabs>
+          <w:tab w:val="num" w:pos="5040"/>
+        </w:tabs>
+        <w:ind w:left="5040" w:hanging="360"/>
+      </w:pPr>
+    </w:lvl>
+    <w:lvl w:ilvl="7" w:tentative="1">
+      <w:start w:val="1"/>
+      <w:numFmt w:val="decimal"/>
+      <w:lvlText w:val="%8."/>
+      <w:lvlJc w:val="left"/>
+      <w:pPr>
+        <w:tabs>
+          <w:tab w:val="num" w:pos="5760"/>
+        </w:tabs>
+        <w:ind w:left="5760" w:hanging="360"/>
+      </w:pPr>
+    </w:lvl>
+    <w:lvl w:ilvl="8" w:tentative="1">
+      <w:start w:val="1"/>
+      <w:numFmt w:val="decimal"/>
+      <w:lvlText w:val="%9."/>
+      <w:lvlJc w:val="left"/>
+      <w:pPr>
+        <w:tabs>
+          <w:tab w:val="num" w:pos="6480"/>
+        </w:tabs>
+        <w:ind w:left="6480" w:hanging="360"/>
+      </w:pPr>
+    </w:lvl>
+  </w:abstractNum>
+  <w:abstractNum w:abstractNumId="25" w15:restartNumberingAfterBreak="0">
     <w:nsid w:val="437C263B"/>
     <w:multiLevelType w:val="multilevel"/>
     <w:tmpl w:val="994EABF8"/>
@@ -15908,7 +16482,7 @@
       </w:rPr>
     </w:lvl>
   </w:abstractNum>
-  <w:abstractNum w:abstractNumId="24" w15:restartNumberingAfterBreak="0">
+  <w:abstractNum w:abstractNumId="26" w15:restartNumberingAfterBreak="0">
     <w:nsid w:val="44DF57B5"/>
     <w:multiLevelType w:val="multilevel"/>
     <w:tmpl w:val="E5601588"/>
@@ -16057,7 +16631,7 @@
       </w:rPr>
     </w:lvl>
   </w:abstractNum>
-  <w:abstractNum w:abstractNumId="25" w15:restartNumberingAfterBreak="0">
+  <w:abstractNum w:abstractNumId="27" w15:restartNumberingAfterBreak="0">
     <w:nsid w:val="48802281"/>
     <w:multiLevelType w:val="multilevel"/>
     <w:tmpl w:val="AC9E9990"/>
@@ -16206,7 +16780,7 @@
       </w:rPr>
     </w:lvl>
   </w:abstractNum>
-  <w:abstractNum w:abstractNumId="26" w15:restartNumberingAfterBreak="0">
+  <w:abstractNum w:abstractNumId="28" w15:restartNumberingAfterBreak="0">
     <w:nsid w:val="4F5775E0"/>
     <w:multiLevelType w:val="multilevel"/>
     <w:tmpl w:val="AA8C712C"/>
@@ -16355,7 +16929,7 @@
       </w:rPr>
     </w:lvl>
   </w:abstractNum>
-  <w:abstractNum w:abstractNumId="27" w15:restartNumberingAfterBreak="0">
+  <w:abstractNum w:abstractNumId="29" w15:restartNumberingAfterBreak="0">
     <w:nsid w:val="51F85E8A"/>
     <w:multiLevelType w:val="multilevel"/>
     <w:tmpl w:val="20D4CF5A"/>
@@ -16504,7 +17078,7 @@
       </w:rPr>
     </w:lvl>
   </w:abstractNum>
-  <w:abstractNum w:abstractNumId="28" w15:restartNumberingAfterBreak="0">
+  <w:abstractNum w:abstractNumId="30" w15:restartNumberingAfterBreak="0">
     <w:nsid w:val="53262291"/>
     <w:multiLevelType w:val="hybridMultilevel"/>
     <w:tmpl w:val="B3122B76"/>
@@ -16617,7 +17191,7 @@
       </w:rPr>
     </w:lvl>
   </w:abstractNum>
-  <w:abstractNum w:abstractNumId="29" w15:restartNumberingAfterBreak="0">
+  <w:abstractNum w:abstractNumId="31" w15:restartNumberingAfterBreak="0">
     <w:nsid w:val="53552CCE"/>
     <w:multiLevelType w:val="multilevel"/>
     <w:tmpl w:val="E88850FC"/>
@@ -16745,7 +17319,7 @@
       </w:rPr>
     </w:lvl>
   </w:abstractNum>
-  <w:abstractNum w:abstractNumId="30" w15:restartNumberingAfterBreak="0">
+  <w:abstractNum w:abstractNumId="32" w15:restartNumberingAfterBreak="0">
     <w:nsid w:val="55ED250F"/>
     <w:multiLevelType w:val="multilevel"/>
     <w:tmpl w:val="10666A98"/>
@@ -16895,7 +17469,7 @@
       </w:rPr>
     </w:lvl>
   </w:abstractNum>
-  <w:abstractNum w:abstractNumId="31" w15:restartNumberingAfterBreak="0">
+  <w:abstractNum w:abstractNumId="33" w15:restartNumberingAfterBreak="0">
     <w:nsid w:val="5BE938A6"/>
     <w:multiLevelType w:val="hybridMultilevel"/>
     <w:tmpl w:val="FB86D18A"/>
@@ -17008,7 +17582,7 @@
       </w:rPr>
     </w:lvl>
   </w:abstractNum>
-  <w:abstractNum w:abstractNumId="32" w15:restartNumberingAfterBreak="0">
+  <w:abstractNum w:abstractNumId="34" w15:restartNumberingAfterBreak="0">
     <w:nsid w:val="60710EC3"/>
     <w:multiLevelType w:val="multilevel"/>
     <w:tmpl w:val="AB22ADBE"/>
@@ -17124,7 +17698,7 @@
       </w:pPr>
     </w:lvl>
   </w:abstractNum>
-  <w:abstractNum w:abstractNumId="33" w15:restartNumberingAfterBreak="0">
+  <w:abstractNum w:abstractNumId="35" w15:restartNumberingAfterBreak="0">
     <w:nsid w:val="658D0BF4"/>
     <w:multiLevelType w:val="hybridMultilevel"/>
     <w:tmpl w:val="96A8323C"/>
@@ -17237,7 +17811,7 @@
       </w:rPr>
     </w:lvl>
   </w:abstractNum>
-  <w:abstractNum w:abstractNumId="34" w15:restartNumberingAfterBreak="0">
+  <w:abstractNum w:abstractNumId="36" w15:restartNumberingAfterBreak="0">
     <w:nsid w:val="6636760B"/>
     <w:multiLevelType w:val="hybridMultilevel"/>
     <w:tmpl w:val="0BC4A2AC"/>
@@ -17326,7 +17900,7 @@
       </w:pPr>
     </w:lvl>
   </w:abstractNum>
-  <w:abstractNum w:abstractNumId="35" w15:restartNumberingAfterBreak="0">
+  <w:abstractNum w:abstractNumId="37" w15:restartNumberingAfterBreak="0">
     <w:nsid w:val="6A9356CB"/>
     <w:multiLevelType w:val="hybridMultilevel"/>
     <w:tmpl w:val="C1C647B6"/>
@@ -17439,7 +18013,7 @@
       </w:rPr>
     </w:lvl>
   </w:abstractNum>
-  <w:abstractNum w:abstractNumId="36" w15:restartNumberingAfterBreak="0">
+  <w:abstractNum w:abstractNumId="38" w15:restartNumberingAfterBreak="0">
     <w:nsid w:val="703D2395"/>
     <w:multiLevelType w:val="multilevel"/>
     <w:tmpl w:val="81309B48"/>
@@ -17588,7 +18162,7 @@
       </w:rPr>
     </w:lvl>
   </w:abstractNum>
-  <w:abstractNum w:abstractNumId="37" w15:restartNumberingAfterBreak="0">
+  <w:abstractNum w:abstractNumId="39" w15:restartNumberingAfterBreak="0">
     <w:nsid w:val="73BA03DD"/>
     <w:multiLevelType w:val="multilevel"/>
     <w:tmpl w:val="15B874E6"/>
@@ -17738,7 +18312,7 @@
       </w:rPr>
     </w:lvl>
   </w:abstractNum>
-  <w:abstractNum w:abstractNumId="38" w15:restartNumberingAfterBreak="0">
+  <w:abstractNum w:abstractNumId="40" w15:restartNumberingAfterBreak="0">
     <w:nsid w:val="77927CA7"/>
     <w:multiLevelType w:val="multilevel"/>
     <w:tmpl w:val="E140F2D6"/>
@@ -17888,7 +18462,7 @@
       </w:rPr>
     </w:lvl>
   </w:abstractNum>
-  <w:abstractNum w:abstractNumId="39" w15:restartNumberingAfterBreak="0">
+  <w:abstractNum w:abstractNumId="41" w15:restartNumberingAfterBreak="0">
     <w:nsid w:val="7EBE233E"/>
     <w:multiLevelType w:val="multilevel"/>
     <w:tmpl w:val="5A807614"/>
@@ -18038,19 +18612,19 @@
     </w:lvl>
   </w:abstractNum>
   <w:num w:numId="1">
-    <w:abstractNumId w:val="29"/>
+    <w:abstractNumId w:val="31"/>
   </w:num>
   <w:num w:numId="2">
-    <w:abstractNumId w:val="34"/>
+    <w:abstractNumId w:val="36"/>
   </w:num>
   <w:num w:numId="3">
-    <w:abstractNumId w:val="16"/>
+    <w:abstractNumId w:val="17"/>
   </w:num>
   <w:num w:numId="4">
-    <w:abstractNumId w:val="17"/>
+    <w:abstractNumId w:val="18"/>
   </w:num>
   <w:num w:numId="5">
-    <w:abstractNumId w:val="22"/>
+    <w:abstractNumId w:val="23"/>
   </w:num>
   <w:num w:numId="6">
     <w:abstractNumId w:val="0"/>
@@ -18059,10 +18633,10 @@
     <w:abstractNumId w:val="5"/>
   </w:num>
   <w:num w:numId="8">
-    <w:abstractNumId w:val="35"/>
+    <w:abstractNumId w:val="37"/>
   </w:num>
   <w:num w:numId="9">
-    <w:abstractNumId w:val="18"/>
+    <w:abstractNumId w:val="19"/>
   </w:num>
   <w:num w:numId="10">
     <w:abstractNumId w:val="11"/>
@@ -18071,16 +18645,16 @@
     <w:abstractNumId w:val="7"/>
   </w:num>
   <w:num w:numId="12">
-    <w:abstractNumId w:val="19"/>
+    <w:abstractNumId w:val="20"/>
   </w:num>
   <w:num w:numId="13">
-    <w:abstractNumId w:val="37"/>
+    <w:abstractNumId w:val="39"/>
   </w:num>
   <w:num w:numId="14">
-    <w:abstractNumId w:val="38"/>
+    <w:abstractNumId w:val="40"/>
   </w:num>
   <w:num w:numId="15">
-    <w:abstractNumId w:val="30"/>
+    <w:abstractNumId w:val="32"/>
   </w:num>
   <w:num w:numId="16">
     <w:abstractNumId w:val="1"/>
@@ -18089,19 +18663,19 @@
     <w:abstractNumId w:val="8"/>
   </w:num>
   <w:num w:numId="18">
-    <w:abstractNumId w:val="28"/>
+    <w:abstractNumId w:val="30"/>
   </w:num>
   <w:num w:numId="19">
-    <w:abstractNumId w:val="33"/>
+    <w:abstractNumId w:val="35"/>
   </w:num>
   <w:num w:numId="20">
-    <w:abstractNumId w:val="31"/>
+    <w:abstractNumId w:val="33"/>
   </w:num>
   <w:num w:numId="21">
     <w:abstractNumId w:val="12"/>
   </w:num>
   <w:num w:numId="22">
-    <w:abstractNumId w:val="21"/>
+    <w:abstractNumId w:val="22"/>
   </w:num>
   <w:num w:numId="23">
     <w:abstractNumId w:val="3"/>
@@ -18113,28 +18687,28 @@
     <w:abstractNumId w:val="9"/>
   </w:num>
   <w:num w:numId="26">
-    <w:abstractNumId w:val="36"/>
+    <w:abstractNumId w:val="38"/>
   </w:num>
   <w:num w:numId="27">
-    <w:abstractNumId w:val="32"/>
+    <w:abstractNumId w:val="34"/>
   </w:num>
   <w:num w:numId="28">
-    <w:abstractNumId w:val="23"/>
+    <w:abstractNumId w:val="25"/>
   </w:num>
   <w:num w:numId="29">
-    <w:abstractNumId w:val="20"/>
+    <w:abstractNumId w:val="21"/>
   </w:num>
   <w:num w:numId="30">
-    <w:abstractNumId w:val="24"/>
+    <w:abstractNumId w:val="26"/>
   </w:num>
   <w:num w:numId="31">
-    <w:abstractNumId w:val="15"/>
+    <w:abstractNumId w:val="16"/>
   </w:num>
   <w:num w:numId="32">
     <w:abstractNumId w:val="4"/>
   </w:num>
   <w:num w:numId="33">
-    <w:abstractNumId w:val="39"/>
+    <w:abstractNumId w:val="41"/>
   </w:num>
   <w:num w:numId="34">
     <w:abstractNumId w:val="10"/>
@@ -18143,19 +18717,85 @@
     <w:abstractNumId w:val="2"/>
   </w:num>
   <w:num w:numId="36">
-    <w:abstractNumId w:val="27"/>
+    <w:abstractNumId w:val="29"/>
   </w:num>
   <w:num w:numId="37">
     <w:abstractNumId w:val="14"/>
   </w:num>
   <w:num w:numId="38">
-    <w:abstractNumId w:val="25"/>
+    <w:abstractNumId w:val="27"/>
   </w:num>
   <w:num w:numId="39">
-    <w:abstractNumId w:val="26"/>
+    <w:abstractNumId w:val="28"/>
   </w:num>
   <w:num w:numId="40">
     <w:abstractNumId w:val="6"/>
+  </w:num>
+  <w:num w:numId="41">
+    <w:abstractNumId w:val="31"/>
+    <w:lvlOverride w:ilvl="0">
+      <w:startOverride w:val="1"/>
+    </w:lvlOverride>
+    <w:lvlOverride w:ilvl="1">
+      <w:startOverride w:val="1"/>
+    </w:lvlOverride>
+    <w:lvlOverride w:ilvl="2">
+      <w:startOverride w:val="1"/>
+    </w:lvlOverride>
+    <w:lvlOverride w:ilvl="3">
+      <w:startOverride w:val="1"/>
+    </w:lvlOverride>
+    <w:lvlOverride w:ilvl="4">
+      <w:startOverride w:val="1"/>
+    </w:lvlOverride>
+    <w:lvlOverride w:ilvl="5">
+      <w:startOverride w:val="1"/>
+    </w:lvlOverride>
+    <w:lvlOverride w:ilvl="6">
+      <w:startOverride w:val="1"/>
+    </w:lvlOverride>
+    <w:lvlOverride w:ilvl="7">
+      <w:startOverride w:val="1"/>
+    </w:lvlOverride>
+    <w:lvlOverride w:ilvl="8">
+      <w:startOverride w:val="1"/>
+    </w:lvlOverride>
+  </w:num>
+  <w:num w:numId="42">
+    <w:abstractNumId w:val="24"/>
+  </w:num>
+  <w:num w:numId="43">
+    <w:abstractNumId w:val="15"/>
+  </w:num>
+  <w:num w:numId="44">
+    <w:abstractNumId w:val="31"/>
+    <w:lvlOverride w:ilvl="0">
+      <w:startOverride w:val="1"/>
+    </w:lvlOverride>
+    <w:lvlOverride w:ilvl="1">
+      <w:startOverride w:val="1"/>
+    </w:lvlOverride>
+    <w:lvlOverride w:ilvl="2">
+      <w:startOverride w:val="1"/>
+    </w:lvlOverride>
+    <w:lvlOverride w:ilvl="3">
+      <w:startOverride w:val="1"/>
+    </w:lvlOverride>
+    <w:lvlOverride w:ilvl="4">
+      <w:startOverride w:val="1"/>
+    </w:lvlOverride>
+    <w:lvlOverride w:ilvl="5">
+      <w:startOverride w:val="1"/>
+    </w:lvlOverride>
+    <w:lvlOverride w:ilvl="6">
+      <w:startOverride w:val="1"/>
+    </w:lvlOverride>
+    <w:lvlOverride w:ilvl="7">
+      <w:startOverride w:val="1"/>
+    </w:lvlOverride>
+    <w:lvlOverride w:ilvl="8">
+      <w:startOverride w:val="1"/>
+    </w:lvlOverride>
   </w:num>
   <w:numIdMacAtCleanup w:val="24"/>
 </w:numbering>
@@ -18796,6 +19436,7 @@
   <w:style w:type="character" w:default="1" w:styleId="DefaultParagraphFont">
     <w:name w:val="Default Paragraph Font"/>
     <w:uiPriority w:val="1"/>
+    <w:semiHidden/>
     <w:unhideWhenUsed/>
   </w:style>
   <w:style w:type="table" w:default="1" w:styleId="TableNormal">
@@ -19872,7 +20513,7 @@
 </file>
 
 <file path=customXml/itemProps1.xml><?xml version="1.0" encoding="utf-8"?>
-<ds:datastoreItem xmlns:ds="http://schemas.openxmlformats.org/officeDocument/2006/customXml" ds:itemID="{81CA4BB9-2EC5-45C0-A34F-B404D3D14CA5}">
+<ds:datastoreItem xmlns:ds="http://schemas.openxmlformats.org/officeDocument/2006/customXml" ds:itemID="{645208A0-3594-4BC1-B0F5-986FF0326EAC}">
   <ds:schemaRefs>
     <ds:schemaRef ds:uri="http://schemas.openxmlformats.org/officeDocument/2006/bibliography"/>
   </ds:schemaRefs>

</xml_diff>